<commit_message>
ONE MORE CHAPTER TO GO
</commit_message>
<xml_diff>
--- a/DISSERTATION/FINAL DISSERTATION REPORT.docx
+++ b/DISSERTATION/FINAL DISSERTATION REPORT.docx
@@ -75,21 +75,7 @@
         <w:rPr>
           <w:rFonts w:ascii="Times New Roman" w:hAnsi="Times New Roman" w:cs="Times New Roman"/>
         </w:rPr>
-        <w:t>AI-DRIVEN SYSTEM FOR FASHION ANALYSIS FROM LAGOS FASHION WEEK F/W 2025 (</w:t>
-      </w:r>
-      <w:proofErr w:type="spellStart"/>
-      <w:r>
-        <w:rPr>
-          <w:rFonts w:ascii="Times New Roman" w:hAnsi="Times New Roman" w:cs="Times New Roman"/>
-        </w:rPr>
-        <w:t>HoL</w:t>
-      </w:r>
-      <w:proofErr w:type="spellEnd"/>
-      <w:r>
-        <w:rPr>
-          <w:rFonts w:ascii="Times New Roman" w:hAnsi="Times New Roman" w:cs="Times New Roman"/>
-        </w:rPr>
-        <w:t xml:space="preserve"> – HOUSE OF LASGIDI)</w:t>
+        <w:t>AI-DRIVEN SYSTEM FOR FASHION ANALYSIS FROM LAGOS FASHION WEEK F/W 2025 (HoL – HOUSE OF LASGIDI)</w:t>
       </w:r>
     </w:p>
     <w:p>
@@ -231,6 +217,14 @@
         </w:rPr>
         <w:t>I attest that the content of this dissertation report is my own. I certify that the content of this report has not been submitted anywhere else for any award. I also certify that the application’s implementation and research have not been submitted elsewhere for any award and are solely owned by me, Anita Dijala. I agree that this work be saved electronically for academic purposes. I do not give my consent for the work presented in this report, and any and all accompanying documentation which includes the system implementation, to be made public without ascertaining prior consent and permission from myself.</w:t>
       </w:r>
+    </w:p>
+    <w:p>
+      <w:pPr>
+        <w:jc w:val="center"/>
+        <w:rPr>
+          <w:rFonts w:ascii="Times New Roman" w:hAnsi="Times New Roman" w:cs="Times New Roman"/>
+        </w:rPr>
+      </w:pPr>
     </w:p>
     <w:p>
       <w:pPr>
@@ -924,20 +918,6 @@
           <w:rFonts w:ascii="Times New Roman" w:hAnsi="Times New Roman" w:cs="Times New Roman"/>
         </w:rPr>
       </w:pPr>
-    </w:p>
-    <w:p>
-      <w:pPr>
-        <w:rPr>
-          <w:rFonts w:ascii="Times New Roman" w:hAnsi="Times New Roman" w:cs="Times New Roman"/>
-        </w:rPr>
-      </w:pPr>
-    </w:p>
-    <w:p>
-      <w:pPr>
-        <w:rPr>
-          <w:rFonts w:ascii="Times New Roman" w:hAnsi="Times New Roman" w:cs="Times New Roman"/>
-        </w:rPr>
-      </w:pPr>
       <w:r>
         <w:rPr>
           <w:rFonts w:ascii="Times New Roman" w:hAnsi="Times New Roman" w:cs="Times New Roman"/>
@@ -1035,21 +1015,7 @@
         <w:rPr>
           <w:rFonts w:ascii="Times New Roman" w:hAnsi="Times New Roman" w:cs="Times New Roman"/>
         </w:rPr>
-        <w:t xml:space="preserve">tes and compares two semantic segmentation pipelines, DeepLabV3+ and </w:t>
-      </w:r>
-      <w:proofErr w:type="spellStart"/>
-      <w:r>
-        <w:rPr>
-          <w:rFonts w:ascii="Times New Roman" w:hAnsi="Times New Roman" w:cs="Times New Roman"/>
-        </w:rPr>
-        <w:t>FashnHumanParser</w:t>
-      </w:r>
-      <w:proofErr w:type="spellEnd"/>
-      <w:r>
-        <w:rPr>
-          <w:rFonts w:ascii="Times New Roman" w:hAnsi="Times New Roman" w:cs="Times New Roman"/>
-        </w:rPr>
-        <w:t xml:space="preserve">, followed by K-Means clustering. Fabric sentiment analysis is </w:t>
+        <w:t xml:space="preserve">tes and compares two semantic segmentation pipelines, DeepLabV3+ and FashnHumanParser, followed by K-Means clustering. Fabric sentiment analysis is </w:t>
       </w:r>
       <w:r>
         <w:rPr>
@@ -1068,48 +1034,20 @@
         <w:rPr>
           <w:rFonts w:ascii="Times New Roman" w:hAnsi="Times New Roman" w:cs="Times New Roman"/>
         </w:rPr>
-        <w:t>The system testing compared the colour segmentation pipelines, revealing that [DeepLabV3+/</w:t>
-      </w:r>
-      <w:proofErr w:type="spellStart"/>
-      <w:r>
-        <w:rPr>
-          <w:rFonts w:ascii="Times New Roman" w:hAnsi="Times New Roman" w:cs="Times New Roman"/>
-        </w:rPr>
-        <w:t>FashnHumanParser</w:t>
-      </w:r>
-      <w:proofErr w:type="spellEnd"/>
-      <w:r>
-        <w:rPr>
-          <w:rFonts w:ascii="Times New Roman" w:hAnsi="Times New Roman" w:cs="Times New Roman"/>
-        </w:rPr>
-        <w:t>] achieved a superior accuracy of [INSERT %]. On the other hand, the GLCM-LBP-SVM pipeline successfully classified fabrics with [INSERT %] accuracy.</w:t>
-      </w:r>
-    </w:p>
-    <w:p>
-      <w:pPr>
-        <w:rPr>
-          <w:rFonts w:ascii="Times New Roman" w:hAnsi="Times New Roman" w:cs="Times New Roman"/>
-        </w:rPr>
-      </w:pPr>
-      <w:r>
-        <w:rPr>
-          <w:rFonts w:ascii="Times New Roman" w:hAnsi="Times New Roman" w:cs="Times New Roman"/>
-        </w:rPr>
-        <w:t xml:space="preserve">These results demonstrate that </w:t>
-      </w:r>
-      <w:proofErr w:type="spellStart"/>
-      <w:r>
-        <w:rPr>
-          <w:rFonts w:ascii="Times New Roman" w:hAnsi="Times New Roman" w:cs="Times New Roman"/>
-        </w:rPr>
-        <w:t>HoL</w:t>
-      </w:r>
-      <w:proofErr w:type="spellEnd"/>
-      <w:r>
-        <w:rPr>
-          <w:rFonts w:ascii="Times New Roman" w:hAnsi="Times New Roman" w:cs="Times New Roman"/>
-        </w:rPr>
-        <w:t xml:space="preserve"> provides a scalable, objective tool for designers, buyers, and forecasters to derive actionable, data-driven business insights from runway showcases, effectively bridging the knowledge system gap in African fashion.</w:t>
+        <w:t>The system testing compared the colour segmentation pipelines, revealing that [DeepLabV3+/FashnHumanParser] achieved a superior accuracy of [INSERT %]. On the other hand, the GLCM-LBP-SVM pipeline successfully classified fabrics with [INSERT %] accuracy.</w:t>
+      </w:r>
+    </w:p>
+    <w:p>
+      <w:pPr>
+        <w:rPr>
+          <w:rFonts w:ascii="Times New Roman" w:hAnsi="Times New Roman" w:cs="Times New Roman"/>
+        </w:rPr>
+      </w:pPr>
+      <w:r>
+        <w:rPr>
+          <w:rFonts w:ascii="Times New Roman" w:hAnsi="Times New Roman" w:cs="Times New Roman"/>
+        </w:rPr>
+        <w:t>These results demonstrate that HoL provides a scalable, objective tool for designers, buyers, and forecasters to derive actionable, data-driven business insights from runway showcases, effectively bridging the knowledge system gap in African fashion.</w:t>
       </w:r>
     </w:p>
     <w:p>
@@ -1219,8 +1157,431 @@
         <w:rPr>
           <w:rFonts w:ascii="Times New Roman" w:hAnsi="Times New Roman" w:cs="Times New Roman"/>
         </w:rPr>
-        <w:t>The necessity for such frameworks is supported by recent findings that for the African fashion industry to progress and thrive, individuals, like designers, buyers, and forecasters, in the fashion industry require more dependable data than is currently available (UNESCO, 2023). Existing industry data is largely incomplete, focusing mainly on raw textile production rather than the high-fashion sector or specific consumer design sentiments (UNSECO, 2023). This lack of analytical infrastructure emphasizes on wider challenges in the region, including a drawback in the infrastructure required to scale creative cooperations (UNESCO, 2023). Current fabric data in Africa is heavily fragmented and sparse. This data gap is observed by a critical lack of digital archives, as traditional textile knowledge is frequently preserved through oral traditions rather than machine-readable formats (Boateng et al., 2025).</w:t>
-      </w:r>
+        <w:t>1.1 Context and Motivation</w:t>
+      </w:r>
+    </w:p>
+    <w:p>
+      <w:pPr>
+        <w:rPr>
+          <w:rFonts w:ascii="Times New Roman" w:hAnsi="Times New Roman" w:cs="Times New Roman"/>
+        </w:rPr>
+      </w:pPr>
+      <w:r>
+        <w:rPr>
+          <w:rFonts w:ascii="Times New Roman" w:hAnsi="Times New Roman" w:cs="Times New Roman"/>
+        </w:rPr>
+        <w:t>The necessity for such frameworks is supported by recent findings that for the African fashion industry to progress and thrive, individuals, like designers, buyers, and forecasters, in the fashion industry require more dependable data than is currently available (UNESCO, 2023). Existing industry data is largely incomplete, focusing mainly on raw textile production rather than the high-fashion sector or specific consumer design sentiments (UNSECO, 2023). This lack of analytical infrastructure emphasizes on wider challenges in the region, including a drawback in the infrastructure required to scale creative cooperations (UNESCO, 2023).</w:t>
+      </w:r>
+    </w:p>
+    <w:p>
+      <w:pPr>
+        <w:rPr>
+          <w:rFonts w:ascii="Times New Roman" w:hAnsi="Times New Roman" w:cs="Times New Roman"/>
+        </w:rPr>
+      </w:pPr>
+      <w:r>
+        <w:rPr>
+          <w:rFonts w:ascii="Times New Roman" w:hAnsi="Times New Roman" w:cs="Times New Roman"/>
+        </w:rPr>
+        <w:t>Current fabric data in Africa is heavily fragmented and sparse. This data gap is observed by a critical lack of digital archives, as traditional textile knowledge is frequently preserved through oral traditions rather than machine-readable formats (Boateng et al., 2025).</w:t>
+      </w:r>
+      <w:r>
+        <w:rPr>
+          <w:rFonts w:ascii="Times New Roman" w:hAnsi="Times New Roman" w:cs="Times New Roman"/>
+        </w:rPr>
+        <w:t xml:space="preserve"> As the global fashion industry moves toward the “Fashion 4.0” era, which is defined by big data and artificial intelligence. There is a need to bridge this gap by digitizing and quantifying the visual trends of African runways, specifically within high-growth hubs like Lagos, Nigeria and more.</w:t>
+      </w:r>
+    </w:p>
+    <w:p>
+      <w:pPr>
+        <w:rPr>
+          <w:rFonts w:ascii="Times New Roman" w:hAnsi="Times New Roman" w:cs="Times New Roman"/>
+        </w:rPr>
+      </w:pPr>
+    </w:p>
+    <w:p>
+      <w:pPr>
+        <w:rPr>
+          <w:rFonts w:ascii="Times New Roman" w:hAnsi="Times New Roman" w:cs="Times New Roman"/>
+        </w:rPr>
+      </w:pPr>
+      <w:r>
+        <w:rPr>
+          <w:rFonts w:ascii="Times New Roman" w:hAnsi="Times New Roman" w:cs="Times New Roman"/>
+        </w:rPr>
+        <w:t>1.2 Problem Statement</w:t>
+      </w:r>
+    </w:p>
+    <w:p>
+      <w:pPr>
+        <w:rPr>
+          <w:rFonts w:ascii="Times New Roman" w:hAnsi="Times New Roman" w:cs="Times New Roman"/>
+        </w:rPr>
+      </w:pPr>
+      <w:r>
+        <w:rPr>
+          <w:rFonts w:ascii="Times New Roman" w:hAnsi="Times New Roman" w:cs="Times New Roman"/>
+        </w:rPr>
+        <w:t>Despite the creative success of events like Lagos Fashion Week (LFW), the analysis of these collections remains a manual, qualitative process. Stakeholders lack automated tools to:</w:t>
+      </w:r>
+    </w:p>
+    <w:p>
+      <w:pPr>
+        <w:pStyle w:val="ListParagraph"/>
+        <w:numPr>
+          <w:ilvl w:val="0"/>
+          <w:numId w:val="19"/>
+        </w:numPr>
+        <w:rPr>
+          <w:rFonts w:ascii="Times New Roman" w:hAnsi="Times New Roman" w:cs="Times New Roman"/>
+        </w:rPr>
+      </w:pPr>
+      <w:r>
+        <w:rPr>
+          <w:rFonts w:ascii="Times New Roman" w:hAnsi="Times New Roman" w:cs="Times New Roman"/>
+        </w:rPr>
+        <w:t>Objectively quantify design choices and evaluate designer collections using real-time, data-driven frameworks.</w:t>
+      </w:r>
+    </w:p>
+    <w:p>
+      <w:pPr>
+        <w:pStyle w:val="ListParagraph"/>
+        <w:numPr>
+          <w:ilvl w:val="0"/>
+          <w:numId w:val="19"/>
+        </w:numPr>
+        <w:rPr>
+          <w:rFonts w:ascii="Times New Roman" w:hAnsi="Times New Roman" w:cs="Times New Roman"/>
+        </w:rPr>
+      </w:pPr>
+      <w:r>
+        <w:rPr>
+          <w:rFonts w:ascii="Times New Roman" w:hAnsi="Times New Roman" w:cs="Times New Roman"/>
+        </w:rPr>
+        <w:t>Train algorithms on large-scale datasets specifically focused on traditional textiles, which makes it technically difficult to accurately replicate the unique physical textures of African fabrics in digital spaces.</w:t>
+      </w:r>
+    </w:p>
+    <w:p>
+      <w:pPr>
+        <w:pStyle w:val="ListParagraph"/>
+        <w:numPr>
+          <w:ilvl w:val="0"/>
+          <w:numId w:val="19"/>
+        </w:numPr>
+        <w:rPr>
+          <w:rFonts w:ascii="Times New Roman" w:hAnsi="Times New Roman" w:cs="Times New Roman"/>
+        </w:rPr>
+      </w:pPr>
+      <w:r>
+        <w:rPr>
+          <w:rFonts w:ascii="Times New Roman" w:hAnsi="Times New Roman" w:cs="Times New Roman"/>
+        </w:rPr>
+        <w:t>Analyze high-fashion or design sentiments, as existing statistical data tends to focus almost exclusively on raw textile and apparel productions.</w:t>
+      </w:r>
+    </w:p>
+    <w:p>
+      <w:pPr>
+        <w:pStyle w:val="ListParagraph"/>
+        <w:numPr>
+          <w:ilvl w:val="0"/>
+          <w:numId w:val="19"/>
+        </w:numPr>
+        <w:rPr>
+          <w:rFonts w:ascii="Times New Roman" w:hAnsi="Times New Roman" w:cs="Times New Roman"/>
+        </w:rPr>
+      </w:pPr>
+      <w:r>
+        <w:rPr>
+          <w:rFonts w:ascii="Times New Roman" w:hAnsi="Times New Roman" w:cs="Times New Roman"/>
+        </w:rPr>
+        <w:t>Track broader consumer trends and behaviours across different geographical regions due to the fragmented and sparse nature of current industry data.</w:t>
+      </w:r>
+    </w:p>
+    <w:p>
+      <w:pPr>
+        <w:rPr>
+          <w:rFonts w:ascii="Times New Roman" w:hAnsi="Times New Roman" w:cs="Times New Roman"/>
+        </w:rPr>
+      </w:pPr>
+      <w:r>
+        <w:rPr>
+          <w:rFonts w:ascii="Times New Roman" w:hAnsi="Times New Roman" w:cs="Times New Roman"/>
+        </w:rPr>
+        <w:t>Without a computational solution, the “sentiments” of African design remain unmapped, making it difficult for local designers to compete in a global market that relies on rapid trend-data.</w:t>
+      </w:r>
+    </w:p>
+    <w:p>
+      <w:pPr>
+        <w:rPr>
+          <w:rFonts w:ascii="Times New Roman" w:hAnsi="Times New Roman" w:cs="Times New Roman"/>
+        </w:rPr>
+      </w:pPr>
+    </w:p>
+    <w:p>
+      <w:pPr>
+        <w:rPr>
+          <w:rFonts w:ascii="Times New Roman" w:hAnsi="Times New Roman" w:cs="Times New Roman"/>
+        </w:rPr>
+      </w:pPr>
+      <w:r>
+        <w:rPr>
+          <w:rFonts w:ascii="Times New Roman" w:hAnsi="Times New Roman" w:cs="Times New Roman"/>
+        </w:rPr>
+        <w:t>1.3 Aims and Objectives</w:t>
+      </w:r>
+    </w:p>
+    <w:p>
+      <w:pPr>
+        <w:rPr>
+          <w:rFonts w:ascii="Times New Roman" w:hAnsi="Times New Roman" w:cs="Times New Roman"/>
+        </w:rPr>
+      </w:pPr>
+      <w:r>
+        <w:rPr>
+          <w:rFonts w:ascii="Times New Roman" w:hAnsi="Times New Roman" w:cs="Times New Roman"/>
+        </w:rPr>
+        <w:t>The aim of this project is to develop “House of Lasgidi”, an AI-driven web platform that automates the extraction and visualization of fashion trends from Lagos Fashion Week 2025.</w:t>
+      </w:r>
+    </w:p>
+    <w:p>
+      <w:pPr>
+        <w:rPr>
+          <w:rFonts w:ascii="Times New Roman" w:hAnsi="Times New Roman" w:cs="Times New Roman"/>
+        </w:rPr>
+      </w:pPr>
+      <w:r>
+        <w:rPr>
+          <w:rFonts w:ascii="Times New Roman" w:hAnsi="Times New Roman" w:cs="Times New Roman"/>
+        </w:rPr>
+        <w:t>To achieve this, the following objectives were established:</w:t>
+      </w:r>
+    </w:p>
+    <w:p>
+      <w:pPr>
+        <w:pStyle w:val="ListParagraph"/>
+        <w:numPr>
+          <w:ilvl w:val="0"/>
+          <w:numId w:val="20"/>
+        </w:numPr>
+        <w:rPr>
+          <w:rFonts w:ascii="Times New Roman" w:hAnsi="Times New Roman" w:cs="Times New Roman"/>
+        </w:rPr>
+      </w:pPr>
+      <w:r>
+        <w:rPr>
+          <w:rFonts w:ascii="Times New Roman" w:hAnsi="Times New Roman" w:cs="Times New Roman"/>
+        </w:rPr>
+        <w:lastRenderedPageBreak/>
+        <w:t>Segmentation: To implement a Semantic Segmentation pipeline to isolate garment pixels from runway images.</w:t>
+      </w:r>
+    </w:p>
+    <w:p>
+      <w:pPr>
+        <w:pStyle w:val="ListParagraph"/>
+        <w:numPr>
+          <w:ilvl w:val="0"/>
+          <w:numId w:val="20"/>
+        </w:numPr>
+        <w:rPr>
+          <w:rFonts w:ascii="Times New Roman" w:hAnsi="Times New Roman" w:cs="Times New Roman"/>
+        </w:rPr>
+      </w:pPr>
+      <w:r>
+        <w:rPr>
+          <w:rFonts w:ascii="Times New Roman" w:hAnsi="Times New Roman" w:cs="Times New Roman"/>
+        </w:rPr>
+        <w:t>Classification: To design a texture classifier using Support Vector Machines (SVM) and statistical features (GLCM + LBP) to categorize textiles into commercial profiles.</w:t>
+      </w:r>
+    </w:p>
+    <w:p>
+      <w:pPr>
+        <w:pStyle w:val="ListParagraph"/>
+        <w:numPr>
+          <w:ilvl w:val="0"/>
+          <w:numId w:val="20"/>
+        </w:numPr>
+        <w:rPr>
+          <w:rFonts w:ascii="Times New Roman" w:hAnsi="Times New Roman" w:cs="Times New Roman"/>
+        </w:rPr>
+      </w:pPr>
+      <w:r>
+        <w:rPr>
+          <w:rFonts w:ascii="Times New Roman" w:hAnsi="Times New Roman" w:cs="Times New Roman"/>
+        </w:rPr>
+        <w:t>Quantization: To utilize K-Means Clustering in the CIELAB colour space to extract accurate colour palettes.</w:t>
+      </w:r>
+    </w:p>
+    <w:p>
+      <w:pPr>
+        <w:pStyle w:val="ListParagraph"/>
+        <w:numPr>
+          <w:ilvl w:val="0"/>
+          <w:numId w:val="20"/>
+        </w:numPr>
+        <w:rPr>
+          <w:rFonts w:ascii="Times New Roman" w:hAnsi="Times New Roman" w:cs="Times New Roman"/>
+        </w:rPr>
+      </w:pPr>
+      <w:r>
+        <w:rPr>
+          <w:rFonts w:ascii="Times New Roman" w:hAnsi="Times New Roman" w:cs="Times New Roman"/>
+        </w:rPr>
+        <w:t>Visualization: To build a full-stack dashboard (React + FastAPI) that presents these insights through interactive charts and collection summaries.</w:t>
+      </w:r>
+    </w:p>
+    <w:p>
+      <w:pPr>
+        <w:rPr>
+          <w:rFonts w:ascii="Times New Roman" w:hAnsi="Times New Roman" w:cs="Times New Roman"/>
+        </w:rPr>
+      </w:pPr>
+    </w:p>
+    <w:p>
+      <w:pPr>
+        <w:rPr>
+          <w:rFonts w:ascii="Times New Roman" w:hAnsi="Times New Roman" w:cs="Times New Roman"/>
+        </w:rPr>
+      </w:pPr>
+      <w:r>
+        <w:rPr>
+          <w:rFonts w:ascii="Times New Roman" w:hAnsi="Times New Roman" w:cs="Times New Roman"/>
+        </w:rPr>
+        <w:t>1.4 Report Structure</w:t>
+      </w:r>
+    </w:p>
+    <w:p>
+      <w:pPr>
+        <w:rPr>
+          <w:rFonts w:ascii="Times New Roman" w:hAnsi="Times New Roman" w:cs="Times New Roman"/>
+        </w:rPr>
+      </w:pPr>
+      <w:r>
+        <w:rPr>
+          <w:rFonts w:ascii="Times New Roman" w:hAnsi="Times New Roman" w:cs="Times New Roman"/>
+        </w:rPr>
+        <w:t>The remainder of this dissertation report is organized as follows:</w:t>
+      </w:r>
+    </w:p>
+    <w:p>
+      <w:pPr>
+        <w:pStyle w:val="ListParagraph"/>
+        <w:numPr>
+          <w:ilvl w:val="0"/>
+          <w:numId w:val="21"/>
+        </w:numPr>
+        <w:rPr>
+          <w:rFonts w:ascii="Times New Roman" w:hAnsi="Times New Roman" w:cs="Times New Roman"/>
+        </w:rPr>
+      </w:pPr>
+      <w:r>
+        <w:rPr>
+          <w:rFonts w:ascii="Times New Roman" w:hAnsi="Times New Roman" w:cs="Times New Roman"/>
+        </w:rPr>
+        <w:t>Chapter 2: Background/Literature Review. Reviews the evolution of Computer Vision in fashion and explores the mathematical theories behind texture and colour analysis.</w:t>
+      </w:r>
+    </w:p>
+    <w:p>
+      <w:pPr>
+        <w:pStyle w:val="ListParagraph"/>
+        <w:numPr>
+          <w:ilvl w:val="0"/>
+          <w:numId w:val="21"/>
+        </w:numPr>
+        <w:rPr>
+          <w:rFonts w:ascii="Times New Roman" w:hAnsi="Times New Roman" w:cs="Times New Roman"/>
+        </w:rPr>
+      </w:pPr>
+      <w:r>
+        <w:rPr>
+          <w:rFonts w:ascii="Times New Roman" w:hAnsi="Times New Roman" w:cs="Times New Roman"/>
+        </w:rPr>
+        <w:t>Chapter 3: Design. Details the system architecture, the decoupled nature of the API, and the logic of the machine learning pipeline.</w:t>
+      </w:r>
+    </w:p>
+    <w:p>
+      <w:pPr>
+        <w:pStyle w:val="ListParagraph"/>
+        <w:numPr>
+          <w:ilvl w:val="0"/>
+          <w:numId w:val="21"/>
+        </w:numPr>
+        <w:rPr>
+          <w:rFonts w:ascii="Times New Roman" w:hAnsi="Times New Roman" w:cs="Times New Roman"/>
+        </w:rPr>
+      </w:pPr>
+      <w:r>
+        <w:rPr>
+          <w:rFonts w:ascii="Times New Roman" w:hAnsi="Times New Roman" w:cs="Times New Roman"/>
+        </w:rPr>
+        <w:t>Chapter 4: Implementation. Describes the technical development process, including data scraping, model training, and frontend construction.</w:t>
+      </w:r>
+    </w:p>
+    <w:p>
+      <w:pPr>
+        <w:pStyle w:val="ListParagraph"/>
+        <w:numPr>
+          <w:ilvl w:val="0"/>
+          <w:numId w:val="21"/>
+        </w:numPr>
+        <w:rPr>
+          <w:rFonts w:ascii="Times New Roman" w:hAnsi="Times New Roman" w:cs="Times New Roman"/>
+        </w:rPr>
+      </w:pPr>
+      <w:r>
+        <w:rPr>
+          <w:rFonts w:ascii="Times New Roman" w:hAnsi="Times New Roman" w:cs="Times New Roman"/>
+        </w:rPr>
+        <w:t>Chapter 5: System Walkthrough. Demonstrates the final “House of Lasgidi” platform and its core functionalities.</w:t>
+      </w:r>
+    </w:p>
+    <w:p>
+      <w:pPr>
+        <w:pStyle w:val="ListParagraph"/>
+        <w:numPr>
+          <w:ilvl w:val="0"/>
+          <w:numId w:val="21"/>
+        </w:numPr>
+        <w:rPr>
+          <w:rFonts w:ascii="Times New Roman" w:hAnsi="Times New Roman" w:cs="Times New Roman"/>
+        </w:rPr>
+      </w:pPr>
+      <w:r>
+        <w:rPr>
+          <w:rFonts w:ascii="Times New Roman" w:hAnsi="Times New Roman" w:cs="Times New Roman"/>
+        </w:rPr>
+        <w:t>Chapter 6: Testing and Evaluation. Presents a critical analysis of the system’s performance, including classifier accuracy</w:t>
+      </w:r>
+      <w:r>
+        <w:rPr>
+          <w:rFonts w:ascii="Times New Roman" w:hAnsi="Times New Roman" w:cs="Times New Roman"/>
+        </w:rPr>
+        <w:t>.</w:t>
+      </w:r>
+    </w:p>
+    <w:p>
+      <w:pPr>
+        <w:pStyle w:val="ListParagraph"/>
+        <w:numPr>
+          <w:ilvl w:val="0"/>
+          <w:numId w:val="21"/>
+        </w:numPr>
+        <w:rPr>
+          <w:rFonts w:ascii="Times New Roman" w:hAnsi="Times New Roman" w:cs="Times New Roman"/>
+        </w:rPr>
+      </w:pPr>
+      <w:r>
+        <w:rPr>
+          <w:rFonts w:ascii="Times New Roman" w:hAnsi="Times New Roman" w:cs="Times New Roman"/>
+        </w:rPr>
+        <w:t>Chapter 7: Conclusion. Summarizes the project’s achievements and reflects on future work for African fashion informatics.</w:t>
+      </w:r>
+    </w:p>
+    <w:p>
+      <w:pPr>
+        <w:rPr>
+          <w:rFonts w:ascii="Times New Roman" w:hAnsi="Times New Roman" w:cs="Times New Roman"/>
+        </w:rPr>
+      </w:pPr>
     </w:p>
     <w:p>
       <w:pPr>
@@ -1241,104 +1602,64 @@
           <w:rFonts w:ascii="Times New Roman" w:hAnsi="Times New Roman" w:cs="Times New Roman"/>
         </w:rPr>
       </w:pPr>
-    </w:p>
-    <w:p>
-      <w:pPr>
-        <w:rPr>
-          <w:rFonts w:ascii="Times New Roman" w:hAnsi="Times New Roman" w:cs="Times New Roman"/>
-        </w:rPr>
-      </w:pPr>
-    </w:p>
-    <w:p>
-      <w:pPr>
-        <w:rPr>
-          <w:rFonts w:ascii="Times New Roman" w:hAnsi="Times New Roman" w:cs="Times New Roman"/>
-        </w:rPr>
-      </w:pPr>
-    </w:p>
-    <w:p>
-      <w:pPr>
-        <w:rPr>
-          <w:rFonts w:ascii="Times New Roman" w:hAnsi="Times New Roman" w:cs="Times New Roman"/>
-        </w:rPr>
-      </w:pPr>
-    </w:p>
-    <w:p>
-      <w:pPr>
-        <w:rPr>
-          <w:rFonts w:ascii="Times New Roman" w:hAnsi="Times New Roman" w:cs="Times New Roman"/>
-        </w:rPr>
-      </w:pPr>
-    </w:p>
-    <w:p>
-      <w:pPr>
-        <w:rPr>
-          <w:rFonts w:ascii="Times New Roman" w:hAnsi="Times New Roman" w:cs="Times New Roman"/>
-        </w:rPr>
-      </w:pPr>
-    </w:p>
-    <w:p>
-      <w:pPr>
-        <w:rPr>
-          <w:rFonts w:ascii="Times New Roman" w:hAnsi="Times New Roman" w:cs="Times New Roman"/>
-        </w:rPr>
-      </w:pPr>
-    </w:p>
-    <w:p>
-      <w:pPr>
-        <w:rPr>
-          <w:rFonts w:ascii="Times New Roman" w:hAnsi="Times New Roman" w:cs="Times New Roman"/>
-        </w:rPr>
-      </w:pPr>
-    </w:p>
-    <w:p>
-      <w:pPr>
-        <w:rPr>
-          <w:rFonts w:ascii="Times New Roman" w:hAnsi="Times New Roman" w:cs="Times New Roman"/>
-        </w:rPr>
-      </w:pPr>
-    </w:p>
-    <w:p>
-      <w:pPr>
-        <w:rPr>
-          <w:rFonts w:ascii="Times New Roman" w:hAnsi="Times New Roman" w:cs="Times New Roman"/>
-        </w:rPr>
-      </w:pPr>
-    </w:p>
-    <w:p>
-      <w:pPr>
-        <w:rPr>
-          <w:rFonts w:ascii="Times New Roman" w:hAnsi="Times New Roman" w:cs="Times New Roman"/>
-        </w:rPr>
-      </w:pPr>
-    </w:p>
-    <w:p>
-      <w:pPr>
-        <w:rPr>
-          <w:rFonts w:ascii="Times New Roman" w:hAnsi="Times New Roman" w:cs="Times New Roman"/>
-        </w:rPr>
-      </w:pPr>
-    </w:p>
-    <w:p>
-      <w:pPr>
-        <w:rPr>
-          <w:rFonts w:ascii="Times New Roman" w:hAnsi="Times New Roman" w:cs="Times New Roman"/>
-        </w:rPr>
-      </w:pPr>
-    </w:p>
-    <w:p>
-      <w:pPr>
-        <w:rPr>
-          <w:rFonts w:ascii="Times New Roman" w:hAnsi="Times New Roman" w:cs="Times New Roman"/>
-        </w:rPr>
-      </w:pPr>
-    </w:p>
-    <w:p>
-      <w:pPr>
-        <w:rPr>
-          <w:rFonts w:ascii="Times New Roman" w:hAnsi="Times New Roman" w:cs="Times New Roman"/>
-        </w:rPr>
-      </w:pPr>
+      <w:r>
+        <w:rPr>
+          <w:rFonts w:ascii="Times New Roman" w:hAnsi="Times New Roman" w:cs="Times New Roman"/>
+        </w:rPr>
+        <w:t>2.1 Introduction</w:t>
+      </w:r>
+    </w:p>
+    <w:p>
+      <w:pPr>
+        <w:rPr>
+          <w:rFonts w:ascii="Times New Roman" w:hAnsi="Times New Roman" w:cs="Times New Roman"/>
+        </w:rPr>
+      </w:pPr>
+      <w:r>
+        <w:rPr>
+          <w:rFonts w:ascii="Times New Roman" w:hAnsi="Times New Roman" w:cs="Times New Roman"/>
+        </w:rPr>
+        <w:t>2.2 Semantic Segmentation in Fashion</w:t>
+      </w:r>
+    </w:p>
+    <w:p>
+      <w:pPr>
+        <w:rPr>
+          <w:rFonts w:ascii="Times New Roman" w:hAnsi="Times New Roman" w:cs="Times New Roman"/>
+        </w:rPr>
+      </w:pPr>
+      <w:r>
+        <w:rPr>
+          <w:rFonts w:ascii="Times New Roman" w:hAnsi="Times New Roman" w:cs="Times New Roman"/>
+        </w:rPr>
+        <w:t>2.3 Texture Analysis: Deep Learning vs. Handcrafted Features</w:t>
+      </w:r>
+    </w:p>
+    <w:p>
+      <w:pPr>
+        <w:rPr>
+          <w:rFonts w:ascii="Times New Roman" w:hAnsi="Times New Roman" w:cs="Times New Roman"/>
+        </w:rPr>
+      </w:pPr>
+      <w:r>
+        <w:rPr>
+          <w:rFonts w:ascii="Times New Roman" w:hAnsi="Times New Roman" w:cs="Times New Roman"/>
+        </w:rPr>
+        <w:t>2.4 Colour Quantization and Perception</w:t>
+      </w:r>
+    </w:p>
+    <w:p>
+      <w:pPr>
+        <w:rPr>
+          <w:rFonts w:ascii="Times New Roman" w:hAnsi="Times New Roman" w:cs="Times New Roman"/>
+        </w:rPr>
+      </w:pPr>
+      <w:r>
+        <w:rPr>
+          <w:rFonts w:ascii="Times New Roman" w:hAnsi="Times New Roman" w:cs="Times New Roman"/>
+        </w:rPr>
+        <w:t>2.5 Existing Systems and the Cross-Domain Gap</w:t>
+      </w:r>
     </w:p>
     <w:p>
       <w:pPr>
@@ -1388,14 +1709,12 @@
         <w:lastRenderedPageBreak/>
         <w:t xml:space="preserve">3 </w:t>
       </w:r>
-      <w:proofErr w:type="gramStart"/>
       <w:r>
         <w:rPr>
           <w:rFonts w:ascii="Times New Roman" w:hAnsi="Times New Roman" w:cs="Times New Roman"/>
         </w:rPr>
         <w:t>DESIGN</w:t>
       </w:r>
-      <w:proofErr w:type="gramEnd"/>
     </w:p>
     <w:p>
       <w:pPr>
@@ -1426,21 +1745,7 @@
         <w:rPr>
           <w:rFonts w:ascii="Times New Roman" w:hAnsi="Times New Roman" w:cs="Times New Roman"/>
         </w:rPr>
-        <w:t>This chapter discusses the design of major components and details of the methods used for the House of Lasgidi (</w:t>
-      </w:r>
-      <w:proofErr w:type="spellStart"/>
-      <w:r>
-        <w:rPr>
-          <w:rFonts w:ascii="Times New Roman" w:hAnsi="Times New Roman" w:cs="Times New Roman"/>
-        </w:rPr>
-        <w:t>HoL</w:t>
-      </w:r>
-      <w:proofErr w:type="spellEnd"/>
-      <w:r>
-        <w:rPr>
-          <w:rFonts w:ascii="Times New Roman" w:hAnsi="Times New Roman" w:cs="Times New Roman"/>
-        </w:rPr>
-        <w:t xml:space="preserve">) framework. Emphasizing on the limitations identified </w:t>
+        <w:t xml:space="preserve">This chapter discusses the design of major components and details of the methods used for the House of Lasgidi (HoL) framework. Emphasizing on the limitations identified </w:t>
       </w:r>
       <w:r>
         <w:rPr>
@@ -1503,21 +1808,7 @@
         <w:rPr>
           <w:rFonts w:ascii="Times New Roman" w:hAnsi="Times New Roman" w:cs="Times New Roman"/>
         </w:rPr>
-        <w:t xml:space="preserve">The design of all systems follows a basic structure of two major requirements, namely, functional and non-functional requirements. Therefore, the system specification is broken down into two parts. The functional requirements of this system focus on immediate concerns as opposed to the non-functional requirements; therefore, this section of the report will give a detailed description and illustration of the functional and non-functional requirements for </w:t>
-      </w:r>
-      <w:proofErr w:type="spellStart"/>
-      <w:r>
-        <w:rPr>
-          <w:rFonts w:ascii="Times New Roman" w:hAnsi="Times New Roman" w:cs="Times New Roman"/>
-        </w:rPr>
-        <w:t>HoL</w:t>
-      </w:r>
-      <w:proofErr w:type="spellEnd"/>
-      <w:r>
-        <w:rPr>
-          <w:rFonts w:ascii="Times New Roman" w:hAnsi="Times New Roman" w:cs="Times New Roman"/>
-        </w:rPr>
-        <w:t>.</w:t>
+        <w:t>The design of all systems follows a basic structure of two major requirements, namely, functional and non-functional requirements. Therefore, the system specification is broken down into two parts. The functional requirements of this system focus on immediate concerns as opposed to the non-functional requirements; therefore, this section of the report will give a detailed description and illustration of the functional and non-functional requirements for HoL.</w:t>
       </w:r>
     </w:p>
     <w:p>
@@ -1664,21 +1955,7 @@
         <w:rPr>
           <w:rFonts w:ascii="Times New Roman" w:hAnsi="Times New Roman" w:cs="Times New Roman"/>
         </w:rPr>
-        <w:t xml:space="preserve">(Garment Segmentation): The system shall implement segmentation using DeepLabV3+ and </w:t>
-      </w:r>
-      <w:proofErr w:type="spellStart"/>
-      <w:r>
-        <w:rPr>
-          <w:rFonts w:ascii="Times New Roman" w:hAnsi="Times New Roman" w:cs="Times New Roman"/>
-        </w:rPr>
-        <w:t>FashnHumanParser</w:t>
-      </w:r>
-      <w:proofErr w:type="spellEnd"/>
-      <w:r>
-        <w:rPr>
-          <w:rFonts w:ascii="Times New Roman" w:hAnsi="Times New Roman" w:cs="Times New Roman"/>
-        </w:rPr>
-        <w:t xml:space="preserve"> to segment fashion garments from runway backgrounds.</w:t>
+        <w:t>(Garment Segmentation): The system shall implement segmentation using DeepLabV3+ and FashnHumanParser to segment fashion garments from runway backgrounds.</w:t>
       </w:r>
     </w:p>
     <w:p>
@@ -2395,25 +2672,7 @@
           <w:sz w:val="24"/>
           <w:szCs w:val="24"/>
         </w:rPr>
-        <w:t>: House of Lasgidi (</w:t>
-      </w:r>
-      <w:proofErr w:type="spellStart"/>
-      <w:r>
-        <w:rPr>
-          <w:rFonts w:ascii="Times New Roman" w:hAnsi="Times New Roman" w:cs="Times New Roman"/>
-          <w:sz w:val="24"/>
-          <w:szCs w:val="24"/>
-        </w:rPr>
-        <w:t>HoL</w:t>
-      </w:r>
-      <w:proofErr w:type="spellEnd"/>
-      <w:r>
-        <w:rPr>
-          <w:rFonts w:ascii="Times New Roman" w:hAnsi="Times New Roman" w:cs="Times New Roman"/>
-          <w:sz w:val="24"/>
-          <w:szCs w:val="24"/>
-        </w:rPr>
-        <w:t>) Use Case Diagram</w:t>
+        <w:t>: House of Lasgidi (HoL) Use Case Diagram</w:t>
       </w:r>
     </w:p>
     <w:p>
@@ -2650,21 +2909,7 @@
               <w:rPr>
                 <w:rFonts w:ascii="Times New Roman" w:hAnsi="Times New Roman" w:cs="Times New Roman"/>
               </w:rPr>
-              <w:t xml:space="preserve">Allows a new individual to register and set up a profile within the </w:t>
-            </w:r>
-            <w:proofErr w:type="spellStart"/>
-            <w:r>
-              <w:rPr>
-                <w:rFonts w:ascii="Times New Roman" w:hAnsi="Times New Roman" w:cs="Times New Roman"/>
-              </w:rPr>
-              <w:t>HoL</w:t>
-            </w:r>
-            <w:proofErr w:type="spellEnd"/>
-            <w:r>
-              <w:rPr>
-                <w:rFonts w:ascii="Times New Roman" w:hAnsi="Times New Roman" w:cs="Times New Roman"/>
-              </w:rPr>
-              <w:t xml:space="preserve"> system.</w:t>
+              <w:t>Allows a new individual to register and set up a profile within the HoL system.</w:t>
             </w:r>
           </w:p>
         </w:tc>
@@ -2810,21 +3055,7 @@
               <w:rPr>
                 <w:rFonts w:ascii="Times New Roman" w:hAnsi="Times New Roman" w:cs="Times New Roman"/>
               </w:rPr>
-              <w:t xml:space="preserve">The actor inputs registered details and the system authenticates, initiates a secure session, and redirects the actor to the main </w:t>
-            </w:r>
-            <w:proofErr w:type="spellStart"/>
-            <w:r>
-              <w:rPr>
-                <w:rFonts w:ascii="Times New Roman" w:hAnsi="Times New Roman" w:cs="Times New Roman"/>
-              </w:rPr>
-              <w:t>HoL</w:t>
-            </w:r>
-            <w:proofErr w:type="spellEnd"/>
-            <w:r>
-              <w:rPr>
-                <w:rFonts w:ascii="Times New Roman" w:hAnsi="Times New Roman" w:cs="Times New Roman"/>
-              </w:rPr>
-              <w:t xml:space="preserve"> dashboard.</w:t>
+              <w:t>The actor inputs registered details and the system authenticates, initiates a secure session, and redirects the actor to the main HoL dashboard.</w:t>
             </w:r>
           </w:p>
         </w:tc>
@@ -4317,21 +4548,7 @@
         <w:rPr>
           <w:rFonts w:ascii="Times New Roman" w:hAnsi="Times New Roman" w:cs="Times New Roman"/>
         </w:rPr>
-        <w:t>of House of Lasgidi (</w:t>
-      </w:r>
-      <w:proofErr w:type="spellStart"/>
-      <w:r>
-        <w:rPr>
-          <w:rFonts w:ascii="Times New Roman" w:hAnsi="Times New Roman" w:cs="Times New Roman"/>
-        </w:rPr>
-        <w:t>HoL</w:t>
-      </w:r>
-      <w:proofErr w:type="spellEnd"/>
-      <w:r>
-        <w:rPr>
-          <w:rFonts w:ascii="Times New Roman" w:hAnsi="Times New Roman" w:cs="Times New Roman"/>
-        </w:rPr>
-        <w:t xml:space="preserve">) follows a structured pipeline-oriented design. This system is divided into five distinct layers: the Data Acquisition Layer, the Data Pre-Processing Layer, the Feature Extraction Layer (colour analysis engine &amp; fabric analysis engine), the Machine Learning &amp; Classification Layer, and the Full-Stack Delivery Layer. </w:t>
+        <w:t xml:space="preserve">of House of Lasgidi (HoL) follows a structured pipeline-oriented design. This system is divided into five distinct layers: the Data Acquisition Layer, the Data Pre-Processing Layer, the Feature Extraction Layer (colour analysis engine &amp; fabric analysis engine), the Machine Learning &amp; Classification Layer, and the Full-Stack Delivery Layer. </w:t>
       </w:r>
       <w:r>
         <w:rPr>
@@ -4437,15 +4654,7 @@
         <w:fldChar w:fldCharType="end"/>
       </w:r>
       <w:r>
-        <w:t>: House of Lasgidi (</w:t>
-      </w:r>
-      <w:proofErr w:type="spellStart"/>
-      <w:r>
-        <w:t>HoL</w:t>
-      </w:r>
-      <w:proofErr w:type="spellEnd"/>
-      <w:r>
-        <w:t>) Overall Architecture Diagram</w:t>
+        <w:t>: House of Lasgidi (HoL) Overall Architecture Diagram</w:t>
       </w:r>
     </w:p>
     <w:p>
@@ -4610,21 +4819,7 @@
         <w:rPr>
           <w:rFonts w:ascii="Times New Roman" w:hAnsi="Times New Roman" w:cs="Times New Roman"/>
         </w:rPr>
-        <w:t>, the use of Selenium to scrape and download the runway images from fashion blogs (</w:t>
-      </w:r>
-      <w:proofErr w:type="spellStart"/>
-      <w:r>
-        <w:rPr>
-          <w:rFonts w:ascii="Times New Roman" w:hAnsi="Times New Roman" w:cs="Times New Roman"/>
-        </w:rPr>
-        <w:t>BellaNiaja</w:t>
-      </w:r>
-      <w:proofErr w:type="spellEnd"/>
-      <w:r>
-        <w:rPr>
-          <w:rFonts w:ascii="Times New Roman" w:hAnsi="Times New Roman" w:cs="Times New Roman"/>
-        </w:rPr>
-        <w:t xml:space="preserve"> &amp; Lagos Fashion Week). </w:t>
+        <w:t xml:space="preserve">, the use of Selenium to scrape and download the runway images from fashion blogs (BellaNiaja &amp; Lagos Fashion Week). </w:t>
       </w:r>
       <w:r>
         <w:rPr>
@@ -4680,19 +4875,11 @@
         </w:rPr>
         <w:t xml:space="preserve"> Traditional scrapers that only use low-level HTTP requests may fail because they cannot access dynamic material created by client-side scripts. If a scraper cannot execute these scripts, it only sees the skeleton of the page rather than the actual data (</w:t>
       </w:r>
-      <w:proofErr w:type="spellStart"/>
-      <w:r>
-        <w:rPr>
-          <w:rFonts w:ascii="Times New Roman" w:hAnsi="Times New Roman" w:cs="Times New Roman"/>
-        </w:rPr>
-        <w:t>Khder</w:t>
-      </w:r>
-      <w:proofErr w:type="spellEnd"/>
-      <w:r>
-        <w:rPr>
-          <w:rFonts w:ascii="Times New Roman" w:hAnsi="Times New Roman" w:cs="Times New Roman"/>
-        </w:rPr>
-        <w:t xml:space="preserve"> 148-149)</w:t>
+      <w:r>
+        <w:rPr>
+          <w:rFonts w:ascii="Times New Roman" w:hAnsi="Times New Roman" w:cs="Times New Roman"/>
+        </w:rPr>
+        <w:t>Khder 148-149)</w:t>
       </w:r>
       <w:r>
         <w:rPr>
@@ -4782,21 +4969,7 @@
         <w:rPr>
           <w:rFonts w:ascii="Times New Roman" w:hAnsi="Times New Roman" w:cs="Times New Roman"/>
         </w:rPr>
-        <w:t xml:space="preserve"> prevent errors in imaging (Inoue and Yagi, 2020). Finally, the images were converted into normalized floating-point tensors, following the mean and standard deviation of the ImageNet dataset, so the images could be used for the DeepLabV3+ and </w:t>
-      </w:r>
-      <w:proofErr w:type="spellStart"/>
-      <w:r>
-        <w:rPr>
-          <w:rFonts w:ascii="Times New Roman" w:hAnsi="Times New Roman" w:cs="Times New Roman"/>
-        </w:rPr>
-        <w:t>FashnHumanParser</w:t>
-      </w:r>
-      <w:proofErr w:type="spellEnd"/>
-      <w:r>
-        <w:rPr>
-          <w:rFonts w:ascii="Times New Roman" w:hAnsi="Times New Roman" w:cs="Times New Roman"/>
-        </w:rPr>
-        <w:t xml:space="preserve"> models.</w:t>
+        <w:t xml:space="preserve"> prevent errors in imaging (Inoue and Yagi, 2020). Finally, the images were converted into normalized floating-point tensors, following the mean and standard deviation of the ImageNet dataset, so the images could be used for the DeepLabV3+ and FashnHumanParser models.</w:t>
       </w:r>
     </w:p>
     <w:p>
@@ -4976,21 +5149,7 @@
         <w:rPr>
           <w:rFonts w:ascii="Times New Roman" w:hAnsi="Times New Roman" w:cs="Times New Roman"/>
         </w:rPr>
-        <w:t xml:space="preserve">, as it is an important prerequisite for an accurate analysis. If the background or the model’s skin is not filtered out, colour clustering algorithms will process heavily skewed data. This segmentation module extracts precise garment masks using two distinct convolutional neural network (CNN) pipelines to determine the optimal approach for runway imagery: the DeepLabV3+ pipeline and the </w:t>
-      </w:r>
-      <w:proofErr w:type="spellStart"/>
-      <w:r>
-        <w:rPr>
-          <w:rFonts w:ascii="Times New Roman" w:hAnsi="Times New Roman" w:cs="Times New Roman"/>
-        </w:rPr>
-        <w:t>FashnHumanParser</w:t>
-      </w:r>
-      <w:proofErr w:type="spellEnd"/>
-      <w:r>
-        <w:rPr>
-          <w:rFonts w:ascii="Times New Roman" w:hAnsi="Times New Roman" w:cs="Times New Roman"/>
-        </w:rPr>
-        <w:t xml:space="preserve"> pipeline. </w:t>
+        <w:t xml:space="preserve">, as it is an important prerequisite for an accurate analysis. If the background or the model’s skin is not filtered out, colour clustering algorithms will process heavily skewed data. This segmentation module extracts precise garment masks using two distinct convolutional neural network (CNN) pipelines to determine the optimal approach for runway imagery: the DeepLabV3+ pipeline and the FashnHumanParser pipeline. </w:t>
       </w:r>
     </w:p>
     <w:p>
@@ -5157,60 +5316,30 @@
           <w:rFonts w:ascii="Times New Roman" w:hAnsi="Times New Roman" w:cs="Times New Roman"/>
         </w:rPr>
       </w:pPr>
-      <w:proofErr w:type="spellStart"/>
-      <w:r>
-        <w:rPr>
-          <w:rFonts w:ascii="Times New Roman" w:hAnsi="Times New Roman" w:cs="Times New Roman"/>
-        </w:rPr>
-        <w:t>FashnHumanParser</w:t>
-      </w:r>
-      <w:proofErr w:type="spellEnd"/>
-      <w:r>
-        <w:rPr>
-          <w:rFonts w:ascii="Times New Roman" w:hAnsi="Times New Roman" w:cs="Times New Roman"/>
-        </w:rPr>
-        <w:t xml:space="preserve"> Pipeline</w:t>
-      </w:r>
-    </w:p>
-    <w:p>
-      <w:pPr>
-        <w:rPr>
-          <w:rFonts w:ascii="Times New Roman" w:hAnsi="Times New Roman" w:cs="Times New Roman"/>
-        </w:rPr>
-      </w:pPr>
-      <w:r>
-        <w:rPr>
-          <w:rFonts w:ascii="Times New Roman" w:hAnsi="Times New Roman" w:cs="Times New Roman"/>
-        </w:rPr>
-        <w:t xml:space="preserve">A second pipeline was integrated using the </w:t>
-      </w:r>
-      <w:proofErr w:type="spellStart"/>
-      <w:r>
-        <w:rPr>
-          <w:rFonts w:ascii="Times New Roman" w:hAnsi="Times New Roman" w:cs="Times New Roman"/>
-        </w:rPr>
-        <w:t>FashnHumanParser</w:t>
-      </w:r>
-      <w:proofErr w:type="spellEnd"/>
-      <w:r>
-        <w:rPr>
-          <w:rFonts w:ascii="Times New Roman" w:hAnsi="Times New Roman" w:cs="Times New Roman"/>
-        </w:rPr>
-        <w:t xml:space="preserve">, which leverages a specialized </w:t>
-      </w:r>
-      <w:proofErr w:type="spellStart"/>
-      <w:r>
-        <w:rPr>
-          <w:rFonts w:ascii="Times New Roman" w:hAnsi="Times New Roman" w:cs="Times New Roman"/>
-        </w:rPr>
-        <w:t>Contexualized</w:t>
-      </w:r>
-      <w:proofErr w:type="spellEnd"/>
-      <w:r>
-        <w:rPr>
-          <w:rFonts w:ascii="Times New Roman" w:hAnsi="Times New Roman" w:cs="Times New Roman"/>
-        </w:rPr>
-        <w:t xml:space="preserve"> Convolutional Neural Network (Co-CNN) designed to decompose human images into distinct semantic clothing and body regions (Liang et al.</w:t>
+      <w:r>
+        <w:rPr>
+          <w:rFonts w:ascii="Times New Roman" w:hAnsi="Times New Roman" w:cs="Times New Roman"/>
+        </w:rPr>
+        <w:t>FashnHumanParser Pipeline</w:t>
+      </w:r>
+    </w:p>
+    <w:p>
+      <w:pPr>
+        <w:rPr>
+          <w:rFonts w:ascii="Times New Roman" w:hAnsi="Times New Roman" w:cs="Times New Roman"/>
+        </w:rPr>
+      </w:pPr>
+      <w:r>
+        <w:rPr>
+          <w:rFonts w:ascii="Times New Roman" w:hAnsi="Times New Roman" w:cs="Times New Roman"/>
+        </w:rPr>
+        <w:t>A second pipeline was integrated using the FashnHumanParser</w:t>
+      </w:r>
+      <w:r>
+        <w:rPr>
+          <w:rFonts w:ascii="Times New Roman" w:hAnsi="Times New Roman" w:cs="Times New Roman"/>
+        </w:rPr>
+        <w:t>, which leverages a specialized Contexualized Convolutional Neural Network (Co-CNN) designed to decompose human images into distinct semantic clothing and body regions (Liang et al.</w:t>
       </w:r>
       <w:r>
         <w:rPr>
@@ -5352,49 +5481,7 @@
         <w:rPr>
           <w:rFonts w:ascii="Times New Roman" w:hAnsi="Times New Roman" w:cs="Times New Roman"/>
         </w:rPr>
-        <w:t xml:space="preserve">Following system evaluation, the </w:t>
-      </w:r>
-      <w:proofErr w:type="spellStart"/>
-      <w:r>
-        <w:rPr>
-          <w:rFonts w:ascii="Times New Roman" w:hAnsi="Times New Roman" w:cs="Times New Roman"/>
-        </w:rPr>
-        <w:t>FashnHumanParser</w:t>
-      </w:r>
-      <w:proofErr w:type="spellEnd"/>
-      <w:r>
-        <w:rPr>
-          <w:rFonts w:ascii="Times New Roman" w:hAnsi="Times New Roman" w:cs="Times New Roman"/>
-        </w:rPr>
-        <w:t xml:space="preserve"> achieved superior segmentation accuracy compared to the generalized DeepLabV3+ model. Consequently, the </w:t>
-      </w:r>
-      <w:proofErr w:type="spellStart"/>
-      <w:r>
-        <w:rPr>
-          <w:rFonts w:ascii="Times New Roman" w:hAnsi="Times New Roman" w:cs="Times New Roman"/>
-        </w:rPr>
-        <w:t>FashnHumanParser</w:t>
-      </w:r>
-      <w:proofErr w:type="spellEnd"/>
-      <w:r>
-        <w:rPr>
-          <w:rFonts w:ascii="Times New Roman" w:hAnsi="Times New Roman" w:cs="Times New Roman"/>
-        </w:rPr>
-        <w:t xml:space="preserve"> pipeline was selected as the primary model for the colour analysis engine for the </w:t>
-      </w:r>
-      <w:proofErr w:type="spellStart"/>
-      <w:r>
-        <w:rPr>
-          <w:rFonts w:ascii="Times New Roman" w:hAnsi="Times New Roman" w:cs="Times New Roman"/>
-        </w:rPr>
-        <w:t>HoL</w:t>
-      </w:r>
-      <w:proofErr w:type="spellEnd"/>
-      <w:r>
-        <w:rPr>
-          <w:rFonts w:ascii="Times New Roman" w:hAnsi="Times New Roman" w:cs="Times New Roman"/>
-        </w:rPr>
-        <w:t xml:space="preserve"> system.</w:t>
+        <w:t>Following system evaluation, the FashnHumanParser achieved superior segmentation accuracy compared to the generalized DeepLabV3+ model. Consequently, the FashnHumanParser pipeline was selected as the primary model for the colour analysis engine for the HoL system.</w:t>
       </w:r>
     </w:p>
     <w:p>
@@ -5495,21 +5582,7 @@
         <w:rPr>
           <w:rFonts w:ascii="Times New Roman" w:hAnsi="Times New Roman" w:cs="Times New Roman"/>
         </w:rPr>
-        <w:t xml:space="preserve">This system employs the Gray-Level Co-occurrence Matrix (GLCM) to </w:t>
-      </w:r>
-      <w:proofErr w:type="spellStart"/>
-      <w:r>
-        <w:rPr>
-          <w:rFonts w:ascii="Times New Roman" w:hAnsi="Times New Roman" w:cs="Times New Roman"/>
-        </w:rPr>
-        <w:t>analyze</w:t>
-      </w:r>
-      <w:proofErr w:type="spellEnd"/>
-      <w:r>
-        <w:rPr>
-          <w:rFonts w:ascii="Times New Roman" w:hAnsi="Times New Roman" w:cs="Times New Roman"/>
-        </w:rPr>
-        <w:t xml:space="preserve"> the macro-texture and spatial relationships of pixels within the image. The raw RGB image is first converted to an 8-bit grayscale matrix to focus exclusively on textural intensity.</w:t>
+        <w:t>This system employs the Gray-Level Co-occurrence Matrix (GLCM) to analyze the macro-texture and spatial relationships of pixels within the image. The raw RGB image is first converted to an 8-bit grayscale matrix to focus exclusively on textural intensity.</w:t>
       </w:r>
       <w:r>
         <w:rPr>
@@ -5521,41 +5594,13 @@
         <w:rPr>
           <w:rFonts w:ascii="Times New Roman" w:hAnsi="Times New Roman" w:cs="Times New Roman"/>
         </w:rPr>
-        <w:t xml:space="preserve"> The GLCM evaluates texture by tabulating the frequency at which pairs of specific </w:t>
-      </w:r>
-      <w:proofErr w:type="spellStart"/>
-      <w:r>
-        <w:rPr>
-          <w:rFonts w:ascii="Times New Roman" w:hAnsi="Times New Roman" w:cs="Times New Roman"/>
-        </w:rPr>
-        <w:t>gray</w:t>
-      </w:r>
-      <w:proofErr w:type="spellEnd"/>
-      <w:r>
-        <w:rPr>
-          <w:rFonts w:ascii="Times New Roman" w:hAnsi="Times New Roman" w:cs="Times New Roman"/>
-        </w:rPr>
-        <w:t>-level values</w:t>
-      </w:r>
-      <w:r>
-        <w:rPr>
-          <w:rFonts w:ascii="Times New Roman" w:hAnsi="Times New Roman" w:cs="Times New Roman"/>
-        </w:rPr>
-        <w:t xml:space="preserve"> and spatial relationships occur (</w:t>
-      </w:r>
-      <w:proofErr w:type="spellStart"/>
-      <w:r>
-        <w:rPr>
-          <w:rFonts w:ascii="Times New Roman" w:hAnsi="Times New Roman" w:cs="Times New Roman"/>
-        </w:rPr>
-        <w:t>Haralick</w:t>
-      </w:r>
-      <w:proofErr w:type="spellEnd"/>
-      <w:r>
-        <w:rPr>
-          <w:rFonts w:ascii="Times New Roman" w:hAnsi="Times New Roman" w:cs="Times New Roman"/>
-        </w:rPr>
-        <w:t xml:space="preserve"> et al., 1973). The grayscale matrix is calculated with a distance of 1 pixel across four orientations (0, 45, 90, and 135 degrees). This approach ensures that the features are rotation-invariant, allowing the system to recognize a fabric regardless of the model’s pose on the runway. The system extracts four key statistical properties from the matrix: contrast, dissimilarity, homogeneity,</w:t>
+        <w:t xml:space="preserve"> The GLCM evaluates texture by tabulating the frequency at which pairs of specific gray-level values</w:t>
+      </w:r>
+      <w:r>
+        <w:rPr>
+          <w:rFonts w:ascii="Times New Roman" w:hAnsi="Times New Roman" w:cs="Times New Roman"/>
+        </w:rPr>
+        <w:t xml:space="preserve"> and spatial relationships occur (Haralick et al., 1973). The grayscale matrix is calculated with a distance of 1 pixel across four orientations (0, 45, 90, and 135 degrees). This approach ensures that the features are rotation-invariant, allowing the system to recognize a fabric regardless of the model’s pose on the runway. The system extracts four key statistical properties from the matrix: contrast, dissimilarity, homogeneity,</w:t>
       </w:r>
       <w:r>
         <w:rPr>
@@ -5817,21 +5862,7 @@
         <w:rPr>
           <w:rFonts w:ascii="Times New Roman" w:hAnsi="Times New Roman" w:cs="Times New Roman"/>
         </w:rPr>
-        <w:t xml:space="preserve">This module is responsible for the analytical core of the system and transforming the mathematical features extracted in the preceding modules into actionable insights. Because the system </w:t>
-      </w:r>
-      <w:proofErr w:type="spellStart"/>
-      <w:r>
-        <w:rPr>
-          <w:rFonts w:ascii="Times New Roman" w:hAnsi="Times New Roman" w:cs="Times New Roman"/>
-        </w:rPr>
-        <w:t>analyzes</w:t>
-      </w:r>
-      <w:proofErr w:type="spellEnd"/>
-      <w:r>
-        <w:rPr>
-          <w:rFonts w:ascii="Times New Roman" w:hAnsi="Times New Roman" w:cs="Times New Roman"/>
-        </w:rPr>
-        <w:t xml:space="preserve"> two distinct domains, colour and fabric texture, it uses a bifurcated classification and clustering architecture.</w:t>
+        <w:t>This module is responsible for the analytical core of the system and transforming the mathematical features extracted in the preceding modules into actionable insights. Because the system analyzes two distinct domains, colour and fabric texture, it uses a bifurcated classification and clustering architecture.</w:t>
       </w:r>
     </w:p>
     <w:p>
@@ -5857,21 +5888,7 @@
         <w:rPr>
           <w:rFonts w:ascii="Times New Roman" w:hAnsi="Times New Roman" w:cs="Times New Roman"/>
         </w:rPr>
-        <w:t xml:space="preserve">To extract the dominant colour palettes from the garments, the system relies on an unsupervised clustering approach. The isolated garment pixels, the output of the </w:t>
-      </w:r>
-      <w:proofErr w:type="spellStart"/>
-      <w:r>
-        <w:rPr>
-          <w:rFonts w:ascii="Times New Roman" w:hAnsi="Times New Roman" w:cs="Times New Roman"/>
-        </w:rPr>
-        <w:t>FashnHumanParser</w:t>
-      </w:r>
-      <w:proofErr w:type="spellEnd"/>
-      <w:r>
-        <w:rPr>
-          <w:rFonts w:ascii="Times New Roman" w:hAnsi="Times New Roman" w:cs="Times New Roman"/>
-        </w:rPr>
-        <w:t xml:space="preserve"> mask, are converted from the RGB colour space into the CIELAB (LAB) colour space. This conversion is critical because of the Euclidean distances in LAB space closely mimic human visual perception, preventing distorted colour associations (Al-Rawi &amp; Beel, 2020). The algorithm initializes a K-Means clustering model</w:t>
+        <w:t>To extract the dominant colour palettes from the garments, the system relies on an unsupervised clustering approach. The isolated garment pixels, the output of the FashnHumanParser mask, are converted from the RGB colour space into the CIELAB (LAB) colour space. This conversion is critical because of the Euclidean distances in LAB space closely mimic human visual perception, preventing distorted colour associations (Al-Rawi &amp; Beel, 2020). The algorithm initializes a K-Means clustering model</w:t>
       </w:r>
       <w:r>
         <w:rPr>
@@ -5958,21 +5975,7 @@
         <w:rPr>
           <w:rFonts w:ascii="Times New Roman" w:hAnsi="Times New Roman" w:cs="Times New Roman"/>
         </w:rPr>
-        <w:t xml:space="preserve">smaller dataset (Cortes &amp; </w:t>
-      </w:r>
-      <w:proofErr w:type="spellStart"/>
-      <w:r>
-        <w:rPr>
-          <w:rFonts w:ascii="Times New Roman" w:hAnsi="Times New Roman" w:cs="Times New Roman"/>
-        </w:rPr>
-        <w:t>Vapnik</w:t>
-      </w:r>
-      <w:proofErr w:type="spellEnd"/>
-      <w:r>
-        <w:rPr>
-          <w:rFonts w:ascii="Times New Roman" w:hAnsi="Times New Roman" w:cs="Times New Roman"/>
-        </w:rPr>
-        <w:t>, 1995).</w:t>
+        <w:t>smaller dataset (Cortes &amp; Vapnik, 1995).</w:t>
       </w:r>
     </w:p>
     <w:p>
@@ -6159,49 +6162,7 @@
         <w:rPr>
           <w:rFonts w:ascii="Times New Roman" w:hAnsi="Times New Roman" w:cs="Times New Roman"/>
         </w:rPr>
-        <w:t>The User Interface (UI) and User Experience (UX) of the House of Lasgidi (</w:t>
-      </w:r>
-      <w:proofErr w:type="spellStart"/>
-      <w:r>
-        <w:rPr>
-          <w:rFonts w:ascii="Times New Roman" w:hAnsi="Times New Roman" w:cs="Times New Roman"/>
-        </w:rPr>
-        <w:t>HoL</w:t>
-      </w:r>
-      <w:proofErr w:type="spellEnd"/>
-      <w:r>
-        <w:rPr>
-          <w:rFonts w:ascii="Times New Roman" w:hAnsi="Times New Roman" w:cs="Times New Roman"/>
-        </w:rPr>
-        <w:t>) system are explicitly designed around the principles of rapid insight retrieval. Fashion industry professionals operate in fast-paced environments where prolonged data interpretation is a bottleneck. Therefore, the interface adopts a minimalist, data-forward design paradigm, prioritizing visual hierarchy over decorative elements (</w:t>
-      </w:r>
-      <w:proofErr w:type="spellStart"/>
-      <w:r>
-        <w:rPr>
-          <w:rFonts w:ascii="Times New Roman" w:hAnsi="Times New Roman" w:cs="Times New Roman"/>
-        </w:rPr>
-        <w:t>Shneiderman</w:t>
-      </w:r>
-      <w:proofErr w:type="spellEnd"/>
-      <w:r>
-        <w:rPr>
-          <w:rFonts w:ascii="Times New Roman" w:hAnsi="Times New Roman" w:cs="Times New Roman"/>
-        </w:rPr>
-        <w:t xml:space="preserve"> &amp; </w:t>
-      </w:r>
-      <w:proofErr w:type="spellStart"/>
-      <w:r>
-        <w:rPr>
-          <w:rFonts w:ascii="Times New Roman" w:hAnsi="Times New Roman" w:cs="Times New Roman"/>
-        </w:rPr>
-        <w:t>Plaisant</w:t>
-      </w:r>
-      <w:proofErr w:type="spellEnd"/>
-      <w:r>
-        <w:rPr>
-          <w:rFonts w:ascii="Times New Roman" w:hAnsi="Times New Roman" w:cs="Times New Roman"/>
-        </w:rPr>
-        <w:t>, 2016).</w:t>
+        <w:t>The User Interface (UI) and User Experience (UX) of the House of Lasgidi (HoL) system are explicitly designed around the principles of rapid insight retrieval. Fashion industry professionals operate in fast-paced environments where prolonged data interpretation is a bottleneck. Therefore, the interface adopts a minimalist, data-forward design paradigm, prioritizing visual hierarchy over decorative elements (Shneiderman &amp; Plaisant, 2016).</w:t>
       </w:r>
     </w:p>
     <w:p>
@@ -6320,35 +6281,7 @@
         <w:rPr>
           <w:rFonts w:ascii="Times New Roman" w:hAnsi="Times New Roman" w:cs="Times New Roman"/>
         </w:rPr>
-        <w:t>While the machine learning outputs are serialized into JSON structure, the system requires a strong delivery mechanism to serve this data to the end-user. The data design employs a stateless RESTful API architecture. The backend acts as the data provider, exposing specific endpoints (e.g., /</w:t>
-      </w:r>
-      <w:proofErr w:type="spellStart"/>
-      <w:r>
-        <w:rPr>
-          <w:rFonts w:ascii="Times New Roman" w:hAnsi="Times New Roman" w:cs="Times New Roman"/>
-        </w:rPr>
-        <w:t>api</w:t>
-      </w:r>
-      <w:proofErr w:type="spellEnd"/>
-      <w:r>
-        <w:rPr>
-          <w:rFonts w:ascii="Times New Roman" w:hAnsi="Times New Roman" w:cs="Times New Roman"/>
-        </w:rPr>
-        <w:t>/overview, /</w:t>
-      </w:r>
-      <w:proofErr w:type="spellStart"/>
-      <w:r>
-        <w:rPr>
-          <w:rFonts w:ascii="Times New Roman" w:hAnsi="Times New Roman" w:cs="Times New Roman"/>
-        </w:rPr>
-        <w:t>api</w:t>
-      </w:r>
-      <w:proofErr w:type="spellEnd"/>
-      <w:r>
-        <w:rPr>
-          <w:rFonts w:ascii="Times New Roman" w:hAnsi="Times New Roman" w:cs="Times New Roman"/>
-        </w:rPr>
-        <w:t>/brands) to securely transmit the JSON payloads. The dashboard’s frontend requests this data asynchronously. This decoupled design ensures that the heavy Python machine-learning environment is completely isolated from the user interface, allowing the dashboard to remain highly responsive. Furthermore, the inclusion of an authentication layer ensures that proprietary fashion analytics remain secure and accessible only to authorized industry professionals.</w:t>
+        <w:t>While the machine learning outputs are serialized into JSON structure, the system requires a strong delivery mechanism to serve this data to the end-user. The data design employs a stateless RESTful API architecture. The backend acts as the data provider, exposing specific endpoints (e.g., /api/overview, /api/brands) to securely transmit the JSON payloads. The dashboard’s frontend requests this data asynchronously. This decoupled design ensures that the heavy Python machine-learning environment is completely isolated from the user interface, allowing the dashboard to remain highly responsive. Furthermore, the inclusion of an authentication layer ensures that proprietary fashion analytics remain secure and accessible only to authorized industry professionals.</w:t>
       </w:r>
     </w:p>
     <w:p>
@@ -6393,35 +6326,7 @@
         <w:rPr>
           <w:rFonts w:ascii="Times New Roman" w:hAnsi="Times New Roman" w:cs="Times New Roman"/>
         </w:rPr>
-        <w:t>The architectural and algorithmic choices for the House of Lasgidi (</w:t>
-      </w:r>
-      <w:proofErr w:type="spellStart"/>
-      <w:r>
-        <w:rPr>
-          <w:rFonts w:ascii="Times New Roman" w:hAnsi="Times New Roman" w:cs="Times New Roman"/>
-        </w:rPr>
-        <w:t>HoL</w:t>
-      </w:r>
-      <w:proofErr w:type="spellEnd"/>
-      <w:r>
-        <w:rPr>
-          <w:rFonts w:ascii="Times New Roman" w:hAnsi="Times New Roman" w:cs="Times New Roman"/>
-        </w:rPr>
-        <w:t xml:space="preserve">) system were driven by the specific computational challenges of </w:t>
-      </w:r>
-      <w:proofErr w:type="spellStart"/>
-      <w:r>
-        <w:rPr>
-          <w:rFonts w:ascii="Times New Roman" w:hAnsi="Times New Roman" w:cs="Times New Roman"/>
-        </w:rPr>
-        <w:t>analyzing</w:t>
-      </w:r>
-      <w:proofErr w:type="spellEnd"/>
-      <w:r>
-        <w:rPr>
-          <w:rFonts w:ascii="Times New Roman" w:hAnsi="Times New Roman" w:cs="Times New Roman"/>
-        </w:rPr>
-        <w:t xml:space="preserve"> complex runway images. While individual module decisions are detailed in Section 3.5, the overarching system design is justified by the following core technical trade-offs:</w:t>
+        <w:t>The architectural and algorithmic choices for the House of Lasgidi (HoL) system were driven by the specific computational challenges of analyzing complex runway images. While individual module decisions are detailed in Section 3.5, the overarching system design is justified by the following core technical trade-offs:</w:t>
       </w:r>
     </w:p>
     <w:p>
@@ -6435,33 +6340,11 @@
           <w:rFonts w:ascii="Times New Roman" w:hAnsi="Times New Roman" w:cs="Times New Roman"/>
         </w:rPr>
       </w:pPr>
-      <w:proofErr w:type="spellStart"/>
-      <w:r>
-        <w:rPr>
-          <w:rFonts w:ascii="Times New Roman" w:hAnsi="Times New Roman" w:cs="Times New Roman"/>
-        </w:rPr>
-        <w:t>FashnHumanParser</w:t>
-      </w:r>
-      <w:proofErr w:type="spellEnd"/>
-      <w:r>
-        <w:rPr>
-          <w:rFonts w:ascii="Times New Roman" w:hAnsi="Times New Roman" w:cs="Times New Roman"/>
-        </w:rPr>
-        <w:t xml:space="preserve"> is chosen over general semantic segmentation. General-purpose models like DeepLabV3+ segment the entire human silhouette. For runway analysis, this introduces severe data noise from skin, hair, and accessories. </w:t>
-      </w:r>
-      <w:proofErr w:type="spellStart"/>
-      <w:r>
-        <w:rPr>
-          <w:rFonts w:ascii="Times New Roman" w:hAnsi="Times New Roman" w:cs="Times New Roman"/>
-        </w:rPr>
-        <w:t>FashnHumanParser</w:t>
-      </w:r>
-      <w:proofErr w:type="spellEnd"/>
-      <w:r>
-        <w:rPr>
-          <w:rFonts w:ascii="Times New Roman" w:hAnsi="Times New Roman" w:cs="Times New Roman"/>
-        </w:rPr>
-        <w:t xml:space="preserve"> was explicitly chosen because its 18-class schema specifically targets human-clothing topography, allowing the system to aggressively filter out non-garment pixels and ensuring the downstream colour analysis is highly purified.</w:t>
+      <w:r>
+        <w:rPr>
+          <w:rFonts w:ascii="Times New Roman" w:hAnsi="Times New Roman" w:cs="Times New Roman"/>
+        </w:rPr>
+        <w:t>FashnHumanParser is chosen over general semantic segmentation. General-purpose models like DeepLabV3+ segment the entire human silhouette. For runway analysis, this introduces severe data noise from skin, hair, and accessories. FashnHumanParser was explicitly chosen because its 18-class schema specifically targets human-clothing topography, allowing the system to aggressively filter out non-garment pixels and ensuring the downstream colour analysis is highly purified.</w:t>
       </w:r>
     </w:p>
     <w:p>
@@ -6479,21 +6362,7 @@
         <w:rPr>
           <w:rFonts w:ascii="Times New Roman" w:hAnsi="Times New Roman" w:cs="Times New Roman"/>
         </w:rPr>
-        <w:t xml:space="preserve">GLCM + LBP Fusion over Convolutional Neural Networks (CNNs). While CNNs are the modern standard for general image classification, some gaps require massive datasets and are highly prone to overfitting on smaller, specialized datasets. By fusing GLCM, for macro-spatial patterns, and LBP, for micro-textural randomness, the system achieves a highly interpretable, lightweight feature vector that is rotation-invariant, which is crucial for </w:t>
-      </w:r>
-      <w:proofErr w:type="spellStart"/>
-      <w:r>
-        <w:rPr>
-          <w:rFonts w:ascii="Times New Roman" w:hAnsi="Times New Roman" w:cs="Times New Roman"/>
-        </w:rPr>
-        <w:t>analyzing</w:t>
-      </w:r>
-      <w:proofErr w:type="spellEnd"/>
-      <w:r>
-        <w:rPr>
-          <w:rFonts w:ascii="Times New Roman" w:hAnsi="Times New Roman" w:cs="Times New Roman"/>
-        </w:rPr>
-        <w:t xml:space="preserve"> shifting models on a runway.</w:t>
+        <w:t>GLCM + LBP Fusion over Convolutional Neural Networks (CNNs). While CNNs are the modern standard for general image classification, some gaps require massive datasets and are highly prone to overfitting on smaller, specialized datasets. By fusing GLCM, for macro-spatial patterns, and LBP, for micro-textural randomness, the system achieves a highly interpretable, lightweight feature vector that is rotation-invariant, which is crucial for analyzing shifting models on a runway.</w:t>
       </w:r>
     </w:p>
     <w:p>
@@ -6511,21 +6380,7 @@
         <w:rPr>
           <w:rFonts w:ascii="Times New Roman" w:hAnsi="Times New Roman" w:cs="Times New Roman"/>
         </w:rPr>
-        <w:t xml:space="preserve">CIELAB Colour Space. Raw images are natively processed in RGB. However, the system converts these to the LAB colour space before clustering. This is mathematically crucial because LAB is “perceptually uniform”, meaning the Euclidean distance between two </w:t>
-      </w:r>
-      <w:proofErr w:type="gramStart"/>
-      <w:r>
-        <w:rPr>
-          <w:rFonts w:ascii="Times New Roman" w:hAnsi="Times New Roman" w:cs="Times New Roman"/>
-        </w:rPr>
-        <w:t>point</w:t>
-      </w:r>
-      <w:proofErr w:type="gramEnd"/>
-      <w:r>
-        <w:rPr>
-          <w:rFonts w:ascii="Times New Roman" w:hAnsi="Times New Roman" w:cs="Times New Roman"/>
-        </w:rPr>
-        <w:t xml:space="preserve"> in the LAB space closely matches how the </w:t>
+        <w:t xml:space="preserve">CIELAB Colour Space. Raw images are natively processed in RGB. However, the system converts these to the LAB colour space before clustering. This is mathematically crucial because LAB is “perceptually uniform”, meaning the Euclidean distance between two point in the LAB space closely matches how the </w:t>
       </w:r>
       <w:r>
         <w:rPr>
@@ -6550,21 +6405,7 @@
         <w:rPr>
           <w:rFonts w:ascii="Times New Roman" w:hAnsi="Times New Roman" w:cs="Times New Roman"/>
         </w:rPr>
-        <w:t xml:space="preserve">Support Vector Machine (SVM) Classifier. Given the nature of the runway and fabric datasets, a Linear SVM was utilized to process the 1D GLCM + LBP feature vectors. SVMs excel at finding the optimal hyperplane in high-dimensional feature spaces, delivering high generalization (89.68% accuracy) with significantly lower computational overhead compared to deploying a secondary deep learning network (Cortes &amp; </w:t>
-      </w:r>
-      <w:proofErr w:type="spellStart"/>
-      <w:r>
-        <w:rPr>
-          <w:rFonts w:ascii="Times New Roman" w:hAnsi="Times New Roman" w:cs="Times New Roman"/>
-        </w:rPr>
-        <w:t>Vapnik</w:t>
-      </w:r>
-      <w:proofErr w:type="spellEnd"/>
-      <w:r>
-        <w:rPr>
-          <w:rFonts w:ascii="Times New Roman" w:hAnsi="Times New Roman" w:cs="Times New Roman"/>
-        </w:rPr>
-        <w:t>, 1995).</w:t>
+        <w:t>Support Vector Machine (SVM) Classifier. Given the nature of the runway and fabric datasets, a Linear SVM was utilized to process the 1D GLCM + LBP feature vectors. SVMs excel at finding the optimal hyperplane in high-dimensional feature spaces, delivering high generalization (89.68% accuracy) with significantly lower computational overhead compared to deploying a secondary deep learning network (Cortes &amp; Vapnik, 1995).</w:t>
       </w:r>
     </w:p>
     <w:p>
@@ -6578,33 +6419,11 @@
           <w:rFonts w:ascii="Times New Roman" w:hAnsi="Times New Roman" w:cs="Times New Roman"/>
         </w:rPr>
       </w:pPr>
-      <w:proofErr w:type="spellStart"/>
-      <w:r>
-        <w:rPr>
-          <w:rFonts w:ascii="Times New Roman" w:hAnsi="Times New Roman" w:cs="Times New Roman"/>
-        </w:rPr>
-        <w:t>FastAPI</w:t>
-      </w:r>
-      <w:proofErr w:type="spellEnd"/>
-      <w:r>
-        <w:rPr>
-          <w:rFonts w:ascii="Times New Roman" w:hAnsi="Times New Roman" w:cs="Times New Roman"/>
-        </w:rPr>
-        <w:t xml:space="preserve"> for the Backend: This is used to serve the JSON data. Unlike Django or Flask, </w:t>
-      </w:r>
-      <w:proofErr w:type="spellStart"/>
-      <w:r>
-        <w:rPr>
-          <w:rFonts w:ascii="Times New Roman" w:hAnsi="Times New Roman" w:cs="Times New Roman"/>
-        </w:rPr>
-        <w:t>FastAPI</w:t>
-      </w:r>
-      <w:proofErr w:type="spellEnd"/>
-      <w:r>
-        <w:rPr>
-          <w:rFonts w:ascii="Times New Roman" w:hAnsi="Times New Roman" w:cs="Times New Roman"/>
-        </w:rPr>
-        <w:t xml:space="preserve"> is built on modern asynchronous Python capabilities and natively validates JSON data types. Most importantly, it seamlessly integrates with the data science libraries (Pandas, Scikit-Learn) used in the analytical pipeline, minimizing friction between the machine learning models and web server.</w:t>
+      <w:r>
+        <w:rPr>
+          <w:rFonts w:ascii="Times New Roman" w:hAnsi="Times New Roman" w:cs="Times New Roman"/>
+        </w:rPr>
+        <w:t>FastAPI for the Backend: This is used to serve the JSON data. Unlike Django or Flask, FastAPI is built on modern asynchronous Python capabilities and natively validates JSON data types. Most importantly, it seamlessly integrates with the data science libraries (Pandas, Scikit-Learn) used in the analytical pipeline, minimizing friction between the machine learning models and web server.</w:t>
       </w:r>
     </w:p>
     <w:p>
@@ -6622,35 +6441,7 @@
         <w:rPr>
           <w:rFonts w:ascii="Times New Roman" w:hAnsi="Times New Roman" w:cs="Times New Roman"/>
         </w:rPr>
-        <w:t xml:space="preserve">React usage for Frontend: The dashboard was designed using React. The fashion data being visualized (colours, fabric percentages, trends, etc.) is highly dynamic and requires frequent DOM updates as the user filters between designers. </w:t>
-      </w:r>
-      <w:proofErr w:type="spellStart"/>
-      <w:r>
-        <w:rPr>
-          <w:rFonts w:ascii="Times New Roman" w:hAnsi="Times New Roman" w:cs="Times New Roman"/>
-        </w:rPr>
-        <w:t>React’s</w:t>
-      </w:r>
-      <w:proofErr w:type="spellEnd"/>
-      <w:r>
-        <w:rPr>
-          <w:rFonts w:ascii="Times New Roman" w:hAnsi="Times New Roman" w:cs="Times New Roman"/>
-        </w:rPr>
-        <w:t xml:space="preserve"> component-based architecture and Virtual DOM allow complex visualizations, like the </w:t>
-      </w:r>
-      <w:proofErr w:type="spellStart"/>
-      <w:r>
-        <w:rPr>
-          <w:rFonts w:ascii="Times New Roman" w:hAnsi="Times New Roman" w:cs="Times New Roman"/>
-        </w:rPr>
-        <w:t>ColourCharts</w:t>
-      </w:r>
-      <w:proofErr w:type="spellEnd"/>
-      <w:r>
-        <w:rPr>
-          <w:rFonts w:ascii="Times New Roman" w:hAnsi="Times New Roman" w:cs="Times New Roman"/>
-        </w:rPr>
-        <w:t>, to re-render instantly without requiring full page reloads, providing a smooth, app-like user experience.</w:t>
+        <w:t>React usage for Frontend: The dashboard was designed using React. The fashion data being visualized (colours, fabric percentages, trends, etc.) is highly dynamic and requires frequent DOM updates as the user filters between designers. React’s component-based architecture and Virtual DOM allow complex visualizations, like the ColourCharts, to re-render instantly without requiring full page reloads, providing a smooth, app-like user experience.</w:t>
       </w:r>
     </w:p>
     <w:p>
@@ -6846,16 +6637,8 @@
           <w:rFonts w:ascii="Times New Roman" w:hAnsi="Times New Roman" w:cs="Times New Roman"/>
         </w:rPr>
         <w:lastRenderedPageBreak/>
-        <w:t xml:space="preserve">4 </w:t>
-      </w:r>
-      <w:proofErr w:type="gramStart"/>
-      <w:r>
-        <w:rPr>
-          <w:rFonts w:ascii="Times New Roman" w:hAnsi="Times New Roman" w:cs="Times New Roman"/>
-        </w:rPr>
-        <w:t>IMPLEMENTATION</w:t>
-      </w:r>
-      <w:proofErr w:type="gramEnd"/>
+        <w:t>4 IMPLEMENTATION</w:t>
+      </w:r>
     </w:p>
     <w:p>
       <w:pPr>
@@ -6880,21 +6663,7 @@
         <w:rPr>
           <w:rFonts w:ascii="Times New Roman" w:hAnsi="Times New Roman" w:cs="Times New Roman"/>
         </w:rPr>
-        <w:t>This chapter discusses how the system, House of Lasgidi (</w:t>
-      </w:r>
-      <w:proofErr w:type="spellStart"/>
-      <w:r>
-        <w:rPr>
-          <w:rFonts w:ascii="Times New Roman" w:hAnsi="Times New Roman" w:cs="Times New Roman"/>
-        </w:rPr>
-        <w:t>HoL</w:t>
-      </w:r>
-      <w:proofErr w:type="spellEnd"/>
-      <w:r>
-        <w:rPr>
-          <w:rFonts w:ascii="Times New Roman" w:hAnsi="Times New Roman" w:cs="Times New Roman"/>
-        </w:rPr>
-        <w:t xml:space="preserve">), was developed and implemented. It </w:t>
+        <w:t xml:space="preserve">This chapter discusses how the system, House of Lasgidi (HoL), was developed and implemented. It </w:t>
       </w:r>
       <w:r>
         <w:rPr>
@@ -6933,21 +6702,7 @@
         <w:rPr>
           <w:rFonts w:ascii="Times New Roman" w:hAnsi="Times New Roman" w:cs="Times New Roman"/>
         </w:rPr>
-        <w:t xml:space="preserve">This system was developed on a Windows-based software, utilizing the Python programming language due to its extensive ecosystem for computer vision and machine learning. To maintain an iterative development workflow, </w:t>
-      </w:r>
-      <w:proofErr w:type="spellStart"/>
-      <w:r>
-        <w:rPr>
-          <w:rFonts w:ascii="Times New Roman" w:hAnsi="Times New Roman" w:cs="Times New Roman"/>
-        </w:rPr>
-        <w:t>Jupyter</w:t>
-      </w:r>
-      <w:proofErr w:type="spellEnd"/>
-      <w:r>
-        <w:rPr>
-          <w:rFonts w:ascii="Times New Roman" w:hAnsi="Times New Roman" w:cs="Times New Roman"/>
-        </w:rPr>
-        <w:t xml:space="preserve"> Notebooks were used for initial feature experimentation, production-level scraping and model training.</w:t>
+        <w:t>This system was developed on a Windows-based software, utilizing the Python programming language due to its extensive ecosystem for computer vision and machine learning. To maintain an iterative development workflow, Jupyter Notebooks were used for initial feature experimentation, production-level scraping and model training.</w:t>
       </w:r>
     </w:p>
     <w:p>
@@ -7014,35 +6769,7 @@
         <w:rPr>
           <w:rFonts w:ascii="Times New Roman" w:hAnsi="Times New Roman" w:cs="Times New Roman"/>
         </w:rPr>
-        <w:t xml:space="preserve">Selenium &amp; </w:t>
-      </w:r>
-      <w:proofErr w:type="spellStart"/>
-      <w:r>
-        <w:rPr>
-          <w:rFonts w:ascii="Times New Roman" w:hAnsi="Times New Roman" w:cs="Times New Roman"/>
-        </w:rPr>
-        <w:t>ChromeDriver</w:t>
-      </w:r>
-      <w:proofErr w:type="spellEnd"/>
-      <w:r>
-        <w:rPr>
-          <w:rFonts w:ascii="Times New Roman" w:hAnsi="Times New Roman" w:cs="Times New Roman"/>
-        </w:rPr>
-        <w:t xml:space="preserve">: These were used to navigate the dynamic JavaScript-rendered content of the </w:t>
-      </w:r>
-      <w:proofErr w:type="spellStart"/>
-      <w:r>
-        <w:rPr>
-          <w:rFonts w:ascii="Times New Roman" w:hAnsi="Times New Roman" w:cs="Times New Roman"/>
-        </w:rPr>
-        <w:t>BellaNaija</w:t>
-      </w:r>
-      <w:proofErr w:type="spellEnd"/>
-      <w:r>
-        <w:rPr>
-          <w:rFonts w:ascii="Times New Roman" w:hAnsi="Times New Roman" w:cs="Times New Roman"/>
-        </w:rPr>
-        <w:t xml:space="preserve"> runway galleries.</w:t>
+        <w:t>Selenium &amp; ChromeDriver: These were used to navigate the dynamic JavaScript-rendered content of the BellaNaija runway galleries.</w:t>
       </w:r>
     </w:p>
     <w:p>
@@ -7078,21 +6805,19 @@
         <w:rPr>
           <w:rFonts w:ascii="Times New Roman" w:hAnsi="Times New Roman" w:cs="Times New Roman"/>
         </w:rPr>
-        <w:t xml:space="preserve">Image </w:t>
-      </w:r>
-      <w:proofErr w:type="gramStart"/>
-      <w:r>
-        <w:rPr>
-          <w:rFonts w:ascii="Times New Roman" w:hAnsi="Times New Roman" w:cs="Times New Roman"/>
-        </w:rPr>
-        <w:t>Pre-Processing</w:t>
-      </w:r>
-      <w:proofErr w:type="gramEnd"/>
-      <w:r>
-        <w:rPr>
-          <w:rFonts w:ascii="Times New Roman" w:hAnsi="Times New Roman" w:cs="Times New Roman"/>
-        </w:rPr>
-        <w:t>:</w:t>
+        <w:t>Image Pre-</w:t>
+      </w:r>
+      <w:r>
+        <w:rPr>
+          <w:rFonts w:ascii="Times New Roman" w:hAnsi="Times New Roman" w:cs="Times New Roman"/>
+        </w:rPr>
+        <w:t>p</w:t>
+      </w:r>
+      <w:r>
+        <w:rPr>
+          <w:rFonts w:ascii="Times New Roman" w:hAnsi="Times New Roman" w:cs="Times New Roman"/>
+        </w:rPr>
+        <w:t>rocessing:</w:t>
       </w:r>
     </w:p>
     <w:p>
@@ -7134,21 +6859,7 @@
         <w:rPr>
           <w:rFonts w:ascii="Times New Roman" w:hAnsi="Times New Roman" w:cs="Times New Roman"/>
         </w:rPr>
-        <w:t xml:space="preserve"> (</w:t>
-      </w:r>
-      <w:proofErr w:type="spellStart"/>
-      <w:r>
-        <w:rPr>
-          <w:rFonts w:ascii="Times New Roman" w:hAnsi="Times New Roman" w:cs="Times New Roman"/>
-        </w:rPr>
-        <w:t>skimage</w:t>
-      </w:r>
-      <w:proofErr w:type="spellEnd"/>
-      <w:r>
-        <w:rPr>
-          <w:rFonts w:ascii="Times New Roman" w:hAnsi="Times New Roman" w:cs="Times New Roman"/>
-        </w:rPr>
-        <w:t>): This was used to compute GLCM and LBP.</w:t>
+        <w:t xml:space="preserve"> (skimage): This was used to compute GLCM and LBP.</w:t>
       </w:r>
     </w:p>
     <w:p>
@@ -7184,21 +6895,7 @@
         <w:rPr>
           <w:rFonts w:ascii="Times New Roman" w:hAnsi="Times New Roman" w:cs="Times New Roman"/>
         </w:rPr>
-        <w:t>Scikit-Learn (</w:t>
-      </w:r>
-      <w:proofErr w:type="spellStart"/>
-      <w:r>
-        <w:rPr>
-          <w:rFonts w:ascii="Times New Roman" w:hAnsi="Times New Roman" w:cs="Times New Roman"/>
-        </w:rPr>
-        <w:t>sklearn</w:t>
-      </w:r>
-      <w:proofErr w:type="spellEnd"/>
-      <w:r>
-        <w:rPr>
-          <w:rFonts w:ascii="Times New Roman" w:hAnsi="Times New Roman" w:cs="Times New Roman"/>
-        </w:rPr>
-        <w:t>): This was used during the implementation of the SVM model, Standard Scaler for feature normalization, and the train-test-split usage for model validation.</w:t>
+        <w:t>Scikit-Learn (sklearn): This was used during the implementation of the SVM model, Standard Scaler for feature normalization, and the train-test-split usage for model validation.</w:t>
       </w:r>
     </w:p>
     <w:p>
@@ -7300,35 +6997,7 @@
         <w:rPr>
           <w:rFonts w:ascii="Times New Roman" w:hAnsi="Times New Roman" w:cs="Times New Roman"/>
         </w:rPr>
-        <w:t xml:space="preserve">Backend Framework: </w:t>
-      </w:r>
-      <w:proofErr w:type="spellStart"/>
-      <w:r>
-        <w:rPr>
-          <w:rFonts w:ascii="Times New Roman" w:hAnsi="Times New Roman" w:cs="Times New Roman"/>
-        </w:rPr>
-        <w:t>FastAPI</w:t>
-      </w:r>
-      <w:proofErr w:type="spellEnd"/>
-      <w:r>
-        <w:rPr>
-          <w:rFonts w:ascii="Times New Roman" w:hAnsi="Times New Roman" w:cs="Times New Roman"/>
-        </w:rPr>
-        <w:t xml:space="preserve"> (served via </w:t>
-      </w:r>
-      <w:proofErr w:type="spellStart"/>
-      <w:r>
-        <w:rPr>
-          <w:rFonts w:ascii="Times New Roman" w:hAnsi="Times New Roman" w:cs="Times New Roman"/>
-        </w:rPr>
-        <w:t>Uvicorn</w:t>
-      </w:r>
-      <w:proofErr w:type="spellEnd"/>
-      <w:r>
-        <w:rPr>
-          <w:rFonts w:ascii="Times New Roman" w:hAnsi="Times New Roman" w:cs="Times New Roman"/>
-        </w:rPr>
-        <w:t>) was implemented to construct the REST API and serve the analytical data.</w:t>
+        <w:t>Backend Framework: FastAPI (served via Uvicorn) was implemented to construct the REST API and serve the analytical data.</w:t>
       </w:r>
     </w:p>
     <w:p>
@@ -7424,16 +7093,24 @@
         </w:rPr>
         <w:t xml:space="preserve">The scraping module was initialized using </w:t>
       </w:r>
-      <w:proofErr w:type="spellStart"/>
-      <w:proofErr w:type="gramStart"/>
+      <w:r>
+        <w:rPr>
+          <w:rFonts w:ascii="Times New Roman" w:hAnsi="Times New Roman" w:cs="Times New Roman"/>
+        </w:rPr>
+        <w:t>‘</w:t>
+      </w:r>
       <w:r>
         <w:rPr>
           <w:rFonts w:ascii="Times New Roman" w:hAnsi="Times New Roman" w:cs="Times New Roman"/>
         </w:rPr>
         <w:t>webdriver.Chrome</w:t>
       </w:r>
-      <w:proofErr w:type="spellEnd"/>
-      <w:proofErr w:type="gramEnd"/>
+      <w:r>
+        <w:rPr>
+          <w:rFonts w:ascii="Times New Roman" w:hAnsi="Times New Roman" w:cs="Times New Roman"/>
+        </w:rPr>
+        <w:t>’</w:t>
+      </w:r>
       <w:r>
         <w:rPr>
           <w:rFonts w:ascii="Times New Roman" w:hAnsi="Times New Roman" w:cs="Times New Roman"/>
@@ -7524,30 +7201,50 @@
         <w:rPr>
           <w:rFonts w:ascii="Times New Roman" w:hAnsi="Times New Roman" w:cs="Times New Roman"/>
         </w:rPr>
-        <w:t>A critical pre-processing step involved sanitizing the scraped image URLs. The script was programmed to isolate the data-</w:t>
-      </w:r>
-      <w:proofErr w:type="spellStart"/>
-      <w:r>
-        <w:rPr>
-          <w:rFonts w:ascii="Times New Roman" w:hAnsi="Times New Roman" w:cs="Times New Roman"/>
-        </w:rPr>
-        <w:t>src</w:t>
-      </w:r>
-      <w:proofErr w:type="spellEnd"/>
+        <w:t xml:space="preserve">A critical pre-processing step involved sanitizing the scraped image URLs. The script was programmed to isolate the </w:t>
+      </w:r>
+      <w:r>
+        <w:rPr>
+          <w:rFonts w:ascii="Times New Roman" w:hAnsi="Times New Roman" w:cs="Times New Roman"/>
+        </w:rPr>
+        <w:t>‘</w:t>
+      </w:r>
+      <w:r>
+        <w:rPr>
+          <w:rFonts w:ascii="Times New Roman" w:hAnsi="Times New Roman" w:cs="Times New Roman"/>
+        </w:rPr>
+        <w:t>data-src</w:t>
+      </w:r>
+      <w:r>
+        <w:rPr>
+          <w:rFonts w:ascii="Times New Roman" w:hAnsi="Times New Roman" w:cs="Times New Roman"/>
+        </w:rPr>
+        <w:t>’</w:t>
+      </w:r>
       <w:r>
         <w:rPr>
           <w:rFonts w:ascii="Times New Roman" w:hAnsi="Times New Roman" w:cs="Times New Roman"/>
         </w:rPr>
         <w:t xml:space="preserve"> and </w:t>
       </w:r>
-      <w:proofErr w:type="spellStart"/>
+      <w:r>
+        <w:rPr>
+          <w:rFonts w:ascii="Times New Roman" w:hAnsi="Times New Roman" w:cs="Times New Roman"/>
+        </w:rPr>
+        <w:t>‘</w:t>
+      </w:r>
       <w:r>
         <w:rPr>
           <w:rFonts w:ascii="Times New Roman" w:hAnsi="Times New Roman" w:cs="Times New Roman"/>
         </w:rPr>
         <w:t>srcset</w:t>
       </w:r>
-      <w:proofErr w:type="spellEnd"/>
+      <w:r>
+        <w:rPr>
+          <w:rFonts w:ascii="Times New Roman" w:hAnsi="Times New Roman" w:cs="Times New Roman"/>
+        </w:rPr>
+        <w:t>’</w:t>
+      </w:r>
       <w:r>
         <w:rPr>
           <w:rFonts w:ascii="Times New Roman" w:hAnsi="Times New Roman" w:cs="Times New Roman"/>
@@ -7671,21 +7368,7 @@
         <w:rPr>
           <w:rFonts w:ascii="Times New Roman" w:hAnsi="Times New Roman" w:cs="Times New Roman"/>
         </w:rPr>
-        <w:t xml:space="preserve">To isolate the garments for the colour analysis engine, a semantic segmentation pipeline was implemented utilizing the </w:t>
-      </w:r>
-      <w:proofErr w:type="spellStart"/>
-      <w:r>
-        <w:rPr>
-          <w:rFonts w:ascii="Times New Roman" w:hAnsi="Times New Roman" w:cs="Times New Roman"/>
-        </w:rPr>
-        <w:t>PyTorch</w:t>
-      </w:r>
-      <w:proofErr w:type="spellEnd"/>
-      <w:r>
-        <w:rPr>
-          <w:rFonts w:ascii="Times New Roman" w:hAnsi="Times New Roman" w:cs="Times New Roman"/>
-        </w:rPr>
-        <w:t xml:space="preserve"> framework.</w:t>
+        <w:t>To isolate the garments for the colour analysis engine, a semantic segmentation pipeline was implemented utilizing the PyTorch framework.</w:t>
       </w:r>
     </w:p>
     <w:p>
@@ -7699,35 +7382,7 @@
           <w:rFonts w:ascii="Times New Roman" w:hAnsi="Times New Roman" w:cs="Times New Roman"/>
         </w:rPr>
         <w:lastRenderedPageBreak/>
-        <w:t xml:space="preserve">The images were transformed into normalized floating-point tensors. Instead of relying solely on the generalized DeppLabV3+ model, the script integrated the </w:t>
-      </w:r>
-      <w:proofErr w:type="spellStart"/>
-      <w:r>
-        <w:rPr>
-          <w:rFonts w:ascii="Times New Roman" w:hAnsi="Times New Roman" w:cs="Times New Roman"/>
-        </w:rPr>
-        <w:t>FashnHumanParser</w:t>
-      </w:r>
-      <w:proofErr w:type="spellEnd"/>
-      <w:r>
-        <w:rPr>
-          <w:rFonts w:ascii="Times New Roman" w:hAnsi="Times New Roman" w:cs="Times New Roman"/>
-        </w:rPr>
-        <w:t xml:space="preserve"> model. The model was passed over the image tensor, and the output was filtered using a strict Boolean mask. The code explicitly targeted class IDs associated with clothing (4: upper-clothes, 5: skirt, 6: pants, 7: dress), while actively subtracting pixels that mapped to predefined LAB space skin tones. The resulting garment-only pixel arrays were then passed into the Scikit-Learn </w:t>
-      </w:r>
-      <w:proofErr w:type="spellStart"/>
-      <w:r>
-        <w:rPr>
-          <w:rFonts w:ascii="Times New Roman" w:hAnsi="Times New Roman" w:cs="Times New Roman"/>
-        </w:rPr>
-        <w:t>KMeans</w:t>
-      </w:r>
-      <w:proofErr w:type="spellEnd"/>
-      <w:r>
-        <w:rPr>
-          <w:rFonts w:ascii="Times New Roman" w:hAnsi="Times New Roman" w:cs="Times New Roman"/>
-        </w:rPr>
-        <w:t xml:space="preserve"> function to extract the dominant brand palettes.</w:t>
+        <w:t>The images were transformed into normalized floating-point tensors. Instead of relying solely on the generalized DeppLabV3+ model, the script integrated the FashnHumanParser model. The model was passed over the image tensor, and the output was filtered using a strict Boolean mask. The code explicitly targeted class IDs associated with clothing (4: upper-clothes, 5: skirt, 6: pants, 7: dress), while actively subtracting pixels that mapped to predefined LAB space skin tones. The resulting garment-only pixel arrays were then passed into the Scikit-Learn KMeans function to extract the dominant brand palettes.</w:t>
       </w:r>
     </w:p>
     <w:p>
@@ -7766,21 +7421,7 @@
         <w:rPr>
           <w:rFonts w:ascii="Times New Roman" w:hAnsi="Times New Roman" w:cs="Times New Roman"/>
         </w:rPr>
-        <w:t>Unlike the segmentation pipeline, this module operated directly on the raw runway images using the OpenCV (cv2) and Scikit-Image (</w:t>
-      </w:r>
-      <w:proofErr w:type="spellStart"/>
-      <w:r>
-        <w:rPr>
-          <w:rFonts w:ascii="Times New Roman" w:hAnsi="Times New Roman" w:cs="Times New Roman"/>
-        </w:rPr>
-        <w:t>skimage</w:t>
-      </w:r>
-      <w:proofErr w:type="spellEnd"/>
-      <w:r>
-        <w:rPr>
-          <w:rFonts w:ascii="Times New Roman" w:hAnsi="Times New Roman" w:cs="Times New Roman"/>
-        </w:rPr>
-        <w:t>) libraries. To maximize data granularity, the script decomposed each image into its constit</w:t>
+        <w:t>Unlike the segmentation pipeline, this module operated directly on the raw runway images using the OpenCV (cv2) and Scikit-Image (skimage) libraries. To maximize data granularity, the script decomposed each image into its constit</w:t>
       </w:r>
       <w:r>
         <w:rPr>
@@ -7788,14 +7429,12 @@
         </w:rPr>
         <w:t xml:space="preserve">uent </w:t>
       </w:r>
-      <w:proofErr w:type="gramStart"/>
-      <w:r>
-        <w:rPr>
-          <w:rFonts w:ascii="Times New Roman" w:hAnsi="Times New Roman" w:cs="Times New Roman"/>
-        </w:rPr>
-        <w:t>Red, Green, and Blue</w:t>
-      </w:r>
-      <w:proofErr w:type="gramEnd"/>
+      <w:r>
+        <w:rPr>
+          <w:rFonts w:ascii="Times New Roman" w:hAnsi="Times New Roman" w:cs="Times New Roman"/>
+        </w:rPr>
+        <w:t>red, green, and blue</w:t>
+      </w:r>
       <w:r>
         <w:rPr>
           <w:rFonts w:ascii="Times New Roman" w:hAnsi="Times New Roman" w:cs="Times New Roman"/>
@@ -7820,64 +7459,48 @@
         </w:rPr>
         <w:t xml:space="preserve">GLCM Implementation: the </w:t>
       </w:r>
-      <w:proofErr w:type="spellStart"/>
-      <w:proofErr w:type="gramStart"/>
-      <w:r>
-        <w:rPr>
-          <w:rFonts w:ascii="Times New Roman" w:hAnsi="Times New Roman" w:cs="Times New Roman"/>
-        </w:rPr>
-        <w:t>skinage.feature</w:t>
-      </w:r>
-      <w:proofErr w:type="gramEnd"/>
-      <w:r>
-        <w:rPr>
-          <w:rFonts w:ascii="Times New Roman" w:hAnsi="Times New Roman" w:cs="Times New Roman"/>
-        </w:rPr>
-        <w:t>.graycomatrix</w:t>
-      </w:r>
-      <w:proofErr w:type="spellEnd"/>
-      <w:r>
-        <w:rPr>
-          <w:rFonts w:ascii="Times New Roman" w:hAnsi="Times New Roman" w:cs="Times New Roman"/>
-        </w:rPr>
-        <w:t xml:space="preserve"> function was executed with a pixel distance of [1] and explicitly mapped across four radians ([0, </w:t>
-      </w:r>
-      <w:proofErr w:type="spellStart"/>
-      <w:r>
-        <w:rPr>
-          <w:rFonts w:ascii="Times New Roman" w:hAnsi="Times New Roman" w:cs="Times New Roman"/>
-        </w:rPr>
-        <w:t>np.pi</w:t>
-      </w:r>
-      <w:proofErr w:type="spellEnd"/>
-      <w:r>
-        <w:rPr>
-          <w:rFonts w:ascii="Times New Roman" w:hAnsi="Times New Roman" w:cs="Times New Roman"/>
-        </w:rPr>
-        <w:t>/4, np.pi.2, 3*</w:t>
-      </w:r>
-      <w:proofErr w:type="spellStart"/>
-      <w:r>
-        <w:rPr>
-          <w:rFonts w:ascii="Times New Roman" w:hAnsi="Times New Roman" w:cs="Times New Roman"/>
-        </w:rPr>
-        <w:t>np.pi</w:t>
-      </w:r>
-      <w:proofErr w:type="spellEnd"/>
-      <w:r>
-        <w:rPr>
-          <w:rFonts w:ascii="Times New Roman" w:hAnsi="Times New Roman" w:cs="Times New Roman"/>
-        </w:rPr>
-        <w:t xml:space="preserve">/4]) to ensure the rotational invariance designed in Chapter 3. Secondary statistical properties (Contrast, Dissimilarity, Homogeneity, and Energy) were extracted using </w:t>
-      </w:r>
-      <w:proofErr w:type="spellStart"/>
+      <w:r>
+        <w:rPr>
+          <w:rFonts w:ascii="Times New Roman" w:hAnsi="Times New Roman" w:cs="Times New Roman"/>
+        </w:rPr>
+        <w:t>‘</w:t>
+      </w:r>
+      <w:r>
+        <w:rPr>
+          <w:rFonts w:ascii="Times New Roman" w:hAnsi="Times New Roman" w:cs="Times New Roman"/>
+        </w:rPr>
+        <w:t>skinage.feature.graycomatrix</w:t>
+      </w:r>
+      <w:r>
+        <w:rPr>
+          <w:rFonts w:ascii="Times New Roman" w:hAnsi="Times New Roman" w:cs="Times New Roman"/>
+        </w:rPr>
+        <w:t>’</w:t>
+      </w:r>
+      <w:r>
+        <w:rPr>
+          <w:rFonts w:ascii="Times New Roman" w:hAnsi="Times New Roman" w:cs="Times New Roman"/>
+        </w:rPr>
+        <w:t xml:space="preserve"> function was executed with a pixel distance of [1] and explicitly mapped across four radians ([0, np.pi/4, np.pi.2, 3*np.pi/4]) to ensure the rotational invariance designed in Chapter 3. Secondary statistical properties (Contrast, Dissimilarity, Homogeneity, and Energy) were extracted using </w:t>
+      </w:r>
+      <w:r>
+        <w:rPr>
+          <w:rFonts w:ascii="Times New Roman" w:hAnsi="Times New Roman" w:cs="Times New Roman"/>
+        </w:rPr>
+        <w:t>‘</w:t>
+      </w:r>
       <w:r>
         <w:rPr>
           <w:rFonts w:ascii="Times New Roman" w:hAnsi="Times New Roman" w:cs="Times New Roman"/>
         </w:rPr>
         <w:t>graycoprops</w:t>
       </w:r>
-      <w:proofErr w:type="spellEnd"/>
+      <w:r>
+        <w:rPr>
+          <w:rFonts w:ascii="Times New Roman" w:hAnsi="Times New Roman" w:cs="Times New Roman"/>
+        </w:rPr>
+        <w:t>’</w:t>
+      </w:r>
       <w:r>
         <w:rPr>
           <w:rFonts w:ascii="Times New Roman" w:hAnsi="Times New Roman" w:cs="Times New Roman"/>
@@ -7902,36 +7525,48 @@
         </w:rPr>
         <w:t xml:space="preserve">LBP and Entropy Implementation: Micro-patterns were extracted using </w:t>
       </w:r>
-      <w:proofErr w:type="spellStart"/>
+      <w:r>
+        <w:rPr>
+          <w:rFonts w:ascii="Times New Roman" w:hAnsi="Times New Roman" w:cs="Times New Roman"/>
+        </w:rPr>
+        <w:t>‘</w:t>
+      </w:r>
       <w:r>
         <w:rPr>
           <w:rFonts w:ascii="Times New Roman" w:hAnsi="Times New Roman" w:cs="Times New Roman"/>
         </w:rPr>
         <w:t>local_binary_pattern</w:t>
       </w:r>
-      <w:proofErr w:type="spellEnd"/>
+      <w:r>
+        <w:rPr>
+          <w:rFonts w:ascii="Times New Roman" w:hAnsi="Times New Roman" w:cs="Times New Roman"/>
+        </w:rPr>
+        <w:t>’</w:t>
+      </w:r>
       <w:r>
         <w:rPr>
           <w:rFonts w:ascii="Times New Roman" w:hAnsi="Times New Roman" w:cs="Times New Roman"/>
         </w:rPr>
         <w:t xml:space="preserve"> with a radius of 1 and 8 points. A mathematically crucial step was the integration of the </w:t>
       </w:r>
-      <w:proofErr w:type="spellStart"/>
-      <w:proofErr w:type="gramStart"/>
-      <w:r>
-        <w:rPr>
-          <w:rFonts w:ascii="Times New Roman" w:hAnsi="Times New Roman" w:cs="Times New Roman"/>
-        </w:rPr>
-        <w:t>scipy.stats</w:t>
-      </w:r>
-      <w:proofErr w:type="gramEnd"/>
-      <w:r>
-        <w:rPr>
-          <w:rFonts w:ascii="Times New Roman" w:hAnsi="Times New Roman" w:cs="Times New Roman"/>
-        </w:rPr>
-        <w:t>.entropy</w:t>
-      </w:r>
-      <w:proofErr w:type="spellEnd"/>
+      <w:r>
+        <w:rPr>
+          <w:rFonts w:ascii="Times New Roman" w:hAnsi="Times New Roman" w:cs="Times New Roman"/>
+        </w:rPr>
+        <w:t>‘</w:t>
+      </w:r>
+      <w:r>
+        <w:rPr>
+          <w:rFonts w:ascii="Times New Roman" w:hAnsi="Times New Roman" w:cs="Times New Roman"/>
+        </w:rPr>
+        <w:t>scipy.stats.entropy</w:t>
+      </w:r>
+      <w:r>
+        <w:rPr>
+          <w:rFonts w:ascii="Times New Roman" w:hAnsi="Times New Roman" w:cs="Times New Roman"/>
+        </w:rPr>
+        <w:t>’</w:t>
+      </w:r>
       <w:r>
         <w:rPr>
           <w:rFonts w:ascii="Times New Roman" w:hAnsi="Times New Roman" w:cs="Times New Roman"/>
@@ -8037,21 +7672,7 @@
         <w:rPr>
           <w:rFonts w:ascii="Times New Roman" w:hAnsi="Times New Roman" w:cs="Times New Roman"/>
         </w:rPr>
-        <w:t xml:space="preserve">The resulting multidimensional vectors from all colour channels were concatenated into a flat dictionary and serialized into Pandas </w:t>
-      </w:r>
-      <w:proofErr w:type="spellStart"/>
-      <w:r>
-        <w:rPr>
-          <w:rFonts w:ascii="Times New Roman" w:hAnsi="Times New Roman" w:cs="Times New Roman"/>
-        </w:rPr>
-        <w:t>DataFrames</w:t>
-      </w:r>
-      <w:proofErr w:type="spellEnd"/>
-      <w:r>
-        <w:rPr>
-          <w:rFonts w:ascii="Times New Roman" w:hAnsi="Times New Roman" w:cs="Times New Roman"/>
-        </w:rPr>
-        <w:t>, ultimately saving as brand-specific CSV files.</w:t>
+        <w:t>The resulting multidimensional vectors from all colour channels were concatenated into a flat dictionary and serialized into Pandas DataFrames, ultimately saving as brand-specific CSV files.</w:t>
       </w:r>
     </w:p>
     <w:p>
@@ -8112,68 +7733,66 @@
         </w:rPr>
         <w:t xml:space="preserve">(includes LBP histograms, Entropy, and GLCM properties) were loaded into a primary dataset. The data was split into a training and testing subsets using </w:t>
       </w:r>
-      <w:proofErr w:type="spellStart"/>
+      <w:r>
+        <w:rPr>
+          <w:rFonts w:ascii="Times New Roman" w:hAnsi="Times New Roman" w:cs="Times New Roman"/>
+        </w:rPr>
+        <w:t>‘</w:t>
+      </w:r>
       <w:r>
         <w:rPr>
           <w:rFonts w:ascii="Times New Roman" w:hAnsi="Times New Roman" w:cs="Times New Roman"/>
         </w:rPr>
         <w:t>train_test_split</w:t>
       </w:r>
-      <w:proofErr w:type="spellEnd"/>
-      <w:r>
-        <w:rPr>
-          <w:rFonts w:ascii="Times New Roman" w:hAnsi="Times New Roman" w:cs="Times New Roman"/>
-        </w:rPr>
-        <w:t xml:space="preserve">. Because the feature scales varied drastically, a </w:t>
-      </w:r>
-      <w:proofErr w:type="spellStart"/>
-      <w:proofErr w:type="gramStart"/>
-      <w:r>
-        <w:rPr>
-          <w:rFonts w:ascii="Times New Roman" w:hAnsi="Times New Roman" w:cs="Times New Roman"/>
-        </w:rPr>
-        <w:t>StandardScaler</w:t>
-      </w:r>
-      <w:proofErr w:type="spellEnd"/>
-      <w:r>
-        <w:rPr>
-          <w:rFonts w:ascii="Times New Roman" w:hAnsi="Times New Roman" w:cs="Times New Roman"/>
-        </w:rPr>
-        <w:t>(</w:t>
-      </w:r>
-      <w:proofErr w:type="gramEnd"/>
-      <w:r>
-        <w:rPr>
-          <w:rFonts w:ascii="Times New Roman" w:hAnsi="Times New Roman" w:cs="Times New Roman"/>
-        </w:rPr>
-        <w:t>) object was initialized and fitted to the training data. This transformation normalized the dataset to a mean of zero and a standard deviation of one, preventing high-scaled variables from dominating the objective function.</w:t>
-      </w:r>
-    </w:p>
-    <w:p>
-      <w:pPr>
-        <w:rPr>
-          <w:rFonts w:ascii="Times New Roman" w:hAnsi="Times New Roman" w:cs="Times New Roman"/>
-        </w:rPr>
-      </w:pPr>
-      <w:r>
-        <w:rPr>
-          <w:rFonts w:ascii="Times New Roman" w:hAnsi="Times New Roman" w:cs="Times New Roman"/>
-        </w:rPr>
-        <w:t xml:space="preserve">The system was then fitted using a </w:t>
-      </w:r>
-      <w:proofErr w:type="spellStart"/>
-      <w:r>
-        <w:rPr>
-          <w:rFonts w:ascii="Times New Roman" w:hAnsi="Times New Roman" w:cs="Times New Roman"/>
-        </w:rPr>
-        <w:t>LinearSVC</w:t>
-      </w:r>
-      <w:proofErr w:type="spellEnd"/>
-      <w:r>
-        <w:rPr>
-          <w:rFonts w:ascii="Times New Roman" w:hAnsi="Times New Roman" w:cs="Times New Roman"/>
-        </w:rPr>
-        <w:t xml:space="preserve"> model:</w:t>
+      <w:r>
+        <w:rPr>
+          <w:rFonts w:ascii="Times New Roman" w:hAnsi="Times New Roman" w:cs="Times New Roman"/>
+        </w:rPr>
+        <w:t>’</w:t>
+      </w:r>
+      <w:r>
+        <w:rPr>
+          <w:rFonts w:ascii="Times New Roman" w:hAnsi="Times New Roman" w:cs="Times New Roman"/>
+        </w:rPr>
+        <w:t>. Because the feature scales varied drastically, a</w:t>
+      </w:r>
+      <w:r>
+        <w:rPr>
+          <w:rFonts w:ascii="Times New Roman" w:hAnsi="Times New Roman" w:cs="Times New Roman"/>
+        </w:rPr>
+        <w:t xml:space="preserve"> ‘</w:t>
+      </w:r>
+      <w:r>
+        <w:rPr>
+          <w:rFonts w:ascii="Times New Roman" w:hAnsi="Times New Roman" w:cs="Times New Roman"/>
+        </w:rPr>
+        <w:t>StandardScaler()</w:t>
+      </w:r>
+      <w:r>
+        <w:rPr>
+          <w:rFonts w:ascii="Times New Roman" w:hAnsi="Times New Roman" w:cs="Times New Roman"/>
+        </w:rPr>
+        <w:t>’</w:t>
+      </w:r>
+      <w:r>
+        <w:rPr>
+          <w:rFonts w:ascii="Times New Roman" w:hAnsi="Times New Roman" w:cs="Times New Roman"/>
+        </w:rPr>
+        <w:t xml:space="preserve"> object was initialized and fitted to the training data. This transformation normalized the dataset to a mean of zero and a standard deviation of one, preventing high-scaled variables from dominating the objective function.</w:t>
+      </w:r>
+    </w:p>
+    <w:p>
+      <w:pPr>
+        <w:rPr>
+          <w:rFonts w:ascii="Times New Roman" w:hAnsi="Times New Roman" w:cs="Times New Roman"/>
+        </w:rPr>
+      </w:pPr>
+      <w:r>
+        <w:rPr>
+          <w:rFonts w:ascii="Times New Roman" w:hAnsi="Times New Roman" w:cs="Times New Roman"/>
+        </w:rPr>
+        <w:t>The system was then fitted using a LinearSVC model:</w:t>
       </w:r>
     </w:p>
     <w:p>
@@ -8226,21 +7845,7 @@
         <w:rPr>
           <w:rFonts w:ascii="Times New Roman" w:hAnsi="Times New Roman" w:cs="Times New Roman"/>
         </w:rPr>
-        <w:t xml:space="preserve">The implementation of the </w:t>
-      </w:r>
-      <w:proofErr w:type="spellStart"/>
-      <w:r>
-        <w:rPr>
-          <w:rFonts w:ascii="Times New Roman" w:hAnsi="Times New Roman" w:cs="Times New Roman"/>
-        </w:rPr>
-        <w:t>LinearSVC</w:t>
-      </w:r>
-      <w:proofErr w:type="spellEnd"/>
-      <w:r>
-        <w:rPr>
-          <w:rFonts w:ascii="Times New Roman" w:hAnsi="Times New Roman" w:cs="Times New Roman"/>
-        </w:rPr>
-        <w:t xml:space="preserve"> successfully processed the high-dimensional fabric features, converging efficiently and outputting the system’s core predictive insights with a validation accuracy of 89.68%.</w:t>
+        <w:t>The implementation of the LinearSVC successfully processed the high-dimensional fabric features, converging efficiently and outputting the system’s core predictive insights with a validation accuracy of 89.68%.</w:t>
       </w:r>
     </w:p>
     <w:p>
@@ -8317,68 +7922,26 @@
         <w:rPr>
           <w:rFonts w:ascii="Times New Roman" w:hAnsi="Times New Roman" w:cs="Times New Roman"/>
         </w:rPr>
-        <w:t xml:space="preserve"> (</w:t>
-      </w:r>
-      <w:proofErr w:type="spellStart"/>
-      <w:r>
-        <w:rPr>
-          <w:rFonts w:ascii="Times New Roman" w:hAnsi="Times New Roman" w:cs="Times New Roman"/>
-        </w:rPr>
-        <w:t>FastAPI</w:t>
-      </w:r>
-      <w:proofErr w:type="spellEnd"/>
-      <w:r>
-        <w:rPr>
-          <w:rFonts w:ascii="Times New Roman" w:hAnsi="Times New Roman" w:cs="Times New Roman"/>
-        </w:rPr>
-        <w:t>)</w:t>
-      </w:r>
-    </w:p>
-    <w:p>
-      <w:pPr>
-        <w:rPr>
-          <w:rFonts w:ascii="Times New Roman" w:hAnsi="Times New Roman" w:cs="Times New Roman"/>
-        </w:rPr>
-      </w:pPr>
-      <w:r>
-        <w:rPr>
-          <w:rFonts w:ascii="Times New Roman" w:hAnsi="Times New Roman" w:cs="Times New Roman"/>
-        </w:rPr>
-        <w:t xml:space="preserve">The backend was developed using </w:t>
-      </w:r>
-      <w:proofErr w:type="spellStart"/>
-      <w:r>
-        <w:rPr>
-          <w:rFonts w:ascii="Times New Roman" w:hAnsi="Times New Roman" w:cs="Times New Roman"/>
-        </w:rPr>
-        <w:t>FastAPI</w:t>
-      </w:r>
-      <w:proofErr w:type="spellEnd"/>
-      <w:r>
-        <w:rPr>
-          <w:rFonts w:ascii="Times New Roman" w:hAnsi="Times New Roman" w:cs="Times New Roman"/>
-        </w:rPr>
-        <w:t>, chosen for its asynchronous capabilities and native support for complex data validation. To maintain a clean</w:t>
-      </w:r>
-      <w:r>
-        <w:rPr>
-          <w:rFonts w:ascii="Times New Roman" w:hAnsi="Times New Roman" w:cs="Times New Roman"/>
-        </w:rPr>
-        <w:t>, maintainable codebase, the API was implemented using a modular routing pattern (</w:t>
-      </w:r>
-      <w:proofErr w:type="spellStart"/>
-      <w:r>
-        <w:rPr>
-          <w:rFonts w:ascii="Times New Roman" w:hAnsi="Times New Roman" w:cs="Times New Roman"/>
-        </w:rPr>
-        <w:t>APIRouter</w:t>
-      </w:r>
-      <w:proofErr w:type="spellEnd"/>
-      <w:r>
-        <w:rPr>
-          <w:rFonts w:ascii="Times New Roman" w:hAnsi="Times New Roman" w:cs="Times New Roman"/>
-        </w:rPr>
-        <w:t>). This allowed the system to separate logical concerns into dedicated scripts:</w:t>
+        <w:t xml:space="preserve"> (FastAPI)</w:t>
+      </w:r>
+    </w:p>
+    <w:p>
+      <w:pPr>
+        <w:rPr>
+          <w:rFonts w:ascii="Times New Roman" w:hAnsi="Times New Roman" w:cs="Times New Roman"/>
+        </w:rPr>
+      </w:pPr>
+      <w:r>
+        <w:rPr>
+          <w:rFonts w:ascii="Times New Roman" w:hAnsi="Times New Roman" w:cs="Times New Roman"/>
+        </w:rPr>
+        <w:t>The backend was developed using FastAPI, chosen for its asynchronous capabilities and native support for complex data validation. To maintain a clean</w:t>
+      </w:r>
+      <w:r>
+        <w:rPr>
+          <w:rFonts w:ascii="Times New Roman" w:hAnsi="Times New Roman" w:cs="Times New Roman"/>
+        </w:rPr>
+        <w:t>, maintainable codebase, the API was implemented using a modular routing pattern (APIRouter). This allowed the system to separate logical concerns into dedicated scripts:</w:t>
       </w:r>
     </w:p>
     <w:p>
@@ -8484,21 +8047,7 @@
         <w:rPr>
           <w:rFonts w:ascii="Times New Roman" w:hAnsi="Times New Roman" w:cs="Times New Roman"/>
         </w:rPr>
-        <w:t xml:space="preserve">To protect the fashion analytics, a strict security layer was implemented. Unlike basic dashboards, the </w:t>
-      </w:r>
-      <w:proofErr w:type="spellStart"/>
-      <w:r>
-        <w:rPr>
-          <w:rFonts w:ascii="Times New Roman" w:hAnsi="Times New Roman" w:cs="Times New Roman"/>
-        </w:rPr>
-        <w:t>HoL</w:t>
-      </w:r>
-      <w:proofErr w:type="spellEnd"/>
-      <w:r>
-        <w:rPr>
-          <w:rFonts w:ascii="Times New Roman" w:hAnsi="Times New Roman" w:cs="Times New Roman"/>
-        </w:rPr>
-        <w:t xml:space="preserve"> system utilizes JSON Web Tokens (JWT) for stateless authentication.</w:t>
+        <w:t>To protect the fashion analytics, a strict security layer was implemented. Unlike basic dashboards, the HoL system utilizes JSON Web Tokens (JWT) for stateless authentication.</w:t>
       </w:r>
     </w:p>
     <w:p>
@@ -8530,14 +8079,12 @@
         </w:rPr>
         <w:t>‘</w:t>
       </w:r>
-      <w:proofErr w:type="spellStart"/>
       <w:r>
         <w:rPr>
           <w:rFonts w:ascii="Times New Roman" w:hAnsi="Times New Roman" w:cs="Times New Roman"/>
         </w:rPr>
         <w:t>passlib</w:t>
       </w:r>
-      <w:proofErr w:type="spellEnd"/>
       <w:r>
         <w:rPr>
           <w:rFonts w:ascii="Times New Roman" w:hAnsi="Times New Roman" w:cs="Times New Roman"/>
@@ -8556,14 +8103,12 @@
         </w:rPr>
         <w:t>‘</w:t>
       </w:r>
-      <w:proofErr w:type="spellStart"/>
       <w:r>
         <w:rPr>
           <w:rFonts w:ascii="Times New Roman" w:hAnsi="Times New Roman" w:cs="Times New Roman"/>
         </w:rPr>
         <w:t>bcrypt</w:t>
       </w:r>
-      <w:proofErr w:type="spellEnd"/>
       <w:r>
         <w:rPr>
           <w:rFonts w:ascii="Times New Roman" w:hAnsi="Times New Roman" w:cs="Times New Roman"/>
@@ -8592,21 +8137,7 @@
         <w:rPr>
           <w:rFonts w:ascii="Times New Roman" w:hAnsi="Times New Roman" w:cs="Times New Roman"/>
         </w:rPr>
-        <w:t>Token Generation: Upon a successful login, the system utilizes the ‘</w:t>
-      </w:r>
-      <w:proofErr w:type="spellStart"/>
-      <w:r>
-        <w:rPr>
-          <w:rFonts w:ascii="Times New Roman" w:hAnsi="Times New Roman" w:cs="Times New Roman"/>
-        </w:rPr>
-        <w:t>jose</w:t>
-      </w:r>
-      <w:proofErr w:type="spellEnd"/>
-      <w:r>
-        <w:rPr>
-          <w:rFonts w:ascii="Times New Roman" w:hAnsi="Times New Roman" w:cs="Times New Roman"/>
-        </w:rPr>
-        <w:t>’ library to generate a signed JWT. This token is then required for the frontend to access protected data routers, ensuring that only authorized users can view the full LFW 2025 analysis.</w:t>
+        <w:t>Token Generation: Upon a successful login, the system utilizes the ‘jose’ library to generate a signed JWT. This token is then required for the frontend to access protected data routers, ensuring that only authorized users can view the full LFW 2025 analysis.</w:t>
       </w:r>
     </w:p>
     <w:p>
@@ -8657,43 +8188,7 @@
         <w:rPr>
           <w:rFonts w:ascii="Times New Roman" w:hAnsi="Times New Roman" w:cs="Times New Roman"/>
         </w:rPr>
-        <w:t>Asynchronous API Service: Using the ‘</w:t>
-      </w:r>
-      <w:proofErr w:type="spellStart"/>
-      <w:r>
-        <w:rPr>
-          <w:rFonts w:ascii="Times New Roman" w:hAnsi="Times New Roman" w:cs="Times New Roman"/>
-        </w:rPr>
-        <w:t>axios</w:t>
-      </w:r>
-      <w:proofErr w:type="spellEnd"/>
-      <w:proofErr w:type="gramStart"/>
-      <w:r>
-        <w:rPr>
-          <w:rFonts w:ascii="Times New Roman" w:hAnsi="Times New Roman" w:cs="Times New Roman"/>
-        </w:rPr>
-        <w:t>’  library</w:t>
-      </w:r>
-      <w:proofErr w:type="gramEnd"/>
-      <w:r>
-        <w:rPr>
-          <w:rFonts w:ascii="Times New Roman" w:hAnsi="Times New Roman" w:cs="Times New Roman"/>
-        </w:rPr>
-        <w:t xml:space="preserve">, the frontend communicates with the </w:t>
-      </w:r>
-      <w:proofErr w:type="spellStart"/>
-      <w:r>
-        <w:rPr>
-          <w:rFonts w:ascii="Times New Roman" w:hAnsi="Times New Roman" w:cs="Times New Roman"/>
-        </w:rPr>
-        <w:t>FastAPI</w:t>
-      </w:r>
-      <w:proofErr w:type="spellEnd"/>
-      <w:r>
-        <w:rPr>
-          <w:rFonts w:ascii="Times New Roman" w:hAnsi="Times New Roman" w:cs="Times New Roman"/>
-        </w:rPr>
-        <w:t xml:space="preserve"> backend. It was programmed to handle loading and error states, ensuring the UI remains stable even during network latencies.</w:t>
+        <w:t>Asynchronous API Service: Using the ‘axios’ library, the frontend communicates with the FastAPI backend. It was programmed to handle loading and error states, ensuring the UI remains stable even during network latencies.</w:t>
       </w:r>
     </w:p>
     <w:p>
@@ -8711,77 +8206,31 @@
         <w:rPr>
           <w:rFonts w:ascii="Times New Roman" w:hAnsi="Times New Roman" w:cs="Times New Roman"/>
         </w:rPr>
-        <w:t xml:space="preserve">Component Logics: These components use </w:t>
-      </w:r>
-      <w:proofErr w:type="spellStart"/>
-      <w:r>
-        <w:rPr>
-          <w:rFonts w:ascii="Times New Roman" w:hAnsi="Times New Roman" w:cs="Times New Roman"/>
-        </w:rPr>
-        <w:t>React’s</w:t>
-      </w:r>
-      <w:proofErr w:type="spellEnd"/>
-      <w:r>
-        <w:rPr>
-          <w:rFonts w:ascii="Times New Roman" w:hAnsi="Times New Roman" w:cs="Times New Roman"/>
-        </w:rPr>
-        <w:t xml:space="preserve"> ‘</w:t>
-      </w:r>
-      <w:proofErr w:type="spellStart"/>
-      <w:r>
-        <w:rPr>
-          <w:rFonts w:ascii="Times New Roman" w:hAnsi="Times New Roman" w:cs="Times New Roman"/>
-        </w:rPr>
-        <w:t>useEffect</w:t>
-      </w:r>
-      <w:proofErr w:type="spellEnd"/>
-      <w:r>
-        <w:rPr>
-          <w:rFonts w:ascii="Times New Roman" w:hAnsi="Times New Roman" w:cs="Times New Roman"/>
-        </w:rPr>
-        <w:t>’ and ‘</w:t>
-      </w:r>
-      <w:proofErr w:type="spellStart"/>
-      <w:r>
-        <w:rPr>
-          <w:rFonts w:ascii="Times New Roman" w:hAnsi="Times New Roman" w:cs="Times New Roman"/>
-        </w:rPr>
-        <w:t>useState</w:t>
-      </w:r>
-      <w:proofErr w:type="spellEnd"/>
-      <w:r>
-        <w:rPr>
-          <w:rFonts w:ascii="Times New Roman" w:hAnsi="Times New Roman" w:cs="Times New Roman"/>
-        </w:rPr>
-        <w:t xml:space="preserve">’ hooks to trigger API calls on the page load, dynamically rendering the analytical data through the </w:t>
-      </w:r>
-      <w:proofErr w:type="spellStart"/>
-      <w:r>
-        <w:rPr>
-          <w:rFonts w:ascii="Times New Roman" w:hAnsi="Times New Roman" w:cs="Times New Roman"/>
-        </w:rPr>
-        <w:t>ColourCharts</w:t>
-      </w:r>
-      <w:proofErr w:type="spellEnd"/>
-      <w:r>
-        <w:rPr>
-          <w:rFonts w:ascii="Times New Roman" w:hAnsi="Times New Roman" w:cs="Times New Roman"/>
-        </w:rPr>
-        <w:t xml:space="preserve"> and </w:t>
-      </w:r>
-      <w:proofErr w:type="spellStart"/>
-      <w:r>
-        <w:rPr>
-          <w:rFonts w:ascii="Times New Roman" w:hAnsi="Times New Roman" w:cs="Times New Roman"/>
-        </w:rPr>
-        <w:t>FabricCharts</w:t>
-      </w:r>
-      <w:proofErr w:type="spellEnd"/>
-      <w:r>
-        <w:rPr>
-          <w:rFonts w:ascii="Times New Roman" w:hAnsi="Times New Roman" w:cs="Times New Roman"/>
-        </w:rPr>
-        <w:t xml:space="preserve"> components.</w:t>
+        <w:t>Component Logics: These components use React’s ‘useEffect’ and ‘useState’ hooks to trigger API calls on the page load, dynamically rendering the analytical data through the Colour</w:t>
+      </w:r>
+      <w:r>
+        <w:rPr>
+          <w:rFonts w:ascii="Times New Roman" w:hAnsi="Times New Roman" w:cs="Times New Roman"/>
+        </w:rPr>
+        <w:t xml:space="preserve"> </w:t>
+      </w:r>
+      <w:r>
+        <w:rPr>
+          <w:rFonts w:ascii="Times New Roman" w:hAnsi="Times New Roman" w:cs="Times New Roman"/>
+        </w:rPr>
+        <w:t>Charts and Fabric</w:t>
+      </w:r>
+      <w:r>
+        <w:rPr>
+          <w:rFonts w:ascii="Times New Roman" w:hAnsi="Times New Roman" w:cs="Times New Roman"/>
+        </w:rPr>
+        <w:t xml:space="preserve"> </w:t>
+      </w:r>
+      <w:r>
+        <w:rPr>
+          <w:rFonts w:ascii="Times New Roman" w:hAnsi="Times New Roman" w:cs="Times New Roman"/>
+        </w:rPr>
+        <w:t>Charts components.</w:t>
       </w:r>
     </w:p>
     <w:p>
@@ -8799,21 +8248,7 @@
         <w:rPr>
           <w:rFonts w:ascii="Times New Roman" w:hAnsi="Times New Roman" w:cs="Times New Roman"/>
         </w:rPr>
-        <w:t xml:space="preserve">Dynamic Image Gallery: To provide a lookbook experience, a dynamic slideshow was introduced. This component programmatically cycles through the images fetched from the </w:t>
-      </w:r>
-      <w:proofErr w:type="spellStart"/>
-      <w:r>
-        <w:rPr>
-          <w:rFonts w:ascii="Times New Roman" w:hAnsi="Times New Roman" w:cs="Times New Roman"/>
-        </w:rPr>
-        <w:t>FastAPI</w:t>
-      </w:r>
-      <w:proofErr w:type="spellEnd"/>
-      <w:r>
-        <w:rPr>
-          <w:rFonts w:ascii="Times New Roman" w:hAnsi="Times New Roman" w:cs="Times New Roman"/>
-        </w:rPr>
-        <w:t xml:space="preserve"> ‘/images’ mount, providing a seamless visual overview of each brand’s collection.</w:t>
+        <w:t>Dynamic Image Gallery: To provide a lookbook experience, a dynamic slideshow was introduced. This component programmatically cycles through the images fetched from the FastAPI ‘/images’ mount, providing a seamless visual overview of each brand’s collection.</w:t>
       </w:r>
     </w:p>
     <w:p>
@@ -8858,12 +8293,6 @@
           <w:rFonts w:ascii="Times New Roman" w:hAnsi="Times New Roman" w:cs="Times New Roman"/>
         </w:rPr>
       </w:pPr>
-      <w:r>
-        <w:rPr>
-          <w:rFonts w:ascii="Times New Roman" w:hAnsi="Times New Roman" w:cs="Times New Roman"/>
-        </w:rPr>
-        <w:t>4.6 Implementation Challenges</w:t>
-      </w:r>
     </w:p>
     <w:p>
       <w:pPr>
@@ -8888,43 +8317,22 @@
         <w:rPr>
           <w:rFonts w:ascii="Times New Roman" w:hAnsi="Times New Roman" w:cs="Times New Roman"/>
         </w:rPr>
-        <w:t>The implementation phase successfully translated the theoretical design of the House of Lasgidi (</w:t>
-      </w:r>
-      <w:proofErr w:type="spellStart"/>
-      <w:r>
-        <w:rPr>
-          <w:rFonts w:ascii="Times New Roman" w:hAnsi="Times New Roman" w:cs="Times New Roman"/>
-        </w:rPr>
-        <w:t>HoL</w:t>
-      </w:r>
-      <w:proofErr w:type="spellEnd"/>
-      <w:r>
-        <w:rPr>
-          <w:rFonts w:ascii="Times New Roman" w:hAnsi="Times New Roman" w:cs="Times New Roman"/>
-        </w:rPr>
-        <w:t xml:space="preserve">) system into a functional, end-to-end application. By combining high-accuracy </w:t>
+        <w:t xml:space="preserve">The implementation phase successfully translated the theoretical design of the House of Lasgidi (HoL) system into a functional, end-to-end application. By combining high-accuracy </w:t>
       </w:r>
       <w:r>
         <w:rPr>
           <w:rFonts w:ascii="Times New Roman" w:hAnsi="Times New Roman" w:cs="Times New Roman"/>
         </w:rPr>
         <w:lastRenderedPageBreak/>
-        <w:t>machine learning (SVM/K-Means) with a modern full-stack environment (</w:t>
-      </w:r>
-      <w:proofErr w:type="spellStart"/>
-      <w:r>
-        <w:rPr>
-          <w:rFonts w:ascii="Times New Roman" w:hAnsi="Times New Roman" w:cs="Times New Roman"/>
-        </w:rPr>
-        <w:t>FastAPI</w:t>
-      </w:r>
-      <w:proofErr w:type="spellEnd"/>
-      <w:r>
-        <w:rPr>
-          <w:rFonts w:ascii="Times New Roman" w:hAnsi="Times New Roman" w:cs="Times New Roman"/>
-        </w:rPr>
-        <w:t>/React), the system provides a strong platform for fashion trend analysis. The code is modular, secure, and prepared for the final Testing and Evaluation phase.</w:t>
-      </w:r>
+        <w:t>machine learning (SVM/K-Means) with a modern full-stack environment (FastAPI/React), the system provides a strong platform for fashion trend analysis. The code is modular, secure, and prepared for the final Testing and Evaluation phase.</w:t>
+      </w:r>
+    </w:p>
+    <w:p>
+      <w:pPr>
+        <w:rPr>
+          <w:rFonts w:ascii="Times New Roman" w:hAnsi="Times New Roman" w:cs="Times New Roman"/>
+        </w:rPr>
+      </w:pPr>
     </w:p>
     <w:p>
       <w:pPr>
@@ -8955,34 +8363,320 @@
         <w:rPr>
           <w:rFonts w:ascii="Times New Roman" w:hAnsi="Times New Roman" w:cs="Times New Roman"/>
         </w:rPr>
-        <w:t>5.1 System Walkthrough</w:t>
-      </w:r>
-    </w:p>
-    <w:p>
-      <w:pPr>
-        <w:rPr>
-          <w:rFonts w:ascii="Times New Roman" w:hAnsi="Times New Roman" w:cs="Times New Roman"/>
-        </w:rPr>
-      </w:pPr>
-      <w:r>
-        <w:rPr>
-          <w:rFonts w:ascii="Times New Roman" w:hAnsi="Times New Roman" w:cs="Times New Roman"/>
-        </w:rPr>
-        <w:t>The House of Lasgidi (</w:t>
-      </w:r>
-      <w:proofErr w:type="spellStart"/>
-      <w:r>
-        <w:rPr>
-          <w:rFonts w:ascii="Times New Roman" w:hAnsi="Times New Roman" w:cs="Times New Roman"/>
-        </w:rPr>
-        <w:t>HoL</w:t>
-      </w:r>
-      <w:proofErr w:type="spellEnd"/>
-      <w:r>
-        <w:rPr>
-          <w:rFonts w:ascii="Times New Roman" w:hAnsi="Times New Roman" w:cs="Times New Roman"/>
-        </w:rPr>
-        <w:t>) dashboard is designed to provide a seamless, intuitive experience for fashion analysts, moving from high-level event metrics to granular brand insights.</w:t>
+        <w:t>The House of Lasgidi (HoL) dashboard is designed to provide a seamless, intuitive experience for fashion analysts, moving from high-level event metrics to granular brand insights.</w:t>
+      </w:r>
+    </w:p>
+    <w:p>
+      <w:pPr>
+        <w:rPr>
+          <w:rFonts w:ascii="Times New Roman" w:hAnsi="Times New Roman" w:cs="Times New Roman"/>
+        </w:rPr>
+      </w:pPr>
+    </w:p>
+    <w:p>
+      <w:pPr>
+        <w:rPr>
+          <w:rFonts w:ascii="Times New Roman" w:hAnsi="Times New Roman" w:cs="Times New Roman"/>
+        </w:rPr>
+      </w:pPr>
+      <w:r>
+        <w:rPr>
+          <w:rFonts w:ascii="Times New Roman" w:hAnsi="Times New Roman" w:cs="Times New Roman"/>
+        </w:rPr>
+        <w:t>5.1 User Authentication and Secure Entry</w:t>
+      </w:r>
+    </w:p>
+    <w:p>
+      <w:pPr>
+        <w:rPr>
+          <w:rFonts w:ascii="Times New Roman" w:hAnsi="Times New Roman" w:cs="Times New Roman"/>
+        </w:rPr>
+      </w:pPr>
+      <w:r>
+        <w:rPr>
+          <w:rFonts w:ascii="Times New Roman" w:hAnsi="Times New Roman" w:cs="Times New Roman"/>
+        </w:rPr>
+        <w:t>The user journey begins at the login interface. The system implements a secure gateway where credentials are encrypted using the ‘bcrypt’ algorithm within the User script in the backend. Upon successful verification, the FastAPI server issues a JSON Web Token (JWT), which the frontend’s authentication service script stores in ‘localStorage’ to authorize subsequent data requests.</w:t>
+      </w:r>
+    </w:p>
+    <w:p>
+      <w:pPr>
+        <w:rPr>
+          <w:rFonts w:ascii="Times New Roman" w:hAnsi="Times New Roman" w:cs="Times New Roman"/>
+        </w:rPr>
+      </w:pPr>
+    </w:p>
+    <w:p>
+      <w:pPr>
+        <w:rPr>
+          <w:rFonts w:ascii="Times New Roman" w:hAnsi="Times New Roman" w:cs="Times New Roman"/>
+        </w:rPr>
+      </w:pPr>
+      <w:r>
+        <w:rPr>
+          <w:rFonts w:ascii="Times New Roman" w:hAnsi="Times New Roman" w:cs="Times New Roman"/>
+        </w:rPr>
+        <w:t>5.2 Overview Analysis (Dashboard Home)</w:t>
+      </w:r>
+    </w:p>
+    <w:p>
+      <w:pPr>
+        <w:rPr>
+          <w:rFonts w:ascii="Times New Roman" w:hAnsi="Times New Roman" w:cs="Times New Roman"/>
+        </w:rPr>
+      </w:pPr>
+      <w:r>
+        <w:rPr>
+          <w:rFonts w:ascii="Times New Roman" w:hAnsi="Times New Roman" w:cs="Times New Roman"/>
+        </w:rPr>
+        <w:t xml:space="preserve">Post login, the user is routed to the Overview page. This fetches the global Lagos Fashion Week 2025 data, instantly rendering the </w:t>
+      </w:r>
+      <w:r>
+        <w:rPr>
+          <w:rFonts w:ascii="Times New Roman" w:hAnsi="Times New Roman" w:cs="Times New Roman"/>
+        </w:rPr>
+        <w:t>colour charts component, a Pie Chart and Bar Chart, using the ‘Recharts’ library, displaying the dominant hues across all runway shows. The Fabric Charts component visualized the percentage of the textiles detected across the entire event.</w:t>
+      </w:r>
+    </w:p>
+    <w:p>
+      <w:pPr>
+        <w:rPr>
+          <w:rFonts w:ascii="Times New Roman" w:hAnsi="Times New Roman" w:cs="Times New Roman"/>
+        </w:rPr>
+      </w:pPr>
+    </w:p>
+    <w:p>
+      <w:pPr>
+        <w:rPr>
+          <w:rFonts w:ascii="Times New Roman" w:hAnsi="Times New Roman" w:cs="Times New Roman"/>
+        </w:rPr>
+      </w:pPr>
+      <w:r>
+        <w:rPr>
+          <w:rFonts w:ascii="Times New Roman" w:hAnsi="Times New Roman" w:cs="Times New Roman"/>
+        </w:rPr>
+        <w:t>5.3 Brand-Specific Analysis</w:t>
+      </w:r>
+    </w:p>
+    <w:p>
+      <w:pPr>
+        <w:rPr>
+          <w:rFonts w:ascii="Times New Roman" w:hAnsi="Times New Roman" w:cs="Times New Roman"/>
+        </w:rPr>
+      </w:pPr>
+      <w:r>
+        <w:rPr>
+          <w:rFonts w:ascii="Times New Roman" w:hAnsi="Times New Roman" w:cs="Times New Roman"/>
+        </w:rPr>
+        <w:t>The user can navigate to the Brand Analysis page. Using the custom Brand Selector, they can filter by specific designers</w:t>
+      </w:r>
+      <w:r>
+        <w:rPr>
+          <w:rFonts w:ascii="Times New Roman" w:hAnsi="Times New Roman" w:cs="Times New Roman"/>
+        </w:rPr>
+        <w:t xml:space="preserve"> like </w:t>
+      </w:r>
+      <w:r>
+        <w:rPr>
+          <w:rFonts w:ascii="Times New Roman" w:hAnsi="Times New Roman" w:cs="Times New Roman"/>
+        </w:rPr>
+        <w:t>Babayo</w:t>
+      </w:r>
+      <w:r>
+        <w:rPr>
+          <w:rFonts w:ascii="Times New Roman" w:hAnsi="Times New Roman" w:cs="Times New Roman"/>
+        </w:rPr>
+        <w:t xml:space="preserve"> or </w:t>
+      </w:r>
+      <w:r>
+        <w:rPr>
+          <w:rFonts w:ascii="Times New Roman" w:hAnsi="Times New Roman" w:cs="Times New Roman"/>
+        </w:rPr>
+        <w:t>Fruche</w:t>
+      </w:r>
+      <w:r>
+        <w:rPr>
+          <w:rFonts w:ascii="Times New Roman" w:hAnsi="Times New Roman" w:cs="Times New Roman"/>
+        </w:rPr>
+        <w:t xml:space="preserve">. The dashboard dynamically updates without the page reloading, to display the brand’s specific </w:t>
+      </w:r>
+      <w:r>
+        <w:rPr>
+          <w:rFonts w:ascii="Times New Roman" w:hAnsi="Times New Roman" w:cs="Times New Roman"/>
+        </w:rPr>
+        <w:t xml:space="preserve">colour </w:t>
+      </w:r>
+      <w:r>
+        <w:rPr>
+          <w:rFonts w:ascii="Times New Roman" w:hAnsi="Times New Roman" w:cs="Times New Roman"/>
+        </w:rPr>
+        <w:t>charts,</w:t>
+      </w:r>
+      <w:r>
+        <w:rPr>
+          <w:rFonts w:ascii="Times New Roman" w:hAnsi="Times New Roman" w:cs="Times New Roman"/>
+        </w:rPr>
+        <w:t xml:space="preserve"> an</w:t>
+      </w:r>
+      <w:r>
+        <w:rPr>
+          <w:rFonts w:ascii="Times New Roman" w:hAnsi="Times New Roman" w:cs="Times New Roman"/>
+        </w:rPr>
+        <w:t xml:space="preserve"> automated image gallery</w:t>
+      </w:r>
+      <w:r>
+        <w:rPr>
+          <w:rFonts w:ascii="Times New Roman" w:hAnsi="Times New Roman" w:cs="Times New Roman"/>
+        </w:rPr>
+        <w:t xml:space="preserve"> fetched directly from the FastAPI static mount</w:t>
+      </w:r>
+      <w:r>
+        <w:rPr>
+          <w:rFonts w:ascii="Times New Roman" w:hAnsi="Times New Roman" w:cs="Times New Roman"/>
+        </w:rPr>
+        <w:t>, and fabric insights</w:t>
+      </w:r>
+      <w:r>
+        <w:rPr>
+          <w:rFonts w:ascii="Times New Roman" w:hAnsi="Times New Roman" w:cs="Times New Roman"/>
+        </w:rPr>
+        <w:t>, which provides a textual summary of whether a brand utilized a certain fabric, adding a layer of cultural context to the numerical data</w:t>
+      </w:r>
+      <w:r>
+        <w:rPr>
+          <w:rFonts w:ascii="Times New Roman" w:hAnsi="Times New Roman" w:cs="Times New Roman"/>
+        </w:rPr>
+        <w:t>.</w:t>
+      </w:r>
+    </w:p>
+    <w:p>
+      <w:pPr>
+        <w:rPr>
+          <w:rFonts w:ascii="Times New Roman" w:hAnsi="Times New Roman" w:cs="Times New Roman"/>
+        </w:rPr>
+      </w:pPr>
+    </w:p>
+    <w:p>
+      <w:pPr>
+        <w:rPr>
+          <w:rFonts w:ascii="Times New Roman" w:hAnsi="Times New Roman" w:cs="Times New Roman"/>
+        </w:rPr>
+      </w:pPr>
+      <w:r>
+        <w:rPr>
+          <w:rFonts w:ascii="Times New Roman" w:hAnsi="Times New Roman" w:cs="Times New Roman"/>
+        </w:rPr>
+        <w:t>6 TESTING AND EVALUATION</w:t>
+      </w:r>
+    </w:p>
+    <w:p>
+      <w:pPr>
+        <w:rPr>
+          <w:rFonts w:ascii="Times New Roman" w:hAnsi="Times New Roman" w:cs="Times New Roman"/>
+        </w:rPr>
+      </w:pPr>
+      <w:r>
+        <w:rPr>
+          <w:rFonts w:ascii="Times New Roman" w:hAnsi="Times New Roman" w:cs="Times New Roman"/>
+        </w:rPr>
+        <w:t>6.1 Backend API Testing</w:t>
+      </w:r>
+    </w:p>
+    <w:p>
+      <w:pPr>
+        <w:rPr>
+          <w:rFonts w:ascii="Times New Roman" w:hAnsi="Times New Roman" w:cs="Times New Roman"/>
+        </w:rPr>
+      </w:pPr>
+      <w:r>
+        <w:rPr>
+          <w:rFonts w:ascii="Times New Roman" w:hAnsi="Times New Roman" w:cs="Times New Roman"/>
+        </w:rPr>
+        <w:lastRenderedPageBreak/>
+        <w:t xml:space="preserve">The FastAPI backend was subjected to black-box testing using the interactive Swagger UI (/docs). Routes such as ‘/analysis/overview/colours’ and ‘/analysis/brand/{brand}/fabrics’ were tested for response accuracy. </w:t>
+      </w:r>
+    </w:p>
+    <w:p>
+      <w:pPr>
+        <w:rPr>
+          <w:rFonts w:ascii="Times New Roman" w:hAnsi="Times New Roman" w:cs="Times New Roman"/>
+        </w:rPr>
+      </w:pPr>
+      <w:r>
+        <w:rPr>
+          <w:rFonts w:ascii="Times New Roman" w:hAnsi="Times New Roman" w:cs="Times New Roman"/>
+        </w:rPr>
+        <w:t>Attempts to access data routes without a valid JWT token were successfully blocked with a ‘401 Unauthorized’ status, verifying the strength of the Users script’s security logic.</w:t>
+      </w:r>
+    </w:p>
+    <w:p>
+      <w:pPr>
+        <w:rPr>
+          <w:rFonts w:ascii="Times New Roman" w:hAnsi="Times New Roman" w:cs="Times New Roman"/>
+        </w:rPr>
+      </w:pPr>
+      <w:r>
+        <w:rPr>
+          <w:rFonts w:ascii="Times New Roman" w:hAnsi="Times New Roman" w:cs="Times New Roman"/>
+        </w:rPr>
+        <w:t>6.2 Machine Learning Model Evaluation</w:t>
+      </w:r>
+    </w:p>
+    <w:p>
+      <w:pPr>
+        <w:rPr>
+          <w:rFonts w:ascii="Times New Roman" w:hAnsi="Times New Roman" w:cs="Times New Roman"/>
+        </w:rPr>
+      </w:pPr>
+      <w:r>
+        <w:rPr>
+          <w:rFonts w:ascii="Times New Roman" w:hAnsi="Times New Roman" w:cs="Times New Roman"/>
+        </w:rPr>
+        <w:t>The core of the system’s value lies in its classification accuracy. As noted in the Fabric Insights component script, the Linear SVM classifier achieved a tested accuracy of 89.68% in identifying textile profiles. The clustering algorithm was evaluated by comparing its hex-code outputs against the original runway images. The Colour Charts script is mapped with human-readable names (e.g., “Red”) to the identified clusters with high visual fidelity.</w:t>
+      </w:r>
+    </w:p>
+    <w:p>
+      <w:pPr>
+        <w:rPr>
+          <w:rFonts w:ascii="Times New Roman" w:hAnsi="Times New Roman" w:cs="Times New Roman"/>
+        </w:rPr>
+      </w:pPr>
+      <w:r>
+        <w:rPr>
+          <w:rFonts w:ascii="Times New Roman" w:hAnsi="Times New Roman" w:cs="Times New Roman"/>
+        </w:rPr>
+        <w:t>6.3 Frontend Integration and Responsive Design</w:t>
+      </w:r>
+    </w:p>
+    <w:p>
+      <w:pPr>
+        <w:rPr>
+          <w:rFonts w:ascii="Times New Roman" w:hAnsi="Times New Roman" w:cs="Times New Roman"/>
+        </w:rPr>
+      </w:pPr>
+      <w:r>
+        <w:rPr>
+          <w:rFonts w:ascii="Times New Roman" w:hAnsi="Times New Roman" w:cs="Times New Roman"/>
+        </w:rPr>
+        <w:t xml:space="preserve">The </w:t>
+      </w:r>
+      <w:r>
+        <w:rPr>
+          <w:rFonts w:ascii="Times New Roman" w:hAnsi="Times New Roman" w:cs="Times New Roman"/>
+        </w:rPr>
+        <w:t>React</w:t>
+      </w:r>
+      <w:r>
+        <w:rPr>
+          <w:rFonts w:ascii="Times New Roman" w:hAnsi="Times New Roman" w:cs="Times New Roman"/>
+        </w:rPr>
+        <w:t xml:space="preserve"> frontend was tested for </w:t>
+      </w:r>
+      <w:r>
+        <w:rPr>
+          <w:rFonts w:ascii="Times New Roman" w:hAnsi="Times New Roman" w:cs="Times New Roman"/>
+        </w:rPr>
+        <w:t>state management and UI responsiveness:</w:t>
       </w:r>
     </w:p>
     <w:p>
@@ -8990,7 +8684,7 @@
         <w:pStyle w:val="ListParagraph"/>
         <w:numPr>
           <w:ilvl w:val="0"/>
-          <w:numId w:val="15"/>
+          <w:numId w:val="18"/>
         </w:numPr>
         <w:rPr>
           <w:rFonts w:ascii="Times New Roman" w:hAnsi="Times New Roman" w:cs="Times New Roman"/>
@@ -9000,21 +8694,7 @@
         <w:rPr>
           <w:rFonts w:ascii="Times New Roman" w:hAnsi="Times New Roman" w:cs="Times New Roman"/>
         </w:rPr>
-        <w:t xml:space="preserve">Authentication phase: The user arrives at the portal and is presented with the login component. Upon entering valid credentials, the </w:t>
-      </w:r>
-      <w:proofErr w:type="spellStart"/>
-      <w:r>
-        <w:rPr>
-          <w:rFonts w:ascii="Times New Roman" w:hAnsi="Times New Roman" w:cs="Times New Roman"/>
-        </w:rPr>
-        <w:t>FastAPI</w:t>
-      </w:r>
-      <w:proofErr w:type="spellEnd"/>
-      <w:r>
-        <w:rPr>
-          <w:rFonts w:ascii="Times New Roman" w:hAnsi="Times New Roman" w:cs="Times New Roman"/>
-        </w:rPr>
-        <w:t xml:space="preserve"> backend verifies the hashed password and issues a secure JWT, granting access to the protected routes.</w:t>
+        <w:t>Asynchronous Handling: the API script was tested to ensure that Loading states were displayed correctly while ‘axios’ fetched large JSON payloads from the backend.</w:t>
       </w:r>
     </w:p>
     <w:p>
@@ -9022,7 +8702,7 @@
         <w:pStyle w:val="ListParagraph"/>
         <w:numPr>
           <w:ilvl w:val="0"/>
-          <w:numId w:val="15"/>
+          <w:numId w:val="18"/>
         </w:numPr>
         <w:rPr>
           <w:rFonts w:ascii="Times New Roman" w:hAnsi="Times New Roman" w:cs="Times New Roman"/>
@@ -9032,7 +8712,45 @@
         <w:rPr>
           <w:rFonts w:ascii="Times New Roman" w:hAnsi="Times New Roman" w:cs="Times New Roman"/>
         </w:rPr>
-        <w:t>The Overview Analysis: Post login, the user is routed to the Overview page. This fetches the global Lagos Fashion Week 2025 data, instantly rendering the overall colour palettes and fabric distributions via Recharts, providing immediate insights into the season’s trends.</w:t>
+        <w:t>Cross-Component Sync: We verified that selecting a new designer in the Brand Selector triggered a synchronized update across the Colour Palette, Fabric Charts, and Insights components without a full</w:t>
+      </w:r>
+      <w:r>
+        <w:rPr>
+          <w:rFonts w:ascii="Times New Roman" w:hAnsi="Times New Roman" w:cs="Times New Roman"/>
+        </w:rPr>
+        <w:t>-</w:t>
+      </w:r>
+      <w:r>
+        <w:rPr>
+          <w:rFonts w:ascii="Times New Roman" w:hAnsi="Times New Roman" w:cs="Times New Roman"/>
+        </w:rPr>
+        <w:t>page refresh.</w:t>
+      </w:r>
+    </w:p>
+    <w:p>
+      <w:pPr>
+        <w:rPr>
+          <w:rFonts w:ascii="Times New Roman" w:hAnsi="Times New Roman" w:cs="Times New Roman"/>
+        </w:rPr>
+      </w:pPr>
+      <w:r>
+        <w:rPr>
+          <w:rFonts w:ascii="Times New Roman" w:hAnsi="Times New Roman" w:cs="Times New Roman"/>
+        </w:rPr>
+        <w:t>6.4 Critical Evaluation and Limitations</w:t>
+      </w:r>
+    </w:p>
+    <w:p>
+      <w:pPr>
+        <w:rPr>
+          <w:rFonts w:ascii="Times New Roman" w:hAnsi="Times New Roman" w:cs="Times New Roman"/>
+        </w:rPr>
+      </w:pPr>
+      <w:r>
+        <w:rPr>
+          <w:rFonts w:ascii="Times New Roman" w:hAnsi="Times New Roman" w:cs="Times New Roman"/>
+        </w:rPr>
+        <w:t>While the system is highly performant, certain limitations were found:</w:t>
       </w:r>
     </w:p>
     <w:p>
@@ -9040,7 +8758,7 @@
         <w:pStyle w:val="ListParagraph"/>
         <w:numPr>
           <w:ilvl w:val="0"/>
-          <w:numId w:val="15"/>
+          <w:numId w:val="17"/>
         </w:numPr>
         <w:rPr>
           <w:rFonts w:ascii="Times New Roman" w:hAnsi="Times New Roman" w:cs="Times New Roman"/>
@@ -9050,75 +8768,39 @@
         <w:rPr>
           <w:rFonts w:ascii="Times New Roman" w:hAnsi="Times New Roman" w:cs="Times New Roman"/>
         </w:rPr>
-        <w:t>Brand-Specific Analysis: The user can navigate to the Brand Analysis page. Using the custom Brand Selector, they can filter by specific designers. The dashboard dynamically updates without the page reloading, to display the brand’s specific charts, automated image gallery, and fabric insights</w:t>
-      </w:r>
-      <w:r>
-        <w:rPr>
-          <w:rFonts w:ascii="Times New Roman" w:hAnsi="Times New Roman" w:cs="Times New Roman"/>
-        </w:rPr>
-        <w:t>.</w:t>
-      </w:r>
-    </w:p>
-    <w:p>
-      <w:pPr>
-        <w:rPr>
-          <w:rFonts w:ascii="Times New Roman" w:hAnsi="Times New Roman" w:cs="Times New Roman"/>
-        </w:rPr>
-      </w:pPr>
-    </w:p>
-    <w:p>
-      <w:pPr>
-        <w:rPr>
-          <w:rFonts w:ascii="Times New Roman" w:hAnsi="Times New Roman" w:cs="Times New Roman"/>
-        </w:rPr>
-      </w:pPr>
-      <w:r>
-        <w:rPr>
-          <w:rFonts w:ascii="Times New Roman" w:hAnsi="Times New Roman" w:cs="Times New Roman"/>
-        </w:rPr>
-        <w:t>5.2 Testing Methodology</w:t>
-      </w:r>
-    </w:p>
-    <w:p>
-      <w:pPr>
-        <w:rPr>
-          <w:rFonts w:ascii="Times New Roman" w:hAnsi="Times New Roman" w:cs="Times New Roman"/>
-        </w:rPr>
-      </w:pPr>
-    </w:p>
-    <w:p>
-      <w:pPr>
-        <w:rPr>
-          <w:rFonts w:ascii="Times New Roman" w:hAnsi="Times New Roman" w:cs="Times New Roman"/>
-        </w:rPr>
-      </w:pPr>
-      <w:r>
-        <w:rPr>
-          <w:rFonts w:ascii="Times New Roman" w:hAnsi="Times New Roman" w:cs="Times New Roman"/>
-        </w:rPr>
-        <w:t>6 TESTING AND EVALUATION</w:t>
-      </w:r>
-    </w:p>
-    <w:p>
-      <w:pPr>
-        <w:rPr>
-          <w:rFonts w:ascii="Times New Roman" w:hAnsi="Times New Roman" w:cs="Times New Roman"/>
-        </w:rPr>
-      </w:pPr>
-      <w:r>
-        <w:rPr>
-          <w:rFonts w:ascii="Times New Roman" w:hAnsi="Times New Roman" w:cs="Times New Roman"/>
-        </w:rPr>
-        <w:t xml:space="preserve">7 </w:t>
-      </w:r>
-      <w:proofErr w:type="gramStart"/>
-      <w:r>
-        <w:rPr>
-          <w:rFonts w:ascii="Times New Roman" w:hAnsi="Times New Roman" w:cs="Times New Roman"/>
-        </w:rPr>
-        <w:t>CONCLUSION</w:t>
-      </w:r>
-      <w:proofErr w:type="gramEnd"/>
+        <w:t>Occlusion in Imagery: The SVM model occasionally misclassified textures when a garment featured heavy embellishments or when the lighting on the runway created deep shadows.</w:t>
+      </w:r>
+    </w:p>
+    <w:p>
+      <w:pPr>
+        <w:pStyle w:val="ListParagraph"/>
+        <w:numPr>
+          <w:ilvl w:val="0"/>
+          <w:numId w:val="17"/>
+        </w:numPr>
+        <w:rPr>
+          <w:rFonts w:ascii="Times New Roman" w:hAnsi="Times New Roman" w:cs="Times New Roman"/>
+        </w:rPr>
+      </w:pPr>
+      <w:r>
+        <w:rPr>
+          <w:rFonts w:ascii="Times New Roman" w:hAnsi="Times New Roman" w:cs="Times New Roman"/>
+        </w:rPr>
+        <w:t>Dependency on Pre-Processed Data: The Data Loader script currently relies on static JSON files. A future iteration would involve a real-time database, like PostgreSQL, to allow for live updates during a fashion week event.</w:t>
+      </w:r>
+    </w:p>
+    <w:p>
+      <w:pPr>
+        <w:rPr>
+          <w:rFonts w:ascii="Times New Roman" w:hAnsi="Times New Roman" w:cs="Times New Roman"/>
+        </w:rPr>
+      </w:pPr>
+      <w:r>
+        <w:rPr>
+          <w:rFonts w:ascii="Times New Roman" w:hAnsi="Times New Roman" w:cs="Times New Roman"/>
+        </w:rPr>
+        <w:t>7 CONCLUSION</w:t>
+      </w:r>
     </w:p>
     <w:p>
       <w:pPr>
@@ -9143,21 +8825,7 @@
         <w:rPr>
           <w:rFonts w:ascii="Times New Roman" w:hAnsi="Times New Roman" w:cs="Times New Roman"/>
         </w:rPr>
-        <w:t xml:space="preserve">The House of Lasgidi 2025 Analysis platform demonstrates a great potential of integrating Machine Learning with full-stack web technologies in the fashion sector. By combing an analytical Python backend with a reactive JavaScript frontend, the project successfully transformed qualitative visual art into quantitative, actionable data. It provides a blueprint for how African fashion weeks can be </w:t>
-      </w:r>
-      <w:proofErr w:type="spellStart"/>
-      <w:r>
-        <w:rPr>
-          <w:rFonts w:ascii="Times New Roman" w:hAnsi="Times New Roman" w:cs="Times New Roman"/>
-        </w:rPr>
-        <w:t>analyzed</w:t>
-      </w:r>
-      <w:proofErr w:type="spellEnd"/>
-      <w:r>
-        <w:rPr>
-          <w:rFonts w:ascii="Times New Roman" w:hAnsi="Times New Roman" w:cs="Times New Roman"/>
-        </w:rPr>
-        <w:t>, archived, and understood on a global, data-driven scale.</w:t>
+        <w:t>The House of Lasgidi 2025 Analysis platform demonstrates a great potential of integrating Machine Learning with full-stack web technologies in the fashion sector. By combing an analytical Python backend with a reactive JavaScript frontend, the project successfully transformed qualitative visual art into quantitative, actionable data. It provides a blueprint for how African fashion weeks can be analyzed, archived, and understood on a global, data-driven scale.</w:t>
       </w:r>
     </w:p>
     <w:p>
@@ -9190,6 +8858,7 @@
         <w:rPr>
           <w:rFonts w:ascii="Times New Roman" w:hAnsi="Times New Roman" w:cs="Times New Roman"/>
         </w:rPr>
+        <w:lastRenderedPageBreak/>
         <w:t>To scale the system for future fashion weeks, several enhancements are proposed:</w:t>
       </w:r>
     </w:p>
@@ -9208,7 +8877,6 @@
         <w:rPr>
           <w:rFonts w:ascii="Times New Roman" w:hAnsi="Times New Roman" w:cs="Times New Roman"/>
         </w:rPr>
-        <w:lastRenderedPageBreak/>
         <w:t>Transitioning from an SVM with manual feature extraction (GLCM + LBP) to a Convolutional Neural Network (CNN), such as a fine-tuned ResNet50 model, to better identify complex indigenous patterns and layered silhouettes.</w:t>
       </w:r>
     </w:p>
@@ -9425,7 +9093,6 @@
         <w:rPr>
           <w:rFonts w:ascii="Times New Roman" w:hAnsi="Times New Roman" w:cs="Times New Roman"/>
         </w:rPr>
-        <w:lastRenderedPageBreak/>
         <w:t>REFRENCES</w:t>
       </w:r>
     </w:p>
@@ -9482,21 +9149,7 @@
         <w:rPr>
           <w:rFonts w:ascii="Times New Roman" w:hAnsi="Times New Roman" w:cs="Times New Roman"/>
         </w:rPr>
-        <w:t>, vol. 6, 2025, pp. 333-352. DOI: 10.35738/</w:t>
-      </w:r>
-      <w:proofErr w:type="gramStart"/>
-      <w:r>
-        <w:rPr>
-          <w:rFonts w:ascii="Times New Roman" w:hAnsi="Times New Roman" w:cs="Times New Roman"/>
-        </w:rPr>
-        <w:t>ftr.v</w:t>
-      </w:r>
-      <w:proofErr w:type="gramEnd"/>
-      <w:r>
-        <w:rPr>
-          <w:rFonts w:ascii="Times New Roman" w:hAnsi="Times New Roman" w:cs="Times New Roman"/>
-        </w:rPr>
-        <w:t>6.2025.17.</w:t>
+        <w:t>, vol. 6, 2025, pp. 333-352. DOI: 10.35738/ftr.v6.2025.17.</w:t>
       </w:r>
     </w:p>
     <w:p>
@@ -9515,45 +9168,13 @@
           <w:b/>
           <w:bCs/>
         </w:rPr>
-        <w:t xml:space="preserve">Chen, Liang-Chieh, </w:t>
-      </w:r>
-      <w:proofErr w:type="spellStart"/>
-      <w:r>
-        <w:rPr>
-          <w:rFonts w:ascii="Times New Roman" w:hAnsi="Times New Roman" w:cs="Times New Roman"/>
-          <w:b/>
-          <w:bCs/>
-        </w:rPr>
-        <w:t>Yukun</w:t>
-      </w:r>
-      <w:proofErr w:type="spellEnd"/>
-      <w:r>
-        <w:rPr>
-          <w:rFonts w:ascii="Times New Roman" w:hAnsi="Times New Roman" w:cs="Times New Roman"/>
-          <w:b/>
-          <w:bCs/>
-        </w:rPr>
-        <w:t xml:space="preserve"> Zhu, George Papandreou, Florian Schroff, and Hartwig Adam.</w:t>
-      </w:r>
-      <w:r>
-        <w:rPr>
-          <w:rFonts w:ascii="Times New Roman" w:hAnsi="Times New Roman" w:cs="Times New Roman"/>
-        </w:rPr>
-        <w:t xml:space="preserve"> "Encoder-Decoder with </w:t>
-      </w:r>
-      <w:proofErr w:type="spellStart"/>
-      <w:r>
-        <w:rPr>
-          <w:rFonts w:ascii="Times New Roman" w:hAnsi="Times New Roman" w:cs="Times New Roman"/>
-        </w:rPr>
-        <w:t>Atrous</w:t>
-      </w:r>
-      <w:proofErr w:type="spellEnd"/>
-      <w:r>
-        <w:rPr>
-          <w:rFonts w:ascii="Times New Roman" w:hAnsi="Times New Roman" w:cs="Times New Roman"/>
-        </w:rPr>
-        <w:t xml:space="preserve"> Separable Convolution for Semantic Image Segmentation." </w:t>
+        <w:t>Chen, Liang-Chieh, Yukun Zhu, George Papandreou, Florian Schroff, and Hartwig Adam.</w:t>
+      </w:r>
+      <w:r>
+        <w:rPr>
+          <w:rFonts w:ascii="Times New Roman" w:hAnsi="Times New Roman" w:cs="Times New Roman"/>
+        </w:rPr>
+        <w:t xml:space="preserve"> "Encoder-Decoder with Atrous Separable Convolution for Semantic Image Segmentation." </w:t>
       </w:r>
       <w:r>
         <w:rPr>
@@ -9592,21 +9213,7 @@
         <w:rPr>
           <w:rFonts w:ascii="Times New Roman" w:hAnsi="Times New Roman" w:cs="Times New Roman"/>
         </w:rPr>
-        <w:t xml:space="preserve"> "</w:t>
-      </w:r>
-      <w:proofErr w:type="spellStart"/>
-      <w:r>
-        <w:rPr>
-          <w:rFonts w:ascii="Times New Roman" w:hAnsi="Times New Roman" w:cs="Times New Roman"/>
-        </w:rPr>
-        <w:t>Color</w:t>
-      </w:r>
-      <w:proofErr w:type="spellEnd"/>
-      <w:r>
-        <w:rPr>
-          <w:rFonts w:ascii="Times New Roman" w:hAnsi="Times New Roman" w:cs="Times New Roman"/>
-        </w:rPr>
-        <w:t xml:space="preserve"> Standardization and Optimization in Whole Slide Imaging." </w:t>
+        <w:t xml:space="preserve"> "Color Standardization and Optimization in Whole Slide Imaging." </w:t>
       </w:r>
       <w:r>
         <w:rPr>
@@ -9633,41 +9240,13 @@
           <w:rFonts w:ascii="Times New Roman" w:hAnsi="Times New Roman" w:cs="Times New Roman"/>
         </w:rPr>
       </w:pPr>
-      <w:proofErr w:type="spellStart"/>
       <w:r>
         <w:rPr>
           <w:rFonts w:ascii="Times New Roman" w:hAnsi="Times New Roman" w:cs="Times New Roman"/>
           <w:b/>
           <w:bCs/>
         </w:rPr>
-        <w:t>Khder</w:t>
-      </w:r>
-      <w:proofErr w:type="spellEnd"/>
-      <w:r>
-        <w:rPr>
-          <w:rFonts w:ascii="Times New Roman" w:hAnsi="Times New Roman" w:cs="Times New Roman"/>
-          <w:b/>
-          <w:bCs/>
-        </w:rPr>
-        <w:t xml:space="preserve">, </w:t>
-      </w:r>
-      <w:proofErr w:type="spellStart"/>
-      <w:r>
-        <w:rPr>
-          <w:rFonts w:ascii="Times New Roman" w:hAnsi="Times New Roman" w:cs="Times New Roman"/>
-          <w:b/>
-          <w:bCs/>
-        </w:rPr>
-        <w:t>Moaiad</w:t>
-      </w:r>
-      <w:proofErr w:type="spellEnd"/>
-      <w:r>
-        <w:rPr>
-          <w:rFonts w:ascii="Times New Roman" w:hAnsi="Times New Roman" w:cs="Times New Roman"/>
-          <w:b/>
-          <w:bCs/>
-        </w:rPr>
-        <w:t xml:space="preserve"> Ahmad.</w:t>
+        <w:t>Khder, Moaiad Ahmad.</w:t>
       </w:r>
       <w:r>
         <w:rPr>
@@ -9706,61 +9285,7 @@
           <w:b/>
           <w:bCs/>
         </w:rPr>
-        <w:t xml:space="preserve">Liang, Xiaodan, </w:t>
-      </w:r>
-      <w:proofErr w:type="spellStart"/>
-      <w:r>
-        <w:rPr>
-          <w:rFonts w:ascii="Times New Roman" w:hAnsi="Times New Roman" w:cs="Times New Roman"/>
-          <w:b/>
-          <w:bCs/>
-        </w:rPr>
-        <w:t>Chunyan</w:t>
-      </w:r>
-      <w:proofErr w:type="spellEnd"/>
-      <w:r>
-        <w:rPr>
-          <w:rFonts w:ascii="Times New Roman" w:hAnsi="Times New Roman" w:cs="Times New Roman"/>
-          <w:b/>
-          <w:bCs/>
-        </w:rPr>
-        <w:t xml:space="preserve"> Xu, Xiaohui Shen, </w:t>
-      </w:r>
-      <w:proofErr w:type="spellStart"/>
-      <w:r>
-        <w:rPr>
-          <w:rFonts w:ascii="Times New Roman" w:hAnsi="Times New Roman" w:cs="Times New Roman"/>
-          <w:b/>
-          <w:bCs/>
-        </w:rPr>
-        <w:t>Jianchao</w:t>
-      </w:r>
-      <w:proofErr w:type="spellEnd"/>
-      <w:r>
-        <w:rPr>
-          <w:rFonts w:ascii="Times New Roman" w:hAnsi="Times New Roman" w:cs="Times New Roman"/>
-          <w:b/>
-          <w:bCs/>
-        </w:rPr>
-        <w:t xml:space="preserve"> Yang, Si Liu, Jinhui Tang, Liang Lin, and </w:t>
-      </w:r>
-      <w:proofErr w:type="spellStart"/>
-      <w:r>
-        <w:rPr>
-          <w:rFonts w:ascii="Times New Roman" w:hAnsi="Times New Roman" w:cs="Times New Roman"/>
-          <w:b/>
-          <w:bCs/>
-        </w:rPr>
-        <w:t>Shuicheng</w:t>
-      </w:r>
-      <w:proofErr w:type="spellEnd"/>
-      <w:r>
-        <w:rPr>
-          <w:rFonts w:ascii="Times New Roman" w:hAnsi="Times New Roman" w:cs="Times New Roman"/>
-          <w:b/>
-          <w:bCs/>
-        </w:rPr>
-        <w:t xml:space="preserve"> Yan.</w:t>
+        <w:t>Liang, Xiaodan, Chunyan Xu, Xiaohui Shen, Jianchao Yang, Si Liu, Jinhui Tang, Liang Lin, and Shuicheng Yan.</w:t>
       </w:r>
       <w:r>
         <w:rPr>
@@ -9793,43 +9318,19 @@
           <w:rFonts w:ascii="Times New Roman" w:hAnsi="Times New Roman" w:cs="Times New Roman"/>
         </w:rPr>
       </w:pPr>
-      <w:proofErr w:type="spellStart"/>
       <w:r>
         <w:rPr>
           <w:rFonts w:ascii="Times New Roman" w:hAnsi="Times New Roman" w:cs="Times New Roman"/>
           <w:b/>
           <w:bCs/>
         </w:rPr>
-        <w:t>Süsstrunk</w:t>
-      </w:r>
-      <w:proofErr w:type="spellEnd"/>
-      <w:r>
-        <w:rPr>
-          <w:rFonts w:ascii="Times New Roman" w:hAnsi="Times New Roman" w:cs="Times New Roman"/>
-          <w:b/>
-          <w:bCs/>
-        </w:rPr>
-        <w:t>, Sabine, Robert Buckley, and Steve Swen.</w:t>
-      </w:r>
-      <w:r>
-        <w:rPr>
-          <w:rFonts w:ascii="Times New Roman" w:hAnsi="Times New Roman" w:cs="Times New Roman"/>
-        </w:rPr>
-        <w:t xml:space="preserve"> "Standard RGB </w:t>
-      </w:r>
-      <w:proofErr w:type="spellStart"/>
-      <w:r>
-        <w:rPr>
-          <w:rFonts w:ascii="Times New Roman" w:hAnsi="Times New Roman" w:cs="Times New Roman"/>
-        </w:rPr>
-        <w:t>Color</w:t>
-      </w:r>
-      <w:proofErr w:type="spellEnd"/>
-      <w:r>
-        <w:rPr>
-          <w:rFonts w:ascii="Times New Roman" w:hAnsi="Times New Roman" w:cs="Times New Roman"/>
-        </w:rPr>
-        <w:t xml:space="preserve"> Spaces." </w:t>
+        <w:t>Süsstrunk, Sabine, Robert Buckley, and Steve Swen.</w:t>
+      </w:r>
+      <w:r>
+        <w:rPr>
+          <w:rFonts w:ascii="Times New Roman" w:hAnsi="Times New Roman" w:cs="Times New Roman"/>
+        </w:rPr>
+        <w:t xml:space="preserve"> "Standard RGB Color Spaces." </w:t>
       </w:r>
       <w:r>
         <w:rPr>
@@ -9837,25 +9338,7 @@
           <w:i/>
           <w:iCs/>
         </w:rPr>
-        <w:t xml:space="preserve">Proceedings of the 7th </w:t>
-      </w:r>
-      <w:proofErr w:type="spellStart"/>
-      <w:r>
-        <w:rPr>
-          <w:rFonts w:ascii="Times New Roman" w:hAnsi="Times New Roman" w:cs="Times New Roman"/>
-          <w:i/>
-          <w:iCs/>
-        </w:rPr>
-        <w:t>Color</w:t>
-      </w:r>
-      <w:proofErr w:type="spellEnd"/>
-      <w:r>
-        <w:rPr>
-          <w:rFonts w:ascii="Times New Roman" w:hAnsi="Times New Roman" w:cs="Times New Roman"/>
-          <w:i/>
-          <w:iCs/>
-        </w:rPr>
-        <w:t xml:space="preserve"> Imaging Conference</w:t>
+        <w:t>Proceedings of the 7th Color Imaging Conference</w:t>
       </w:r>
       <w:r>
         <w:rPr>
@@ -9993,21 +9476,7 @@
         <w:rPr>
           <w:rFonts w:ascii="Times New Roman" w:hAnsi="Times New Roman" w:cs="Times New Roman"/>
         </w:rPr>
-        <w:t xml:space="preserve"> &gt; </w:t>
-      </w:r>
-      <w:proofErr w:type="spellStart"/>
-      <w:r>
-        <w:rPr>
-          <w:rFonts w:ascii="Times New Roman" w:hAnsi="Times New Roman" w:cs="Times New Roman"/>
-        </w:rPr>
-        <w:t>Mikuns</w:t>
-      </w:r>
-      <w:proofErr w:type="spellEnd"/>
-      <w:r>
-        <w:rPr>
-          <w:rFonts w:ascii="Times New Roman" w:hAnsi="Times New Roman" w:cs="Times New Roman"/>
-        </w:rPr>
-        <w:t xml:space="preserve">. (2021). </w:t>
+        <w:t xml:space="preserve"> &gt; Mikuns. (2021). </w:t>
       </w:r>
       <w:r>
         <w:rPr>
@@ -10045,45 +9514,13 @@
           <w:b/>
           <w:bCs/>
         </w:rPr>
-        <w:t>The Fabrics Dataset (</w:t>
-      </w:r>
-      <w:proofErr w:type="spellStart"/>
-      <w:r>
-        <w:rPr>
-          <w:rFonts w:ascii="Times New Roman" w:hAnsi="Times New Roman" w:cs="Times New Roman"/>
-          <w:b/>
-          <w:bCs/>
-        </w:rPr>
-        <w:t>iBUG</w:t>
-      </w:r>
-      <w:proofErr w:type="spellEnd"/>
-      <w:r>
-        <w:rPr>
-          <w:rFonts w:ascii="Times New Roman" w:hAnsi="Times New Roman" w:cs="Times New Roman"/>
-          <w:b/>
-          <w:bCs/>
-        </w:rPr>
-        <w:t>):</w:t>
-      </w:r>
-      <w:r>
-        <w:rPr>
-          <w:rFonts w:ascii="Times New Roman" w:hAnsi="Times New Roman" w:cs="Times New Roman"/>
-        </w:rPr>
-        <w:t xml:space="preserve"> &gt; </w:t>
-      </w:r>
-      <w:proofErr w:type="spellStart"/>
-      <w:r>
-        <w:rPr>
-          <w:rFonts w:ascii="Times New Roman" w:hAnsi="Times New Roman" w:cs="Times New Roman"/>
-        </w:rPr>
-        <w:t>Orchit</w:t>
-      </w:r>
-      <w:proofErr w:type="spellEnd"/>
-      <w:r>
-        <w:rPr>
-          <w:rFonts w:ascii="Times New Roman" w:hAnsi="Times New Roman" w:cs="Times New Roman"/>
-        </w:rPr>
-        <w:t xml:space="preserve">. (2022). </w:t>
+        <w:t>The Fabrics Dataset (iBUG):</w:t>
+      </w:r>
+      <w:r>
+        <w:rPr>
+          <w:rFonts w:ascii="Times New Roman" w:hAnsi="Times New Roman" w:cs="Times New Roman"/>
+        </w:rPr>
+        <w:t xml:space="preserve"> &gt; Orchit. (2022). </w:t>
       </w:r>
       <w:r>
         <w:rPr>
@@ -10091,18 +9528,8 @@
           <w:i/>
           <w:iCs/>
         </w:rPr>
-        <w:t xml:space="preserve">The Fabrics Dataset by </w:t>
-      </w:r>
-      <w:proofErr w:type="spellStart"/>
-      <w:r>
-        <w:rPr>
-          <w:rFonts w:ascii="Times New Roman" w:hAnsi="Times New Roman" w:cs="Times New Roman"/>
-          <w:i/>
-          <w:iCs/>
-        </w:rPr>
-        <w:t>iBUG</w:t>
-      </w:r>
-      <w:proofErr w:type="spellEnd"/>
+        <w:t>The Fabrics Dataset by iBUG</w:t>
+      </w:r>
       <w:r>
         <w:rPr>
           <w:rFonts w:ascii="Times New Roman" w:hAnsi="Times New Roman" w:cs="Times New Roman"/>
@@ -10291,19 +9718,11 @@
         <w:rFonts w:ascii="Times New Roman" w:hAnsi="Times New Roman" w:cs="Times New Roman"/>
       </w:rPr>
     </w:pPr>
-    <w:proofErr w:type="spellStart"/>
     <w:r>
       <w:rPr>
         <w:rFonts w:ascii="Times New Roman" w:hAnsi="Times New Roman" w:cs="Times New Roman"/>
       </w:rPr>
-      <w:t>HoL</w:t>
-    </w:r>
-    <w:proofErr w:type="spellEnd"/>
-    <w:r>
-      <w:rPr>
-        <w:rFonts w:ascii="Times New Roman" w:hAnsi="Times New Roman" w:cs="Times New Roman"/>
-      </w:rPr>
-      <w:t xml:space="preserve"> – House of Lasgidi</w:t>
+      <w:t>HoL – House of Lasgidi</w:t>
     </w:r>
   </w:p>
   <w:p>
@@ -10438,6 +9857,119 @@
     </w:lvl>
   </w:abstractNum>
   <w:abstractNum w:abstractNumId="1" w15:restartNumberingAfterBreak="0">
+    <w:nsid w:val="02006B42"/>
+    <w:multiLevelType w:val="hybridMultilevel"/>
+    <w:tmpl w:val="027811B4"/>
+    <w:lvl w:ilvl="0" w:tplc="08090001">
+      <w:start w:val="1"/>
+      <w:numFmt w:val="bullet"/>
+      <w:lvlText w:val=""/>
+      <w:lvlJc w:val="left"/>
+      <w:pPr>
+        <w:ind w:left="720" w:hanging="360"/>
+      </w:pPr>
+      <w:rPr>
+        <w:rFonts w:ascii="Symbol" w:hAnsi="Symbol" w:hint="default"/>
+      </w:rPr>
+    </w:lvl>
+    <w:lvl w:ilvl="1" w:tplc="08090003" w:tentative="1">
+      <w:start w:val="1"/>
+      <w:numFmt w:val="bullet"/>
+      <w:lvlText w:val="o"/>
+      <w:lvlJc w:val="left"/>
+      <w:pPr>
+        <w:ind w:left="1440" w:hanging="360"/>
+      </w:pPr>
+      <w:rPr>
+        <w:rFonts w:ascii="Courier New" w:hAnsi="Courier New" w:cs="Courier New" w:hint="default"/>
+      </w:rPr>
+    </w:lvl>
+    <w:lvl w:ilvl="2" w:tplc="08090005" w:tentative="1">
+      <w:start w:val="1"/>
+      <w:numFmt w:val="bullet"/>
+      <w:lvlText w:val=""/>
+      <w:lvlJc w:val="left"/>
+      <w:pPr>
+        <w:ind w:left="2160" w:hanging="360"/>
+      </w:pPr>
+      <w:rPr>
+        <w:rFonts w:ascii="Wingdings" w:hAnsi="Wingdings" w:hint="default"/>
+      </w:rPr>
+    </w:lvl>
+    <w:lvl w:ilvl="3" w:tplc="08090001" w:tentative="1">
+      <w:start w:val="1"/>
+      <w:numFmt w:val="bullet"/>
+      <w:lvlText w:val=""/>
+      <w:lvlJc w:val="left"/>
+      <w:pPr>
+        <w:ind w:left="2880" w:hanging="360"/>
+      </w:pPr>
+      <w:rPr>
+        <w:rFonts w:ascii="Symbol" w:hAnsi="Symbol" w:hint="default"/>
+      </w:rPr>
+    </w:lvl>
+    <w:lvl w:ilvl="4" w:tplc="08090003" w:tentative="1">
+      <w:start w:val="1"/>
+      <w:numFmt w:val="bullet"/>
+      <w:lvlText w:val="o"/>
+      <w:lvlJc w:val="left"/>
+      <w:pPr>
+        <w:ind w:left="3600" w:hanging="360"/>
+      </w:pPr>
+      <w:rPr>
+        <w:rFonts w:ascii="Courier New" w:hAnsi="Courier New" w:cs="Courier New" w:hint="default"/>
+      </w:rPr>
+    </w:lvl>
+    <w:lvl w:ilvl="5" w:tplc="08090005" w:tentative="1">
+      <w:start w:val="1"/>
+      <w:numFmt w:val="bullet"/>
+      <w:lvlText w:val=""/>
+      <w:lvlJc w:val="left"/>
+      <w:pPr>
+        <w:ind w:left="4320" w:hanging="360"/>
+      </w:pPr>
+      <w:rPr>
+        <w:rFonts w:ascii="Wingdings" w:hAnsi="Wingdings" w:hint="default"/>
+      </w:rPr>
+    </w:lvl>
+    <w:lvl w:ilvl="6" w:tplc="08090001" w:tentative="1">
+      <w:start w:val="1"/>
+      <w:numFmt w:val="bullet"/>
+      <w:lvlText w:val=""/>
+      <w:lvlJc w:val="left"/>
+      <w:pPr>
+        <w:ind w:left="5040" w:hanging="360"/>
+      </w:pPr>
+      <w:rPr>
+        <w:rFonts w:ascii="Symbol" w:hAnsi="Symbol" w:hint="default"/>
+      </w:rPr>
+    </w:lvl>
+    <w:lvl w:ilvl="7" w:tplc="08090003" w:tentative="1">
+      <w:start w:val="1"/>
+      <w:numFmt w:val="bullet"/>
+      <w:lvlText w:val="o"/>
+      <w:lvlJc w:val="left"/>
+      <w:pPr>
+        <w:ind w:left="5760" w:hanging="360"/>
+      </w:pPr>
+      <w:rPr>
+        <w:rFonts w:ascii="Courier New" w:hAnsi="Courier New" w:cs="Courier New" w:hint="default"/>
+      </w:rPr>
+    </w:lvl>
+    <w:lvl w:ilvl="8" w:tplc="08090005" w:tentative="1">
+      <w:start w:val="1"/>
+      <w:numFmt w:val="bullet"/>
+      <w:lvlText w:val=""/>
+      <w:lvlJc w:val="left"/>
+      <w:pPr>
+        <w:ind w:left="6480" w:hanging="360"/>
+      </w:pPr>
+      <w:rPr>
+        <w:rFonts w:ascii="Wingdings" w:hAnsi="Wingdings" w:hint="default"/>
+      </w:rPr>
+    </w:lvl>
+  </w:abstractNum>
+  <w:abstractNum w:abstractNumId="2" w15:restartNumberingAfterBreak="0">
     <w:nsid w:val="02D71662"/>
     <w:multiLevelType w:val="hybridMultilevel"/>
     <w:tmpl w:val="CEFADD06"/>
@@ -10550,7 +10082,120 @@
       </w:rPr>
     </w:lvl>
   </w:abstractNum>
-  <w:abstractNum w:abstractNumId="2" w15:restartNumberingAfterBreak="0">
+  <w:abstractNum w:abstractNumId="3" w15:restartNumberingAfterBreak="0">
+    <w:nsid w:val="14F11160"/>
+    <w:multiLevelType w:val="hybridMultilevel"/>
+    <w:tmpl w:val="87C4EEB2"/>
+    <w:lvl w:ilvl="0" w:tplc="08090001">
+      <w:start w:val="1"/>
+      <w:numFmt w:val="bullet"/>
+      <w:lvlText w:val=""/>
+      <w:lvlJc w:val="left"/>
+      <w:pPr>
+        <w:ind w:left="720" w:hanging="360"/>
+      </w:pPr>
+      <w:rPr>
+        <w:rFonts w:ascii="Symbol" w:hAnsi="Symbol" w:hint="default"/>
+      </w:rPr>
+    </w:lvl>
+    <w:lvl w:ilvl="1" w:tplc="08090003" w:tentative="1">
+      <w:start w:val="1"/>
+      <w:numFmt w:val="bullet"/>
+      <w:lvlText w:val="o"/>
+      <w:lvlJc w:val="left"/>
+      <w:pPr>
+        <w:ind w:left="1440" w:hanging="360"/>
+      </w:pPr>
+      <w:rPr>
+        <w:rFonts w:ascii="Courier New" w:hAnsi="Courier New" w:cs="Courier New" w:hint="default"/>
+      </w:rPr>
+    </w:lvl>
+    <w:lvl w:ilvl="2" w:tplc="08090005" w:tentative="1">
+      <w:start w:val="1"/>
+      <w:numFmt w:val="bullet"/>
+      <w:lvlText w:val=""/>
+      <w:lvlJc w:val="left"/>
+      <w:pPr>
+        <w:ind w:left="2160" w:hanging="360"/>
+      </w:pPr>
+      <w:rPr>
+        <w:rFonts w:ascii="Wingdings" w:hAnsi="Wingdings" w:hint="default"/>
+      </w:rPr>
+    </w:lvl>
+    <w:lvl w:ilvl="3" w:tplc="08090001" w:tentative="1">
+      <w:start w:val="1"/>
+      <w:numFmt w:val="bullet"/>
+      <w:lvlText w:val=""/>
+      <w:lvlJc w:val="left"/>
+      <w:pPr>
+        <w:ind w:left="2880" w:hanging="360"/>
+      </w:pPr>
+      <w:rPr>
+        <w:rFonts w:ascii="Symbol" w:hAnsi="Symbol" w:hint="default"/>
+      </w:rPr>
+    </w:lvl>
+    <w:lvl w:ilvl="4" w:tplc="08090003" w:tentative="1">
+      <w:start w:val="1"/>
+      <w:numFmt w:val="bullet"/>
+      <w:lvlText w:val="o"/>
+      <w:lvlJc w:val="left"/>
+      <w:pPr>
+        <w:ind w:left="3600" w:hanging="360"/>
+      </w:pPr>
+      <w:rPr>
+        <w:rFonts w:ascii="Courier New" w:hAnsi="Courier New" w:cs="Courier New" w:hint="default"/>
+      </w:rPr>
+    </w:lvl>
+    <w:lvl w:ilvl="5" w:tplc="08090005" w:tentative="1">
+      <w:start w:val="1"/>
+      <w:numFmt w:val="bullet"/>
+      <w:lvlText w:val=""/>
+      <w:lvlJc w:val="left"/>
+      <w:pPr>
+        <w:ind w:left="4320" w:hanging="360"/>
+      </w:pPr>
+      <w:rPr>
+        <w:rFonts w:ascii="Wingdings" w:hAnsi="Wingdings" w:hint="default"/>
+      </w:rPr>
+    </w:lvl>
+    <w:lvl w:ilvl="6" w:tplc="08090001" w:tentative="1">
+      <w:start w:val="1"/>
+      <w:numFmt w:val="bullet"/>
+      <w:lvlText w:val=""/>
+      <w:lvlJc w:val="left"/>
+      <w:pPr>
+        <w:ind w:left="5040" w:hanging="360"/>
+      </w:pPr>
+      <w:rPr>
+        <w:rFonts w:ascii="Symbol" w:hAnsi="Symbol" w:hint="default"/>
+      </w:rPr>
+    </w:lvl>
+    <w:lvl w:ilvl="7" w:tplc="08090003" w:tentative="1">
+      <w:start w:val="1"/>
+      <w:numFmt w:val="bullet"/>
+      <w:lvlText w:val="o"/>
+      <w:lvlJc w:val="left"/>
+      <w:pPr>
+        <w:ind w:left="5760" w:hanging="360"/>
+      </w:pPr>
+      <w:rPr>
+        <w:rFonts w:ascii="Courier New" w:hAnsi="Courier New" w:cs="Courier New" w:hint="default"/>
+      </w:rPr>
+    </w:lvl>
+    <w:lvl w:ilvl="8" w:tplc="08090005" w:tentative="1">
+      <w:start w:val="1"/>
+      <w:numFmt w:val="bullet"/>
+      <w:lvlText w:val=""/>
+      <w:lvlJc w:val="left"/>
+      <w:pPr>
+        <w:ind w:left="6480" w:hanging="360"/>
+      </w:pPr>
+      <w:rPr>
+        <w:rFonts w:ascii="Wingdings" w:hAnsi="Wingdings" w:hint="default"/>
+      </w:rPr>
+    </w:lvl>
+  </w:abstractNum>
+  <w:abstractNum w:abstractNumId="4" w15:restartNumberingAfterBreak="0">
     <w:nsid w:val="24DB1ABA"/>
     <w:multiLevelType w:val="hybridMultilevel"/>
     <w:tmpl w:val="0B2E223C"/>
@@ -10663,7 +10308,7 @@
       </w:rPr>
     </w:lvl>
   </w:abstractNum>
-  <w:abstractNum w:abstractNumId="3" w15:restartNumberingAfterBreak="0">
+  <w:abstractNum w:abstractNumId="5" w15:restartNumberingAfterBreak="0">
     <w:nsid w:val="2678099D"/>
     <w:multiLevelType w:val="hybridMultilevel"/>
     <w:tmpl w:val="16D68566"/>
@@ -10776,7 +10421,120 @@
       </w:rPr>
     </w:lvl>
   </w:abstractNum>
-  <w:abstractNum w:abstractNumId="4" w15:restartNumberingAfterBreak="0">
+  <w:abstractNum w:abstractNumId="6" w15:restartNumberingAfterBreak="0">
+    <w:nsid w:val="35A00108"/>
+    <w:multiLevelType w:val="hybridMultilevel"/>
+    <w:tmpl w:val="5AD40BAE"/>
+    <w:lvl w:ilvl="0" w:tplc="08090001">
+      <w:start w:val="1"/>
+      <w:numFmt w:val="bullet"/>
+      <w:lvlText w:val=""/>
+      <w:lvlJc w:val="left"/>
+      <w:pPr>
+        <w:ind w:left="720" w:hanging="360"/>
+      </w:pPr>
+      <w:rPr>
+        <w:rFonts w:ascii="Symbol" w:hAnsi="Symbol" w:hint="default"/>
+      </w:rPr>
+    </w:lvl>
+    <w:lvl w:ilvl="1" w:tplc="08090003" w:tentative="1">
+      <w:start w:val="1"/>
+      <w:numFmt w:val="bullet"/>
+      <w:lvlText w:val="o"/>
+      <w:lvlJc w:val="left"/>
+      <w:pPr>
+        <w:ind w:left="1440" w:hanging="360"/>
+      </w:pPr>
+      <w:rPr>
+        <w:rFonts w:ascii="Courier New" w:hAnsi="Courier New" w:cs="Courier New" w:hint="default"/>
+      </w:rPr>
+    </w:lvl>
+    <w:lvl w:ilvl="2" w:tplc="08090005" w:tentative="1">
+      <w:start w:val="1"/>
+      <w:numFmt w:val="bullet"/>
+      <w:lvlText w:val=""/>
+      <w:lvlJc w:val="left"/>
+      <w:pPr>
+        <w:ind w:left="2160" w:hanging="360"/>
+      </w:pPr>
+      <w:rPr>
+        <w:rFonts w:ascii="Wingdings" w:hAnsi="Wingdings" w:hint="default"/>
+      </w:rPr>
+    </w:lvl>
+    <w:lvl w:ilvl="3" w:tplc="08090001" w:tentative="1">
+      <w:start w:val="1"/>
+      <w:numFmt w:val="bullet"/>
+      <w:lvlText w:val=""/>
+      <w:lvlJc w:val="left"/>
+      <w:pPr>
+        <w:ind w:left="2880" w:hanging="360"/>
+      </w:pPr>
+      <w:rPr>
+        <w:rFonts w:ascii="Symbol" w:hAnsi="Symbol" w:hint="default"/>
+      </w:rPr>
+    </w:lvl>
+    <w:lvl w:ilvl="4" w:tplc="08090003" w:tentative="1">
+      <w:start w:val="1"/>
+      <w:numFmt w:val="bullet"/>
+      <w:lvlText w:val="o"/>
+      <w:lvlJc w:val="left"/>
+      <w:pPr>
+        <w:ind w:left="3600" w:hanging="360"/>
+      </w:pPr>
+      <w:rPr>
+        <w:rFonts w:ascii="Courier New" w:hAnsi="Courier New" w:cs="Courier New" w:hint="default"/>
+      </w:rPr>
+    </w:lvl>
+    <w:lvl w:ilvl="5" w:tplc="08090005" w:tentative="1">
+      <w:start w:val="1"/>
+      <w:numFmt w:val="bullet"/>
+      <w:lvlText w:val=""/>
+      <w:lvlJc w:val="left"/>
+      <w:pPr>
+        <w:ind w:left="4320" w:hanging="360"/>
+      </w:pPr>
+      <w:rPr>
+        <w:rFonts w:ascii="Wingdings" w:hAnsi="Wingdings" w:hint="default"/>
+      </w:rPr>
+    </w:lvl>
+    <w:lvl w:ilvl="6" w:tplc="08090001" w:tentative="1">
+      <w:start w:val="1"/>
+      <w:numFmt w:val="bullet"/>
+      <w:lvlText w:val=""/>
+      <w:lvlJc w:val="left"/>
+      <w:pPr>
+        <w:ind w:left="5040" w:hanging="360"/>
+      </w:pPr>
+      <w:rPr>
+        <w:rFonts w:ascii="Symbol" w:hAnsi="Symbol" w:hint="default"/>
+      </w:rPr>
+    </w:lvl>
+    <w:lvl w:ilvl="7" w:tplc="08090003" w:tentative="1">
+      <w:start w:val="1"/>
+      <w:numFmt w:val="bullet"/>
+      <w:lvlText w:val="o"/>
+      <w:lvlJc w:val="left"/>
+      <w:pPr>
+        <w:ind w:left="5760" w:hanging="360"/>
+      </w:pPr>
+      <w:rPr>
+        <w:rFonts w:ascii="Courier New" w:hAnsi="Courier New" w:cs="Courier New" w:hint="default"/>
+      </w:rPr>
+    </w:lvl>
+    <w:lvl w:ilvl="8" w:tplc="08090005" w:tentative="1">
+      <w:start w:val="1"/>
+      <w:numFmt w:val="bullet"/>
+      <w:lvlText w:val=""/>
+      <w:lvlJc w:val="left"/>
+      <w:pPr>
+        <w:ind w:left="6480" w:hanging="360"/>
+      </w:pPr>
+      <w:rPr>
+        <w:rFonts w:ascii="Wingdings" w:hAnsi="Wingdings" w:hint="default"/>
+      </w:rPr>
+    </w:lvl>
+  </w:abstractNum>
+  <w:abstractNum w:abstractNumId="7" w15:restartNumberingAfterBreak="0">
     <w:nsid w:val="38457194"/>
     <w:multiLevelType w:val="hybridMultilevel"/>
     <w:tmpl w:val="FA16BB24"/>
@@ -10889,7 +10647,7 @@
       </w:rPr>
     </w:lvl>
   </w:abstractNum>
-  <w:abstractNum w:abstractNumId="5" w15:restartNumberingAfterBreak="0">
+  <w:abstractNum w:abstractNumId="8" w15:restartNumberingAfterBreak="0">
     <w:nsid w:val="43F6686A"/>
     <w:multiLevelType w:val="hybridMultilevel"/>
     <w:tmpl w:val="D5D861F2"/>
@@ -11002,7 +10760,7 @@
       </w:rPr>
     </w:lvl>
   </w:abstractNum>
-  <w:abstractNum w:abstractNumId="6" w15:restartNumberingAfterBreak="0">
+  <w:abstractNum w:abstractNumId="9" w15:restartNumberingAfterBreak="0">
     <w:nsid w:val="43FD78F9"/>
     <w:multiLevelType w:val="multilevel"/>
     <w:tmpl w:val="649637AA"/>
@@ -11151,7 +10909,7 @@
       </w:rPr>
     </w:lvl>
   </w:abstractNum>
-  <w:abstractNum w:abstractNumId="7" w15:restartNumberingAfterBreak="0">
+  <w:abstractNum w:abstractNumId="10" w15:restartNumberingAfterBreak="0">
     <w:nsid w:val="48E07AA5"/>
     <w:multiLevelType w:val="hybridMultilevel"/>
     <w:tmpl w:val="A52066E6"/>
@@ -11264,7 +11022,7 @@
       </w:rPr>
     </w:lvl>
   </w:abstractNum>
-  <w:abstractNum w:abstractNumId="8" w15:restartNumberingAfterBreak="0">
+  <w:abstractNum w:abstractNumId="11" w15:restartNumberingAfterBreak="0">
     <w:nsid w:val="4A4453B1"/>
     <w:multiLevelType w:val="hybridMultilevel"/>
     <w:tmpl w:val="ED3822C6"/>
@@ -11377,7 +11135,120 @@
       </w:rPr>
     </w:lvl>
   </w:abstractNum>
-  <w:abstractNum w:abstractNumId="9" w15:restartNumberingAfterBreak="0">
+  <w:abstractNum w:abstractNumId="12" w15:restartNumberingAfterBreak="0">
+    <w:nsid w:val="555D1F37"/>
+    <w:multiLevelType w:val="hybridMultilevel"/>
+    <w:tmpl w:val="8D16EF8C"/>
+    <w:lvl w:ilvl="0" w:tplc="08090001">
+      <w:start w:val="1"/>
+      <w:numFmt w:val="bullet"/>
+      <w:lvlText w:val=""/>
+      <w:lvlJc w:val="left"/>
+      <w:pPr>
+        <w:ind w:left="720" w:hanging="360"/>
+      </w:pPr>
+      <w:rPr>
+        <w:rFonts w:ascii="Symbol" w:hAnsi="Symbol" w:hint="default"/>
+      </w:rPr>
+    </w:lvl>
+    <w:lvl w:ilvl="1" w:tplc="08090003" w:tentative="1">
+      <w:start w:val="1"/>
+      <w:numFmt w:val="bullet"/>
+      <w:lvlText w:val="o"/>
+      <w:lvlJc w:val="left"/>
+      <w:pPr>
+        <w:ind w:left="1440" w:hanging="360"/>
+      </w:pPr>
+      <w:rPr>
+        <w:rFonts w:ascii="Courier New" w:hAnsi="Courier New" w:cs="Courier New" w:hint="default"/>
+      </w:rPr>
+    </w:lvl>
+    <w:lvl w:ilvl="2" w:tplc="08090005" w:tentative="1">
+      <w:start w:val="1"/>
+      <w:numFmt w:val="bullet"/>
+      <w:lvlText w:val=""/>
+      <w:lvlJc w:val="left"/>
+      <w:pPr>
+        <w:ind w:left="2160" w:hanging="360"/>
+      </w:pPr>
+      <w:rPr>
+        <w:rFonts w:ascii="Wingdings" w:hAnsi="Wingdings" w:hint="default"/>
+      </w:rPr>
+    </w:lvl>
+    <w:lvl w:ilvl="3" w:tplc="08090001" w:tentative="1">
+      <w:start w:val="1"/>
+      <w:numFmt w:val="bullet"/>
+      <w:lvlText w:val=""/>
+      <w:lvlJc w:val="left"/>
+      <w:pPr>
+        <w:ind w:left="2880" w:hanging="360"/>
+      </w:pPr>
+      <w:rPr>
+        <w:rFonts w:ascii="Symbol" w:hAnsi="Symbol" w:hint="default"/>
+      </w:rPr>
+    </w:lvl>
+    <w:lvl w:ilvl="4" w:tplc="08090003" w:tentative="1">
+      <w:start w:val="1"/>
+      <w:numFmt w:val="bullet"/>
+      <w:lvlText w:val="o"/>
+      <w:lvlJc w:val="left"/>
+      <w:pPr>
+        <w:ind w:left="3600" w:hanging="360"/>
+      </w:pPr>
+      <w:rPr>
+        <w:rFonts w:ascii="Courier New" w:hAnsi="Courier New" w:cs="Courier New" w:hint="default"/>
+      </w:rPr>
+    </w:lvl>
+    <w:lvl w:ilvl="5" w:tplc="08090005" w:tentative="1">
+      <w:start w:val="1"/>
+      <w:numFmt w:val="bullet"/>
+      <w:lvlText w:val=""/>
+      <w:lvlJc w:val="left"/>
+      <w:pPr>
+        <w:ind w:left="4320" w:hanging="360"/>
+      </w:pPr>
+      <w:rPr>
+        <w:rFonts w:ascii="Wingdings" w:hAnsi="Wingdings" w:hint="default"/>
+      </w:rPr>
+    </w:lvl>
+    <w:lvl w:ilvl="6" w:tplc="08090001" w:tentative="1">
+      <w:start w:val="1"/>
+      <w:numFmt w:val="bullet"/>
+      <w:lvlText w:val=""/>
+      <w:lvlJc w:val="left"/>
+      <w:pPr>
+        <w:ind w:left="5040" w:hanging="360"/>
+      </w:pPr>
+      <w:rPr>
+        <w:rFonts w:ascii="Symbol" w:hAnsi="Symbol" w:hint="default"/>
+      </w:rPr>
+    </w:lvl>
+    <w:lvl w:ilvl="7" w:tplc="08090003" w:tentative="1">
+      <w:start w:val="1"/>
+      <w:numFmt w:val="bullet"/>
+      <w:lvlText w:val="o"/>
+      <w:lvlJc w:val="left"/>
+      <w:pPr>
+        <w:ind w:left="5760" w:hanging="360"/>
+      </w:pPr>
+      <w:rPr>
+        <w:rFonts w:ascii="Courier New" w:hAnsi="Courier New" w:cs="Courier New" w:hint="default"/>
+      </w:rPr>
+    </w:lvl>
+    <w:lvl w:ilvl="8" w:tplc="08090005" w:tentative="1">
+      <w:start w:val="1"/>
+      <w:numFmt w:val="bullet"/>
+      <w:lvlText w:val=""/>
+      <w:lvlJc w:val="left"/>
+      <w:pPr>
+        <w:ind w:left="6480" w:hanging="360"/>
+      </w:pPr>
+      <w:rPr>
+        <w:rFonts w:ascii="Wingdings" w:hAnsi="Wingdings" w:hint="default"/>
+      </w:rPr>
+    </w:lvl>
+  </w:abstractNum>
+  <w:abstractNum w:abstractNumId="13" w15:restartNumberingAfterBreak="0">
     <w:nsid w:val="59636676"/>
     <w:multiLevelType w:val="hybridMultilevel"/>
     <w:tmpl w:val="7D92CF30"/>
@@ -11466,7 +11337,7 @@
       </w:pPr>
     </w:lvl>
   </w:abstractNum>
-  <w:abstractNum w:abstractNumId="10" w15:restartNumberingAfterBreak="0">
+  <w:abstractNum w:abstractNumId="14" w15:restartNumberingAfterBreak="0">
     <w:nsid w:val="5D8D316B"/>
     <w:multiLevelType w:val="hybridMultilevel"/>
     <w:tmpl w:val="0138FBF6"/>
@@ -11579,7 +11450,7 @@
       </w:rPr>
     </w:lvl>
   </w:abstractNum>
-  <w:abstractNum w:abstractNumId="11" w15:restartNumberingAfterBreak="0">
+  <w:abstractNum w:abstractNumId="15" w15:restartNumberingAfterBreak="0">
     <w:nsid w:val="5D8E688F"/>
     <w:multiLevelType w:val="hybridMultilevel"/>
     <w:tmpl w:val="153260A8"/>
@@ -11692,7 +11563,7 @@
       </w:rPr>
     </w:lvl>
   </w:abstractNum>
-  <w:abstractNum w:abstractNumId="12" w15:restartNumberingAfterBreak="0">
+  <w:abstractNum w:abstractNumId="16" w15:restartNumberingAfterBreak="0">
     <w:nsid w:val="5FC5550D"/>
     <w:multiLevelType w:val="multilevel"/>
     <w:tmpl w:val="23DC2330"/>
@@ -11841,7 +11712,120 @@
       </w:rPr>
     </w:lvl>
   </w:abstractNum>
-  <w:abstractNum w:abstractNumId="13" w15:restartNumberingAfterBreak="0">
+  <w:abstractNum w:abstractNumId="17" w15:restartNumberingAfterBreak="0">
+    <w:nsid w:val="60A6118A"/>
+    <w:multiLevelType w:val="hybridMultilevel"/>
+    <w:tmpl w:val="3612C3EA"/>
+    <w:lvl w:ilvl="0" w:tplc="08090001">
+      <w:start w:val="1"/>
+      <w:numFmt w:val="bullet"/>
+      <w:lvlText w:val=""/>
+      <w:lvlJc w:val="left"/>
+      <w:pPr>
+        <w:ind w:left="720" w:hanging="360"/>
+      </w:pPr>
+      <w:rPr>
+        <w:rFonts w:ascii="Symbol" w:hAnsi="Symbol" w:hint="default"/>
+      </w:rPr>
+    </w:lvl>
+    <w:lvl w:ilvl="1" w:tplc="08090003" w:tentative="1">
+      <w:start w:val="1"/>
+      <w:numFmt w:val="bullet"/>
+      <w:lvlText w:val="o"/>
+      <w:lvlJc w:val="left"/>
+      <w:pPr>
+        <w:ind w:left="1440" w:hanging="360"/>
+      </w:pPr>
+      <w:rPr>
+        <w:rFonts w:ascii="Courier New" w:hAnsi="Courier New" w:cs="Courier New" w:hint="default"/>
+      </w:rPr>
+    </w:lvl>
+    <w:lvl w:ilvl="2" w:tplc="08090005" w:tentative="1">
+      <w:start w:val="1"/>
+      <w:numFmt w:val="bullet"/>
+      <w:lvlText w:val=""/>
+      <w:lvlJc w:val="left"/>
+      <w:pPr>
+        <w:ind w:left="2160" w:hanging="360"/>
+      </w:pPr>
+      <w:rPr>
+        <w:rFonts w:ascii="Wingdings" w:hAnsi="Wingdings" w:hint="default"/>
+      </w:rPr>
+    </w:lvl>
+    <w:lvl w:ilvl="3" w:tplc="08090001" w:tentative="1">
+      <w:start w:val="1"/>
+      <w:numFmt w:val="bullet"/>
+      <w:lvlText w:val=""/>
+      <w:lvlJc w:val="left"/>
+      <w:pPr>
+        <w:ind w:left="2880" w:hanging="360"/>
+      </w:pPr>
+      <w:rPr>
+        <w:rFonts w:ascii="Symbol" w:hAnsi="Symbol" w:hint="default"/>
+      </w:rPr>
+    </w:lvl>
+    <w:lvl w:ilvl="4" w:tplc="08090003" w:tentative="1">
+      <w:start w:val="1"/>
+      <w:numFmt w:val="bullet"/>
+      <w:lvlText w:val="o"/>
+      <w:lvlJc w:val="left"/>
+      <w:pPr>
+        <w:ind w:left="3600" w:hanging="360"/>
+      </w:pPr>
+      <w:rPr>
+        <w:rFonts w:ascii="Courier New" w:hAnsi="Courier New" w:cs="Courier New" w:hint="default"/>
+      </w:rPr>
+    </w:lvl>
+    <w:lvl w:ilvl="5" w:tplc="08090005" w:tentative="1">
+      <w:start w:val="1"/>
+      <w:numFmt w:val="bullet"/>
+      <w:lvlText w:val=""/>
+      <w:lvlJc w:val="left"/>
+      <w:pPr>
+        <w:ind w:left="4320" w:hanging="360"/>
+      </w:pPr>
+      <w:rPr>
+        <w:rFonts w:ascii="Wingdings" w:hAnsi="Wingdings" w:hint="default"/>
+      </w:rPr>
+    </w:lvl>
+    <w:lvl w:ilvl="6" w:tplc="08090001" w:tentative="1">
+      <w:start w:val="1"/>
+      <w:numFmt w:val="bullet"/>
+      <w:lvlText w:val=""/>
+      <w:lvlJc w:val="left"/>
+      <w:pPr>
+        <w:ind w:left="5040" w:hanging="360"/>
+      </w:pPr>
+      <w:rPr>
+        <w:rFonts w:ascii="Symbol" w:hAnsi="Symbol" w:hint="default"/>
+      </w:rPr>
+    </w:lvl>
+    <w:lvl w:ilvl="7" w:tplc="08090003" w:tentative="1">
+      <w:start w:val="1"/>
+      <w:numFmt w:val="bullet"/>
+      <w:lvlText w:val="o"/>
+      <w:lvlJc w:val="left"/>
+      <w:pPr>
+        <w:ind w:left="5760" w:hanging="360"/>
+      </w:pPr>
+      <w:rPr>
+        <w:rFonts w:ascii="Courier New" w:hAnsi="Courier New" w:cs="Courier New" w:hint="default"/>
+      </w:rPr>
+    </w:lvl>
+    <w:lvl w:ilvl="8" w:tplc="08090005" w:tentative="1">
+      <w:start w:val="1"/>
+      <w:numFmt w:val="bullet"/>
+      <w:lvlText w:val=""/>
+      <w:lvlJc w:val="left"/>
+      <w:pPr>
+        <w:ind w:left="6480" w:hanging="360"/>
+      </w:pPr>
+      <w:rPr>
+        <w:rFonts w:ascii="Wingdings" w:hAnsi="Wingdings" w:hint="default"/>
+      </w:rPr>
+    </w:lvl>
+  </w:abstractNum>
+  <w:abstractNum w:abstractNumId="18" w15:restartNumberingAfterBreak="0">
     <w:nsid w:val="61C75D03"/>
     <w:multiLevelType w:val="hybridMultilevel"/>
     <w:tmpl w:val="E544F858"/>
@@ -11954,7 +11938,7 @@
       </w:rPr>
     </w:lvl>
   </w:abstractNum>
-  <w:abstractNum w:abstractNumId="14" w15:restartNumberingAfterBreak="0">
+  <w:abstractNum w:abstractNumId="19" w15:restartNumberingAfterBreak="0">
     <w:nsid w:val="6420690F"/>
     <w:multiLevelType w:val="hybridMultilevel"/>
     <w:tmpl w:val="4E00CEA2"/>
@@ -12067,7 +12051,7 @@
       </w:rPr>
     </w:lvl>
   </w:abstractNum>
-  <w:abstractNum w:abstractNumId="15" w15:restartNumberingAfterBreak="0">
+  <w:abstractNum w:abstractNumId="20" w15:restartNumberingAfterBreak="0">
     <w:nsid w:val="67BB3B0B"/>
     <w:multiLevelType w:val="hybridMultilevel"/>
     <w:tmpl w:val="D67E2FBC"/>
@@ -12157,52 +12141,67 @@
     </w:lvl>
   </w:abstractNum>
   <w:num w:numId="1" w16cid:durableId="2047481932">
-    <w:abstractNumId w:val="5"/>
+    <w:abstractNumId w:val="8"/>
   </w:num>
   <w:num w:numId="2" w16cid:durableId="363792526">
+    <w:abstractNumId w:val="15"/>
+  </w:num>
+  <w:num w:numId="3" w16cid:durableId="447118071">
+    <w:abstractNumId w:val="7"/>
+  </w:num>
+  <w:num w:numId="4" w16cid:durableId="1956595642">
     <w:abstractNumId w:val="11"/>
   </w:num>
-  <w:num w:numId="3" w16cid:durableId="447118071">
-    <w:abstractNumId w:val="4"/>
-  </w:num>
-  <w:num w:numId="4" w16cid:durableId="1956595642">
-    <w:abstractNumId w:val="8"/>
-  </w:num>
   <w:num w:numId="5" w16cid:durableId="1734624379">
-    <w:abstractNumId w:val="6"/>
+    <w:abstractNumId w:val="9"/>
   </w:num>
   <w:num w:numId="6" w16cid:durableId="984356517">
-    <w:abstractNumId w:val="12"/>
+    <w:abstractNumId w:val="16"/>
   </w:num>
   <w:num w:numId="7" w16cid:durableId="526413086">
-    <w:abstractNumId w:val="13"/>
+    <w:abstractNumId w:val="18"/>
   </w:num>
   <w:num w:numId="8" w16cid:durableId="1190216125">
-    <w:abstractNumId w:val="9"/>
+    <w:abstractNumId w:val="13"/>
   </w:num>
   <w:num w:numId="9" w16cid:durableId="28574562">
     <w:abstractNumId w:val="0"/>
   </w:num>
   <w:num w:numId="10" w16cid:durableId="11418442">
-    <w:abstractNumId w:val="7"/>
+    <w:abstractNumId w:val="10"/>
   </w:num>
   <w:num w:numId="11" w16cid:durableId="490024077">
-    <w:abstractNumId w:val="15"/>
+    <w:abstractNumId w:val="20"/>
   </w:num>
   <w:num w:numId="12" w16cid:durableId="470246383">
+    <w:abstractNumId w:val="4"/>
+  </w:num>
+  <w:num w:numId="13" w16cid:durableId="1806237953">
+    <w:abstractNumId w:val="5"/>
+  </w:num>
+  <w:num w:numId="14" w16cid:durableId="1133912956">
     <w:abstractNumId w:val="2"/>
   </w:num>
-  <w:num w:numId="13" w16cid:durableId="1806237953">
+  <w:num w:numId="15" w16cid:durableId="1831672208">
+    <w:abstractNumId w:val="14"/>
+  </w:num>
+  <w:num w:numId="16" w16cid:durableId="509375177">
+    <w:abstractNumId w:val="19"/>
+  </w:num>
+  <w:num w:numId="17" w16cid:durableId="1917783064">
+    <w:abstractNumId w:val="6"/>
+  </w:num>
+  <w:num w:numId="18" w16cid:durableId="1694259749">
     <w:abstractNumId w:val="3"/>
   </w:num>
-  <w:num w:numId="14" w16cid:durableId="1133912956">
+  <w:num w:numId="19" w16cid:durableId="1970091313">
+    <w:abstractNumId w:val="17"/>
+  </w:num>
+  <w:num w:numId="20" w16cid:durableId="1513952633">
     <w:abstractNumId w:val="1"/>
   </w:num>
-  <w:num w:numId="15" w16cid:durableId="1831672208">
-    <w:abstractNumId w:val="10"/>
-  </w:num>
-  <w:num w:numId="16" w16cid:durableId="509375177">
-    <w:abstractNumId w:val="14"/>
+  <w:num w:numId="21" w16cid:durableId="684938247">
+    <w:abstractNumId w:val="12"/>
   </w:num>
 </w:numbering>
 </file>

</xml_diff>